<commit_message>
Docs: Agregar nueva planificación.
Agregar nueva planificación.
</commit_message>
<xml_diff>
--- a/Planificación Gestión de Restaurantes - PROGRAMMING TEAM PMA.docx
+++ b/Planificación Gestión de Restaurantes - PROGRAMMING TEAM PMA.docx
@@ -1,6 +1,6 @@
 
 <file path=word/document.xml><?xml version="1.0" encoding="utf-8"?>
-<w:document xmlns:wpc="http://schemas.microsoft.com/office/word/2010/wordprocessingCanvas" xmlns:cx="http://schemas.microsoft.com/office/drawing/2014/chartex" xmlns:cx1="http://schemas.microsoft.com/office/drawing/2015/9/8/chartex" xmlns:cx2="http://schemas.microsoft.com/office/drawing/2015/10/21/chartex" xmlns:cx3="http://schemas.microsoft.com/office/drawing/2016/5/9/chartex" xmlns:cx4="http://schemas.microsoft.com/office/drawing/2016/5/10/chartex" xmlns:cx5="http://schemas.microsoft.com/office/drawing/2016/5/11/chartex" xmlns:cx6="http://schemas.microsoft.com/office/drawing/2016/5/12/chartex" xmlns:cx7="http://schemas.microsoft.com/office/drawing/2016/5/13/chartex" xmlns:cx8="http://schemas.microsoft.com/office/drawing/2016/5/14/chartex" xmlns:mc="http://schemas.openxmlformats.org/markup-compatibility/2006" xmlns:aink="http://schemas.microsoft.com/office/drawing/2016/ink" xmlns:am3d="http://schemas.microsoft.com/office/drawing/2017/model3d" xmlns:o="urn:schemas-microsoft-com:office:office" xmlns:oel="http://schemas.microsoft.com/office/2019/extlst" xmlns:r="http://schemas.openxmlformats.org/officeDocument/2006/relationships" xmlns:m="http://schemas.openxmlformats.org/officeDocument/2006/math" xmlns:v="urn:schemas-microsoft-com:vml" xmlns:wp14="http://schemas.microsoft.com/office/word/2010/wordprocessingDrawing" xmlns:wp="http://schemas.openxmlformats.org/drawingml/2006/wordprocessingDrawing" xmlns:w10="urn:schemas-microsoft-com:office:word" xmlns:w="http://schemas.openxmlformats.org/wordprocessingml/2006/main" xmlns:w14="http://schemas.microsoft.com/office/word/2010/wordml" xmlns:w15="http://schemas.microsoft.com/office/word/2012/wordml" xmlns:w16cex="http://schemas.microsoft.com/office/word/2018/wordml/cex" xmlns:w16cid="http://schemas.microsoft.com/office/word/2016/wordml/cid" xmlns:w16="http://schemas.microsoft.com/office/word/2018/wordml" xmlns:w16du="http://schemas.microsoft.com/office/word/2023/wordml/word16du" xmlns:w16sdtdh="http://schemas.microsoft.com/office/word/2020/wordml/sdtdatahash" xmlns:w16sdtfl="http://schemas.microsoft.com/office/word/2024/wordml/sdtformatlock" xmlns:w16se="http://schemas.microsoft.com/office/word/2015/wordml/symex" xmlns:wpg="http://schemas.microsoft.com/office/word/2010/wordprocessingGroup" xmlns:wpi="http://schemas.microsoft.com/office/word/2010/wordprocessingInk" xmlns:wne="http://schemas.microsoft.com/office/word/2006/wordml" xmlns:wps="http://schemas.microsoft.com/office/word/2010/wordprocessingShape" mc:Ignorable="w14 w15 w16se w16cid w16 w16cex w16sdtdh w16sdtfl w16du wp14">
+<w:document xmlns:wpc="http://schemas.microsoft.com/office/word/2010/wordprocessingCanvas" xmlns:cx="http://schemas.microsoft.com/office/drawing/2014/chartex" xmlns:cx1="http://schemas.microsoft.com/office/drawing/2015/9/8/chartex" xmlns:mc="http://schemas.openxmlformats.org/markup-compatibility/2006" xmlns:o="urn:schemas-microsoft-com:office:office" xmlns:r="http://schemas.openxmlformats.org/officeDocument/2006/relationships" xmlns:m="http://schemas.openxmlformats.org/officeDocument/2006/math" xmlns:v="urn:schemas-microsoft-com:vml" xmlns:wp14="http://schemas.microsoft.com/office/word/2010/wordprocessingDrawing" xmlns:wp="http://schemas.openxmlformats.org/drawingml/2006/wordprocessingDrawing" xmlns:w10="urn:schemas-microsoft-com:office:word" xmlns:w="http://schemas.openxmlformats.org/wordprocessingml/2006/main" xmlns:w14="http://schemas.microsoft.com/office/word/2010/wordml" xmlns:w15="http://schemas.microsoft.com/office/word/2012/wordml" xmlns:w16se="http://schemas.microsoft.com/office/word/2015/wordml/symex" xmlns:wpg="http://schemas.microsoft.com/office/word/2010/wordprocessingGroup" xmlns:wpi="http://schemas.microsoft.com/office/word/2010/wordprocessingInk" xmlns:wne="http://schemas.microsoft.com/office/word/2006/wordml" xmlns:wps="http://schemas.microsoft.com/office/word/2010/wordprocessingShape" mc:Ignorable="w14 w15 w16se wp14">
   <w:body>
     <w:p>
       <w:pPr>
@@ -15,6 +15,7 @@
         <w:rPr>
           <w:iCs/>
           <w:noProof/>
+          <w:lang w:val="en-US"/>
         </w:rPr>
         <w:drawing>
           <wp:anchor distT="0" distB="0" distL="114300" distR="114300" simplePos="0" relativeHeight="251658240" behindDoc="0" locked="0" layoutInCell="1" allowOverlap="0" wp14:anchorId="6F74A411" wp14:editId="0F5E0EA8">
@@ -63,7 +64,23 @@
           <w:b/>
           <w:iCs/>
         </w:rPr>
-        <w:t xml:space="preserve">Centro Educativo Técnico Laboral Kinal </w:t>
+        <w:t xml:space="preserve">Centro Educativo Técnico Laboral </w:t>
+      </w:r>
+      <w:proofErr w:type="spellStart"/>
+      <w:r>
+        <w:rPr>
+          <w:b/>
+          <w:iCs/>
+        </w:rPr>
+        <w:t>Kinal</w:t>
+      </w:r>
+      <w:proofErr w:type="spellEnd"/>
+      <w:r>
+        <w:rPr>
+          <w:b/>
+          <w:iCs/>
+        </w:rPr>
+        <w:t xml:space="preserve"> </w:t>
       </w:r>
       <w:r>
         <w:rPr>
@@ -109,7 +126,23 @@
           <w:b/>
           <w:iCs/>
         </w:rPr>
-        <w:t xml:space="preserve">Asesor:  José Braulio Echeverria </w:t>
+        <w:t xml:space="preserve">Asesor:  José Braulio </w:t>
+      </w:r>
+      <w:proofErr w:type="spellStart"/>
+      <w:r>
+        <w:rPr>
+          <w:b/>
+          <w:iCs/>
+        </w:rPr>
+        <w:t>Echeverria</w:t>
+      </w:r>
+      <w:proofErr w:type="spellEnd"/>
+      <w:r>
+        <w:rPr>
+          <w:b/>
+          <w:iCs/>
+        </w:rPr>
+        <w:t xml:space="preserve"> </w:t>
       </w:r>
       <w:r>
         <w:rPr>
@@ -346,7 +379,23 @@
           <w:b/>
           <w:i/>
         </w:rPr>
-        <w:t xml:space="preserve">Dany Ixbalanqué Lucas Vicente - 2024332 </w:t>
+        <w:t xml:space="preserve">Dany </w:t>
+      </w:r>
+      <w:proofErr w:type="spellStart"/>
+      <w:r>
+        <w:rPr>
+          <w:b/>
+          <w:i/>
+        </w:rPr>
+        <w:t>Ixbalanqué</w:t>
+      </w:r>
+      <w:proofErr w:type="spellEnd"/>
+      <w:r>
+        <w:rPr>
+          <w:b/>
+          <w:i/>
+        </w:rPr>
+        <w:t xml:space="preserve"> Lucas Vicente - 2024332 </w:t>
       </w:r>
       <w:r>
         <w:t xml:space="preserve"> </w:t>
@@ -380,7 +429,23 @@
           <w:b/>
           <w:i/>
         </w:rPr>
-        <w:t xml:space="preserve">Ricardo Alejandro Hernández Hernández - 2024310 </w:t>
+        <w:t xml:space="preserve">Ricardo Alejandro Hernández </w:t>
+      </w:r>
+      <w:proofErr w:type="spellStart"/>
+      <w:r>
+        <w:rPr>
+          <w:b/>
+          <w:i/>
+        </w:rPr>
+        <w:t>Hernández</w:t>
+      </w:r>
+      <w:proofErr w:type="spellEnd"/>
+      <w:r>
+        <w:rPr>
+          <w:b/>
+          <w:i/>
+        </w:rPr>
+        <w:t xml:space="preserve"> - 2024310 </w:t>
       </w:r>
       <w:r>
         <w:t xml:space="preserve"> </w:t>
@@ -392,12 +457,37 @@
         <w:ind w:left="10" w:right="-14"/>
         <w:jc w:val="right"/>
       </w:pPr>
+      <w:proofErr w:type="spellStart"/>
       <w:r>
         <w:rPr>
           <w:b/>
           <w:i/>
         </w:rPr>
-        <w:t xml:space="preserve">Moises Eduardo Morales Alvizures - 2024279 </w:t>
+        <w:t>Moises</w:t>
+      </w:r>
+      <w:proofErr w:type="spellEnd"/>
+      <w:r>
+        <w:rPr>
+          <w:b/>
+          <w:i/>
+        </w:rPr>
+        <w:t xml:space="preserve"> Eduardo Morales </w:t>
+      </w:r>
+      <w:proofErr w:type="spellStart"/>
+      <w:r>
+        <w:rPr>
+          <w:b/>
+          <w:i/>
+        </w:rPr>
+        <w:t>Alvizures</w:t>
+      </w:r>
+      <w:proofErr w:type="spellEnd"/>
+      <w:r>
+        <w:rPr>
+          <w:b/>
+          <w:i/>
+        </w:rPr>
+        <w:t xml:space="preserve"> - 2024279 </w:t>
       </w:r>
       <w:r>
         <w:t xml:space="preserve"> </w:t>
@@ -444,11 +534,33 @@
           <w:b/>
         </w:rPr>
       </w:pPr>
-      <w:r>
-        <w:rPr>
-          <w:b/>
-        </w:rPr>
-        <w:t xml:space="preserve">Jeferson Andre Cano </w:t>
+      <w:proofErr w:type="spellStart"/>
+      <w:r>
+        <w:rPr>
+          <w:b/>
+        </w:rPr>
+        <w:t>Jeferson</w:t>
+      </w:r>
+      <w:proofErr w:type="spellEnd"/>
+      <w:r>
+        <w:rPr>
+          <w:b/>
+        </w:rPr>
+        <w:t xml:space="preserve"> </w:t>
+      </w:r>
+      <w:proofErr w:type="spellStart"/>
+      <w:r>
+        <w:rPr>
+          <w:b/>
+        </w:rPr>
+        <w:t>Andre</w:t>
+      </w:r>
+      <w:proofErr w:type="spellEnd"/>
+      <w:r>
+        <w:rPr>
+          <w:b/>
+        </w:rPr>
+        <w:t xml:space="preserve"> Cano </w:t>
       </w:r>
       <w:r>
         <w:rPr>
@@ -619,7 +731,6 @@
         <w:pStyle w:val="Ttulo1"/>
       </w:pPr>
       <w:r>
-        <w:lastRenderedPageBreak/>
         <w:t xml:space="preserve">2. </w:t>
       </w:r>
       <w:r>
@@ -797,11 +908,18 @@
         <w:pStyle w:val="Ttulo1"/>
       </w:pPr>
       <w:r>
-        <w:lastRenderedPageBreak/>
         <w:t xml:space="preserve">3. </w:t>
       </w:r>
       <w:r>
-        <w:t>Metodología Scrum.</w:t>
+        <w:t xml:space="preserve">Metodología </w:t>
+      </w:r>
+      <w:proofErr w:type="spellStart"/>
+      <w:r>
+        <w:t>Scrum</w:t>
+      </w:r>
+      <w:proofErr w:type="spellEnd"/>
+      <w:r>
+        <w:t>.</w:t>
       </w:r>
     </w:p>
     <w:p/>
@@ -810,8 +928,13 @@
         <w:spacing w:line="360" w:lineRule="auto"/>
         <w:ind w:left="11" w:right="6" w:firstLine="720"/>
       </w:pPr>
-      <w:r>
-        <w:t xml:space="preserve">Scrum es un marco de trabajo ágil que fue diseñado para el desarrollo de proyecto complejos. Se basa en un enfoque repetitivo e incremental, donde el trabajo se divide en ciclos pequeños llamados Sprint. Este método permite a un equipo adaptarse a cambios en los requerimientos, y entregar funcionalidades de manera continua y mantener una buena comunicación para asegurar que el software final cumpla con las expectativas.  </w:t>
+      <w:proofErr w:type="spellStart"/>
+      <w:r>
+        <w:t>Scrum</w:t>
+      </w:r>
+      <w:proofErr w:type="spellEnd"/>
+      <w:r>
+        <w:t xml:space="preserve"> es un marco de trabajo ágil que fue diseñado para el desarrollo de proyecto complejos. Se basa en un enfoque repetitivo e incremental, donde el trabajo se divide en ciclos pequeños llamados Sprint. Este método permite a un equipo adaptarse a cambios en los requerimientos, y entregar funcionalidades de manera continua y mantener una buena comunicación para asegurar que el software final cumpla con las expectativas.  </w:t>
       </w:r>
     </w:p>
     <w:p>
@@ -842,11 +965,33 @@
         <w:spacing w:after="70" w:line="360" w:lineRule="auto"/>
         <w:ind w:left="744" w:right="3" w:hanging="360"/>
       </w:pPr>
-      <w:r>
-        <w:rPr>
-          <w:b/>
-        </w:rPr>
-        <w:t>Product Owner:</w:t>
+      <w:proofErr w:type="spellStart"/>
+      <w:r>
+        <w:rPr>
+          <w:b/>
+        </w:rPr>
+        <w:t>Product</w:t>
+      </w:r>
+      <w:proofErr w:type="spellEnd"/>
+      <w:r>
+        <w:rPr>
+          <w:b/>
+        </w:rPr>
+        <w:t xml:space="preserve"> </w:t>
+      </w:r>
+      <w:proofErr w:type="spellStart"/>
+      <w:r>
+        <w:rPr>
+          <w:b/>
+        </w:rPr>
+        <w:t>Owner</w:t>
+      </w:r>
+      <w:proofErr w:type="spellEnd"/>
+      <w:r>
+        <w:rPr>
+          <w:b/>
+        </w:rPr>
+        <w:t>:</w:t>
       </w:r>
       <w:r>
         <w:t xml:space="preserve"> </w:t>
@@ -886,11 +1031,19 @@
           <w:b/>
         </w:rPr>
       </w:pPr>
-      <w:r>
-        <w:rPr>
-          <w:b/>
-        </w:rPr>
-        <w:t xml:space="preserve">Scrum </w:t>
+      <w:proofErr w:type="spellStart"/>
+      <w:r>
+        <w:rPr>
+          <w:b/>
+        </w:rPr>
+        <w:t>Scrum</w:t>
+      </w:r>
+      <w:proofErr w:type="spellEnd"/>
+      <w:r>
+        <w:rPr>
+          <w:b/>
+        </w:rPr>
+        <w:t xml:space="preserve"> </w:t>
       </w:r>
       <w:r>
         <w:rPr>
@@ -904,11 +1057,33 @@
         </w:rPr>
         <w:t xml:space="preserve">: </w:t>
       </w:r>
-      <w:r>
-        <w:rPr>
-          <w:b/>
-        </w:rPr>
-        <w:t xml:space="preserve">Moises Eduardo Morales Alvizures  </w:t>
+      <w:proofErr w:type="spellStart"/>
+      <w:r>
+        <w:rPr>
+          <w:b/>
+        </w:rPr>
+        <w:t>Moises</w:t>
+      </w:r>
+      <w:proofErr w:type="spellEnd"/>
+      <w:r>
+        <w:rPr>
+          <w:b/>
+        </w:rPr>
+        <w:t xml:space="preserve"> Eduardo Morales </w:t>
+      </w:r>
+      <w:proofErr w:type="spellStart"/>
+      <w:r>
+        <w:rPr>
+          <w:b/>
+        </w:rPr>
+        <w:t>Alvizures</w:t>
+      </w:r>
+      <w:proofErr w:type="spellEnd"/>
+      <w:r>
+        <w:rPr>
+          <w:b/>
+        </w:rPr>
+        <w:t xml:space="preserve">  </w:t>
       </w:r>
     </w:p>
     <w:p>
@@ -917,7 +1092,15 @@
         <w:ind w:left="744" w:right="3"/>
       </w:pPr>
       <w:r>
-        <w:t xml:space="preserve">Facilita las reuniones de Scrum, elimina impedimentos que frenen al equipo y asegura que se respeten los tiempos y procesos del marco de trabajo.  </w:t>
+        <w:t xml:space="preserve">Facilita las reuniones de </w:t>
+      </w:r>
+      <w:proofErr w:type="spellStart"/>
+      <w:r>
+        <w:t>Scrum</w:t>
+      </w:r>
+      <w:proofErr w:type="spellEnd"/>
+      <w:r>
+        <w:t xml:space="preserve">, elimina impedimentos que frenen al equipo y asegura que se respeten los tiempos y procesos del marco de trabajo.  </w:t>
       </w:r>
     </w:p>
     <w:p>
@@ -939,11 +1122,33 @@
         <w:spacing w:after="229"/>
         <w:ind w:right="3" w:hanging="360"/>
       </w:pPr>
-      <w:r>
-        <w:rPr>
-          <w:b/>
-        </w:rPr>
-        <w:t>Development Team:</w:t>
+      <w:proofErr w:type="spellStart"/>
+      <w:r>
+        <w:rPr>
+          <w:b/>
+        </w:rPr>
+        <w:t>Development</w:t>
+      </w:r>
+      <w:proofErr w:type="spellEnd"/>
+      <w:r>
+        <w:rPr>
+          <w:b/>
+        </w:rPr>
+        <w:t xml:space="preserve"> </w:t>
+      </w:r>
+      <w:proofErr w:type="spellStart"/>
+      <w:r>
+        <w:rPr>
+          <w:b/>
+        </w:rPr>
+        <w:t>Team</w:t>
+      </w:r>
+      <w:proofErr w:type="spellEnd"/>
+      <w:r>
+        <w:rPr>
+          <w:b/>
+        </w:rPr>
+        <w:t>:</w:t>
       </w:r>
       <w:r>
         <w:t xml:space="preserve"> Equipo de desarrollo de cada funcionalidad.  </w:t>
@@ -959,7 +1164,15 @@
         <w:ind w:right="3" w:hanging="360"/>
       </w:pPr>
       <w:r>
-        <w:t xml:space="preserve">Dany Ixbalanqué Lucas Vicente  </w:t>
+        <w:t xml:space="preserve">Dany </w:t>
+      </w:r>
+      <w:proofErr w:type="spellStart"/>
+      <w:r>
+        <w:t>Ixbalanqué</w:t>
+      </w:r>
+      <w:proofErr w:type="spellEnd"/>
+      <w:r>
+        <w:t xml:space="preserve"> Lucas Vicente  </w:t>
       </w:r>
     </w:p>
     <w:p>
@@ -971,8 +1184,21 @@
         <w:spacing w:after="220"/>
         <w:ind w:right="3" w:hanging="360"/>
       </w:pPr>
-      <w:r>
-        <w:t xml:space="preserve">Moises Eduardo Morales Alvizures  </w:t>
+      <w:proofErr w:type="spellStart"/>
+      <w:r>
+        <w:t>Moises</w:t>
+      </w:r>
+      <w:proofErr w:type="spellEnd"/>
+      <w:r>
+        <w:t xml:space="preserve"> Eduardo Morales </w:t>
+      </w:r>
+      <w:proofErr w:type="spellStart"/>
+      <w:r>
+        <w:t>Alvizures</w:t>
+      </w:r>
+      <w:proofErr w:type="spellEnd"/>
+      <w:r>
+        <w:t xml:space="preserve">  </w:t>
       </w:r>
     </w:p>
     <w:p>
@@ -985,7 +1211,15 @@
         <w:ind w:right="3" w:hanging="360"/>
       </w:pPr>
       <w:r>
-        <w:t xml:space="preserve">Ricardo Alejandro Hernández Hernández  </w:t>
+        <w:t xml:space="preserve">Ricardo Alejandro Hernández </w:t>
+      </w:r>
+      <w:proofErr w:type="spellStart"/>
+      <w:r>
+        <w:t>Hernández</w:t>
+      </w:r>
+      <w:proofErr w:type="spellEnd"/>
+      <w:r>
+        <w:t xml:space="preserve">  </w:t>
       </w:r>
     </w:p>
     <w:p>
@@ -1024,8 +1258,13 @@
         <w:ind w:right="3" w:hanging="360"/>
       </w:pPr>
       <w:r>
-        <w:t>Otto Raúl Díaz Batre</w:t>
-      </w:r>
+        <w:t xml:space="preserve">Otto Raúl Díaz </w:t>
+      </w:r>
+      <w:proofErr w:type="spellStart"/>
+      <w:r>
+        <w:t>Batre</w:t>
+      </w:r>
+      <w:proofErr w:type="spellEnd"/>
     </w:p>
     <w:p>
       <w:pPr>
@@ -1036,8 +1275,21 @@
         <w:spacing w:after="242"/>
         <w:ind w:right="3" w:hanging="360"/>
       </w:pPr>
-      <w:r>
-        <w:t xml:space="preserve">Jeferson Andre Cano </w:t>
+      <w:proofErr w:type="spellStart"/>
+      <w:r>
+        <w:t>Jeferson</w:t>
+      </w:r>
+      <w:proofErr w:type="spellEnd"/>
+      <w:r>
+        <w:t xml:space="preserve"> </w:t>
+      </w:r>
+      <w:proofErr w:type="spellStart"/>
+      <w:r>
+        <w:t>Andre</w:t>
+      </w:r>
+      <w:proofErr w:type="spellEnd"/>
+      <w:r>
+        <w:t xml:space="preserve"> Cano </w:t>
       </w:r>
       <w:r>
         <w:t>López</w:t>
@@ -1065,7 +1317,6 @@
         <w:pStyle w:val="Ttulo2"/>
       </w:pPr>
       <w:r>
-        <w:lastRenderedPageBreak/>
         <w:t xml:space="preserve">3.2. </w:t>
       </w:r>
       <w:r>
@@ -1121,7 +1372,15 @@
         <w:ind w:left="11" w:right="6" w:firstLine="720"/>
       </w:pPr>
       <w:r>
-        <w:t xml:space="preserve">Justificación de Microservicios: Se ha decidido separar el sistema en servicios independientes por las siguientes razones de negocio y técnicas: </w:t>
+        <w:t xml:space="preserve">Justificación de </w:t>
+      </w:r>
+      <w:proofErr w:type="spellStart"/>
+      <w:r>
+        <w:t>Microservicios</w:t>
+      </w:r>
+      <w:proofErr w:type="spellEnd"/>
+      <w:r>
+        <w:t xml:space="preserve">: Se ha decidido separar el sistema en servicios independientes por las siguientes razones de negocio y técnicas: </w:t>
       </w:r>
     </w:p>
     <w:p>
@@ -1290,7 +1549,6 @@
         <w:pStyle w:val="Ttulo2"/>
       </w:pPr>
       <w:r>
-        <w:lastRenderedPageBreak/>
         <w:t xml:space="preserve">3.4 </w:t>
       </w:r>
       <w:r>
@@ -1458,8 +1716,21 @@
               <w:ind w:left="0" w:right="0" w:firstLine="0"/>
               <w:jc w:val="left"/>
             </w:pPr>
+            <w:proofErr w:type="spellStart"/>
             <w:r>
-              <w:t xml:space="preserve">Backend y APIs  </w:t>
+              <w:t>Backend</w:t>
+            </w:r>
+            <w:proofErr w:type="spellEnd"/>
+            <w:r>
+              <w:t xml:space="preserve"> y </w:t>
+            </w:r>
+            <w:proofErr w:type="spellStart"/>
+            <w:r>
+              <w:t>APIs</w:t>
+            </w:r>
+            <w:proofErr w:type="spellEnd"/>
+            <w:r>
+              <w:t xml:space="preserve">  </w:t>
             </w:r>
           </w:p>
         </w:tc>
@@ -1562,7 +1833,15 @@
               <w:jc w:val="left"/>
             </w:pPr>
             <w:r>
-              <w:t>Implementación de Registro, Login.</w:t>
+              <w:t xml:space="preserve">Implementación de Registro, </w:t>
+            </w:r>
+            <w:proofErr w:type="spellStart"/>
+            <w:r>
+              <w:t>Login</w:t>
+            </w:r>
+            <w:proofErr w:type="spellEnd"/>
+            <w:r>
+              <w:t>.</w:t>
             </w:r>
             <w:r>
               <w:rPr>
@@ -1780,8 +2059,21 @@
               <w:ind w:left="0" w:right="0" w:firstLine="0"/>
               <w:jc w:val="left"/>
             </w:pPr>
+            <w:proofErr w:type="spellStart"/>
             <w:r>
-              <w:t xml:space="preserve">Fronted (SPAs)  </w:t>
+              <w:t>Fronted</w:t>
+            </w:r>
+            <w:proofErr w:type="spellEnd"/>
+            <w:r>
+              <w:t xml:space="preserve"> (</w:t>
+            </w:r>
+            <w:proofErr w:type="spellStart"/>
+            <w:r>
+              <w:t>SPAs</w:t>
+            </w:r>
+            <w:proofErr w:type="spellEnd"/>
+            <w:r>
+              <w:t xml:space="preserve">)  </w:t>
             </w:r>
           </w:p>
         </w:tc>
@@ -1831,7 +2123,21 @@
               <w:rPr>
                 <w:b/>
               </w:rPr>
-              <w:t xml:space="preserve">Estructura con React: </w:t>
+              <w:t xml:space="preserve">Estructura con </w:t>
+            </w:r>
+            <w:proofErr w:type="spellStart"/>
+            <w:r>
+              <w:rPr>
+                <w:b/>
+              </w:rPr>
+              <w:t>React</w:t>
+            </w:r>
+            <w:proofErr w:type="spellEnd"/>
+            <w:r>
+              <w:rPr>
+                <w:b/>
+              </w:rPr>
+              <w:t xml:space="preserve">: </w:t>
             </w:r>
           </w:p>
           <w:p>
@@ -1947,7 +2253,21 @@
               <w:rPr>
                 <w:b/>
               </w:rPr>
-              <w:t>Esto será parte del fronted.</w:t>
+              <w:t xml:space="preserve">Esto será parte del </w:t>
+            </w:r>
+            <w:proofErr w:type="spellStart"/>
+            <w:r>
+              <w:rPr>
+                <w:b/>
+              </w:rPr>
+              <w:t>fronted</w:t>
+            </w:r>
+            <w:proofErr w:type="spellEnd"/>
+            <w:r>
+              <w:rPr>
+                <w:b/>
+              </w:rPr>
+              <w:t>.</w:t>
             </w:r>
             <w:r>
               <w:t xml:space="preserve">  </w:t>
@@ -2066,7 +2386,21 @@
               <w:rPr>
                 <w:b/>
               </w:rPr>
-              <w:t xml:space="preserve">Esto será parte del fronted. </w:t>
+              <w:t xml:space="preserve">Esto será parte del </w:t>
+            </w:r>
+            <w:proofErr w:type="spellStart"/>
+            <w:r>
+              <w:rPr>
+                <w:b/>
+              </w:rPr>
+              <w:t>fronted</w:t>
+            </w:r>
+            <w:proofErr w:type="spellEnd"/>
+            <w:r>
+              <w:rPr>
+                <w:b/>
+              </w:rPr>
+              <w:t xml:space="preserve">. </w:t>
             </w:r>
             <w:r>
               <w:t xml:space="preserve"> </w:t>
@@ -2200,7 +2534,35 @@
               <w:rPr>
                 <w:b/>
               </w:rPr>
-              <w:t xml:space="preserve">Diseño responsivo con Tailwind para tablets/móviles. </w:t>
+              <w:t xml:space="preserve">Diseño responsivo con </w:t>
+            </w:r>
+            <w:proofErr w:type="spellStart"/>
+            <w:r>
+              <w:rPr>
+                <w:b/>
+              </w:rPr>
+              <w:t>Tailwind</w:t>
+            </w:r>
+            <w:proofErr w:type="spellEnd"/>
+            <w:r>
+              <w:rPr>
+                <w:b/>
+              </w:rPr>
+              <w:t xml:space="preserve"> para </w:t>
+            </w:r>
+            <w:proofErr w:type="spellStart"/>
+            <w:r>
+              <w:rPr>
+                <w:b/>
+              </w:rPr>
+              <w:t>tablets</w:t>
+            </w:r>
+            <w:proofErr w:type="spellEnd"/>
+            <w:r>
+              <w:rPr>
+                <w:b/>
+              </w:rPr>
+              <w:t xml:space="preserve">/móviles. </w:t>
             </w:r>
             <w:r>
               <w:t xml:space="preserve"> </w:t>
@@ -2223,7 +2585,21 @@
               <w:rPr>
                 <w:b/>
               </w:rPr>
-              <w:t xml:space="preserve">Esto será parte del fronted. </w:t>
+              <w:t xml:space="preserve">Esto será parte del </w:t>
+            </w:r>
+            <w:proofErr w:type="spellStart"/>
+            <w:r>
+              <w:rPr>
+                <w:b/>
+              </w:rPr>
+              <w:t>fronted</w:t>
+            </w:r>
+            <w:proofErr w:type="spellEnd"/>
+            <w:r>
+              <w:rPr>
+                <w:b/>
+              </w:rPr>
+              <w:t xml:space="preserve">. </w:t>
             </w:r>
             <w:r>
               <w:t xml:space="preserve"> </w:t>
@@ -2346,7 +2722,35 @@
               <w:rPr>
                 <w:b/>
               </w:rPr>
-              <w:t xml:space="preserve">Integración de React Native para la App de meseros. </w:t>
+              <w:t xml:space="preserve">Integración de </w:t>
+            </w:r>
+            <w:proofErr w:type="spellStart"/>
+            <w:r>
+              <w:rPr>
+                <w:b/>
+              </w:rPr>
+              <w:t>React</w:t>
+            </w:r>
+            <w:proofErr w:type="spellEnd"/>
+            <w:r>
+              <w:rPr>
+                <w:b/>
+              </w:rPr>
+              <w:t xml:space="preserve"> </w:t>
+            </w:r>
+            <w:proofErr w:type="spellStart"/>
+            <w:r>
+              <w:rPr>
+                <w:b/>
+              </w:rPr>
+              <w:t>Native</w:t>
+            </w:r>
+            <w:proofErr w:type="spellEnd"/>
+            <w:r>
+              <w:rPr>
+                <w:b/>
+              </w:rPr>
+              <w:t xml:space="preserve"> para la App de meseros. </w:t>
             </w:r>
             <w:r>
               <w:t xml:space="preserve"> </w:t>
@@ -2498,7 +2902,35 @@
               <w:rPr>
                 <w:b/>
               </w:rPr>
-              <w:t xml:space="preserve">Orquestación con Docker Compose. </w:t>
+              <w:t xml:space="preserve">Orquestación con </w:t>
+            </w:r>
+            <w:proofErr w:type="spellStart"/>
+            <w:r>
+              <w:rPr>
+                <w:b/>
+              </w:rPr>
+              <w:t>Docker</w:t>
+            </w:r>
+            <w:proofErr w:type="spellEnd"/>
+            <w:r>
+              <w:rPr>
+                <w:b/>
+              </w:rPr>
+              <w:t xml:space="preserve"> </w:t>
+            </w:r>
+            <w:proofErr w:type="spellStart"/>
+            <w:r>
+              <w:rPr>
+                <w:b/>
+              </w:rPr>
+              <w:t>Compose</w:t>
+            </w:r>
+            <w:proofErr w:type="spellEnd"/>
+            <w:r>
+              <w:rPr>
+                <w:b/>
+              </w:rPr>
+              <w:t xml:space="preserve">. </w:t>
             </w:r>
             <w:r>
               <w:t xml:space="preserve"> </w:t>
@@ -2530,7 +2962,35 @@
               <w:rPr>
                 <w:b/>
               </w:rPr>
-              <w:t xml:space="preserve">(Vercel/Atlas/Azure). </w:t>
+              <w:t>(</w:t>
+            </w:r>
+            <w:proofErr w:type="spellStart"/>
+            <w:r>
+              <w:rPr>
+                <w:b/>
+              </w:rPr>
+              <w:t>Vercel</w:t>
+            </w:r>
+            <w:proofErr w:type="spellEnd"/>
+            <w:r>
+              <w:rPr>
+                <w:b/>
+              </w:rPr>
+              <w:t>/Atlas/</w:t>
+            </w:r>
+            <w:proofErr w:type="spellStart"/>
+            <w:r>
+              <w:rPr>
+                <w:b/>
+              </w:rPr>
+              <w:t>Azure</w:t>
+            </w:r>
+            <w:proofErr w:type="spellEnd"/>
+            <w:r>
+              <w:rPr>
+                <w:b/>
+              </w:rPr>
+              <w:t xml:space="preserve">). </w:t>
             </w:r>
             <w:r>
               <w:t xml:space="preserve"> </w:t>
@@ -2603,7 +3063,31 @@
         <w:ind w:left="11" w:right="1026" w:firstLine="720"/>
       </w:pPr>
       <w:r>
-        <w:t xml:space="preserve">La herramienta que se utilizara para coordinar el trabajo es Notion, github para el control de las versiones del código fuente, y discord para la comunicación diaria y resolución de dudas técnicas. </w:t>
+        <w:t xml:space="preserve">La herramienta que se utilizara para coordinar el trabajo es </w:t>
+      </w:r>
+      <w:proofErr w:type="spellStart"/>
+      <w:r>
+        <w:t>Notion</w:t>
+      </w:r>
+      <w:proofErr w:type="spellEnd"/>
+      <w:r>
+        <w:t xml:space="preserve">, </w:t>
+      </w:r>
+      <w:proofErr w:type="spellStart"/>
+      <w:r>
+        <w:t>github</w:t>
+      </w:r>
+      <w:proofErr w:type="spellEnd"/>
+      <w:r>
+        <w:t xml:space="preserve"> para el control de las versiones del código fuente, y </w:t>
+      </w:r>
+      <w:proofErr w:type="spellStart"/>
+      <w:r>
+        <w:t>discord</w:t>
+      </w:r>
+      <w:proofErr w:type="spellEnd"/>
+      <w:r>
+        <w:t xml:space="preserve"> para la comunicación diaria y resolución de dudas técnicas. </w:t>
       </w:r>
       <w:r>
         <w:rPr>
@@ -2669,7 +3153,6 @@
         <w:jc w:val="left"/>
       </w:pPr>
       <w:r>
-        <w:lastRenderedPageBreak/>
         <w:t xml:space="preserve"> </w:t>
       </w:r>
     </w:p>
@@ -2680,8 +3163,13 @@
       <w:r>
         <w:t xml:space="preserve">4. </w:t>
       </w:r>
-      <w:r>
-        <w:t xml:space="preserve">Burn Down Chart (Proyección Inicial). </w:t>
+      <w:proofErr w:type="spellStart"/>
+      <w:r>
+        <w:t>Burn</w:t>
+      </w:r>
+      <w:proofErr w:type="spellEnd"/>
+      <w:r>
+        <w:t xml:space="preserve"> Down Chart (Proyección Inicial). </w:t>
       </w:r>
     </w:p>
     <w:p/>
@@ -2690,13 +3178,17 @@
         <w:spacing w:after="107" w:line="263" w:lineRule="auto"/>
         <w:ind w:right="842"/>
         <w:jc w:val="left"/>
+        <w:rPr>
+          <w:lang w:val="en-US"/>
+        </w:rPr>
       </w:pPr>
       <w:r>
         <w:rPr>
           <w:noProof/>
+          <w:lang w:val="en-US"/>
         </w:rPr>
         <w:drawing>
-          <wp:inline distT="0" distB="0" distL="0" distR="0" wp14:anchorId="4B3F6FD8" wp14:editId="553C4F0E">
+          <wp:inline distT="0" distB="0" distL="0" distR="0" wp14:anchorId="4B3F6FD8" wp14:editId="6C2CF597">
             <wp:extent cx="5323840" cy="3848100"/>
             <wp:effectExtent l="0" t="0" r="10160" b="0"/>
             <wp:docPr id="1" name="Gráfico 1"/>
@@ -2723,7 +3215,15 @@
         <w:ind w:left="11" w:right="692" w:firstLine="720"/>
       </w:pPr>
       <w:r>
-        <w:t xml:space="preserve">Para medir el avance real del proyecto utilizaremos el Burn Down Chart basado en puntos de historia:  </w:t>
+        <w:t xml:space="preserve">Para medir el avance real del proyecto utilizaremos el </w:t>
+      </w:r>
+      <w:proofErr w:type="spellStart"/>
+      <w:r>
+        <w:t>Burn</w:t>
+      </w:r>
+      <w:proofErr w:type="spellEnd"/>
+      <w:r>
+        <w:t xml:space="preserve"> Down Chart basado en puntos de historia:  </w:t>
       </w:r>
     </w:p>
     <w:p>
@@ -2869,7 +3369,6 @@
         <w:ind w:left="0"/>
       </w:pPr>
       <w:r>
-        <w:lastRenderedPageBreak/>
         <w:t>5</w:t>
       </w:r>
       <w:r>
@@ -2918,7 +3417,35 @@
         <w:rPr>
           <w:b/>
         </w:rPr>
-        <w:t xml:space="preserve"> (Auth Service)</w:t>
+        <w:t xml:space="preserve"> (</w:t>
+      </w:r>
+      <w:proofErr w:type="spellStart"/>
+      <w:r>
+        <w:rPr>
+          <w:b/>
+        </w:rPr>
+        <w:t>Auth</w:t>
+      </w:r>
+      <w:proofErr w:type="spellEnd"/>
+      <w:r>
+        <w:rPr>
+          <w:b/>
+        </w:rPr>
+        <w:t xml:space="preserve"> </w:t>
+      </w:r>
+      <w:proofErr w:type="spellStart"/>
+      <w:r>
+        <w:rPr>
+          <w:b/>
+        </w:rPr>
+        <w:t>Service</w:t>
+      </w:r>
+      <w:proofErr w:type="spellEnd"/>
+      <w:r>
+        <w:rPr>
+          <w:b/>
+        </w:rPr>
+        <w:t>)</w:t>
       </w:r>
     </w:p>
     <w:p>
@@ -2934,7 +3461,15 @@
         <w:t>Funcionalidad</w:t>
       </w:r>
       <w:r>
-        <w:t xml:space="preserve">: Gestiona el registro de usuarios, inicio de sesión y el Control de Acceso Basado en Roles (RBAC). Emite y valida tokens JWT para asegurar que cada empleado solo acceda a lo que le corresponde.  </w:t>
+        <w:t xml:space="preserve">: Gestiona el registro de usuarios, inicio de sesión y el Control de Acceso Basado en Roles (RBAC). Emite y valida </w:t>
+      </w:r>
+      <w:proofErr w:type="spellStart"/>
+      <w:r>
+        <w:t>tokens</w:t>
+      </w:r>
+      <w:proofErr w:type="spellEnd"/>
+      <w:r>
+        <w:t xml:space="preserve"> JWT para asegurar que cada empleado solo acceda a lo que le corresponde.  </w:t>
       </w:r>
     </w:p>
     <w:p>
@@ -2973,8 +3508,16 @@
         <w:rPr>
           <w:b/>
         </w:rPr>
-        <w:t>Restaurant Service</w:t>
-      </w:r>
+        <w:t xml:space="preserve">Restaurant </w:t>
+      </w:r>
+      <w:proofErr w:type="spellStart"/>
+      <w:r>
+        <w:rPr>
+          <w:b/>
+        </w:rPr>
+        <w:t>Service</w:t>
+      </w:r>
+      <w:proofErr w:type="spellEnd"/>
       <w:r>
         <w:rPr>
           <w:b/>
@@ -3078,7 +3621,35 @@
         <w:rPr>
           <w:b/>
         </w:rPr>
-        <w:t>(Reservation Service)</w:t>
+        <w:t>(</w:t>
+      </w:r>
+      <w:proofErr w:type="spellStart"/>
+      <w:r>
+        <w:rPr>
+          <w:b/>
+        </w:rPr>
+        <w:t>Reservation</w:t>
+      </w:r>
+      <w:proofErr w:type="spellEnd"/>
+      <w:r>
+        <w:rPr>
+          <w:b/>
+        </w:rPr>
+        <w:t xml:space="preserve"> </w:t>
+      </w:r>
+      <w:proofErr w:type="spellStart"/>
+      <w:r>
+        <w:rPr>
+          <w:b/>
+        </w:rPr>
+        <w:t>Service</w:t>
+      </w:r>
+      <w:proofErr w:type="spellEnd"/>
+      <w:r>
+        <w:rPr>
+          <w:b/>
+        </w:rPr>
+        <w:t>)</w:t>
       </w:r>
     </w:p>
     <w:p>
@@ -3116,7 +3687,39 @@
           <w:b/>
           <w:bCs/>
         </w:rPr>
-        <w:t>Servicio de Eventos. (Event Service)</w:t>
+        <w:t>Servicio de Eventos. (</w:t>
+      </w:r>
+      <w:proofErr w:type="spellStart"/>
+      <w:r>
+        <w:rPr>
+          <w:b/>
+          <w:bCs/>
+        </w:rPr>
+        <w:t>Event</w:t>
+      </w:r>
+      <w:proofErr w:type="spellEnd"/>
+      <w:r>
+        <w:rPr>
+          <w:b/>
+          <w:bCs/>
+        </w:rPr>
+        <w:t xml:space="preserve"> </w:t>
+      </w:r>
+      <w:proofErr w:type="spellStart"/>
+      <w:r>
+        <w:rPr>
+          <w:b/>
+          <w:bCs/>
+        </w:rPr>
+        <w:t>Service</w:t>
+      </w:r>
+      <w:proofErr w:type="spellEnd"/>
+      <w:r>
+        <w:rPr>
+          <w:b/>
+          <w:bCs/>
+        </w:rPr>
+        <w:t>)</w:t>
       </w:r>
     </w:p>
     <w:p>
@@ -3182,7 +3785,35 @@
         <w:rPr>
           <w:b/>
         </w:rPr>
-        <w:t>(Report Service)</w:t>
+        <w:t>(</w:t>
+      </w:r>
+      <w:proofErr w:type="spellStart"/>
+      <w:r>
+        <w:rPr>
+          <w:b/>
+        </w:rPr>
+        <w:t>Report</w:t>
+      </w:r>
+      <w:proofErr w:type="spellEnd"/>
+      <w:r>
+        <w:rPr>
+          <w:b/>
+        </w:rPr>
+        <w:t xml:space="preserve"> </w:t>
+      </w:r>
+      <w:proofErr w:type="spellStart"/>
+      <w:r>
+        <w:rPr>
+          <w:b/>
+        </w:rPr>
+        <w:t>Service</w:t>
+      </w:r>
+      <w:proofErr w:type="spellEnd"/>
+      <w:r>
+        <w:rPr>
+          <w:b/>
+        </w:rPr>
+        <w:t>)</w:t>
       </w:r>
     </w:p>
     <w:p>
@@ -3232,16 +3863,16 @@
       <w:r>
         <w:rPr>
           <w:noProof/>
-        </w:rPr>
-        <w:lastRenderedPageBreak/>
+          <w:lang w:val="en-US"/>
+        </w:rPr>
         <w:drawing>
-          <wp:anchor distT="0" distB="0" distL="114300" distR="114300" simplePos="0" relativeHeight="251659264" behindDoc="0" locked="0" layoutInCell="1" allowOverlap="1" wp14:anchorId="37B6B7A4" wp14:editId="4985902B">
+          <wp:anchor distT="0" distB="0" distL="114300" distR="114300" simplePos="0" relativeHeight="251659264" behindDoc="0" locked="0" layoutInCell="1" allowOverlap="1" wp14:anchorId="37B6B7A4" wp14:editId="2AF36094">
             <wp:simplePos x="0" y="0"/>
             <wp:positionH relativeFrom="page">
               <wp:align>center</wp:align>
             </wp:positionH>
             <wp:positionV relativeFrom="paragraph">
-              <wp:posOffset>459740</wp:posOffset>
+              <wp:posOffset>411121</wp:posOffset>
             </wp:positionV>
             <wp:extent cx="6151245" cy="4643120"/>
             <wp:effectExtent l="0" t="0" r="1905" b="5080"/>
@@ -3399,7 +4030,6 @@
         <w:pStyle w:val="Ttulo1"/>
       </w:pPr>
       <w:r>
-        <w:lastRenderedPageBreak/>
         <w:t xml:space="preserve">Reparto de Tareas. </w:t>
       </w:r>
     </w:p>
@@ -3415,7 +4045,39 @@
           <w:b/>
           <w:sz w:val="28"/>
         </w:rPr>
-        <w:t xml:space="preserve">9.1. Primer bimestre (Backend y APIs):  </w:t>
+        <w:t>9.1. Primer bimestre (</w:t>
+      </w:r>
+      <w:proofErr w:type="spellStart"/>
+      <w:r>
+        <w:rPr>
+          <w:b/>
+          <w:sz w:val="28"/>
+        </w:rPr>
+        <w:t>Backend</w:t>
+      </w:r>
+      <w:proofErr w:type="spellEnd"/>
+      <w:r>
+        <w:rPr>
+          <w:b/>
+          <w:sz w:val="28"/>
+        </w:rPr>
+        <w:t xml:space="preserve"> y </w:t>
+      </w:r>
+      <w:proofErr w:type="spellStart"/>
+      <w:r>
+        <w:rPr>
+          <w:b/>
+          <w:sz w:val="28"/>
+        </w:rPr>
+        <w:t>APIs</w:t>
+      </w:r>
+      <w:proofErr w:type="spellEnd"/>
+      <w:r>
+        <w:rPr>
+          <w:b/>
+          <w:sz w:val="28"/>
+        </w:rPr>
+        <w:t xml:space="preserve">):  </w:t>
       </w:r>
       <w:r>
         <w:t xml:space="preserve"> </w:t>
@@ -3433,7 +4095,15 @@
         <w:t xml:space="preserve">Dany Lucas:  </w:t>
       </w:r>
       <w:r>
-        <w:t xml:space="preserve">Diseño del esquema de Base de Datos y Endpoints de Registro. </w:t>
+        <w:t xml:space="preserve">Diseño del esquema de Base de Datos y </w:t>
+      </w:r>
+      <w:proofErr w:type="spellStart"/>
+      <w:r>
+        <w:t>Endpoints</w:t>
+      </w:r>
+      <w:proofErr w:type="spellEnd"/>
+      <w:r>
+        <w:t xml:space="preserve"> de Registro. </w:t>
       </w:r>
     </w:p>
     <w:p>
@@ -3462,18 +4132,31 @@
         <w:spacing w:after="350"/>
         <w:ind w:right="3"/>
       </w:pPr>
-      <w:r>
-        <w:rPr>
-          <w:b/>
-        </w:rPr>
-        <w:t xml:space="preserve">Moises Morales: </w:t>
+      <w:proofErr w:type="spellStart"/>
+      <w:r>
+        <w:rPr>
+          <w:b/>
+        </w:rPr>
+        <w:t>Moises</w:t>
+      </w:r>
+      <w:proofErr w:type="spellEnd"/>
+      <w:r>
+        <w:rPr>
+          <w:b/>
+        </w:rPr>
+        <w:t xml:space="preserve"> Morales: </w:t>
       </w:r>
       <w:r>
         <w:t>Desarrollo del middleware</w:t>
       </w:r>
       <w:r>
-        <w:t>s y validaciones genrales</w:t>
-      </w:r>
+        <w:t xml:space="preserve">s y validaciones </w:t>
+      </w:r>
+      <w:proofErr w:type="spellStart"/>
+      <w:r>
+        <w:t>genrales</w:t>
+      </w:r>
+      <w:proofErr w:type="spellEnd"/>
       <w:r>
         <w:t xml:space="preserve">. </w:t>
       </w:r>
@@ -3490,7 +4173,15 @@
         <w:t xml:space="preserve">Ricardo Hernández: </w:t>
       </w:r>
       <w:r>
-        <w:t xml:space="preserve">Configuración de la persistencia de datos en PostgresDB. </w:t>
+        <w:t xml:space="preserve">Configuración de la persistencia de datos en </w:t>
+      </w:r>
+      <w:proofErr w:type="spellStart"/>
+      <w:r>
+        <w:t>PostgresDB</w:t>
+      </w:r>
+      <w:proofErr w:type="spellEnd"/>
+      <w:r>
+        <w:t xml:space="preserve">. </w:t>
       </w:r>
     </w:p>
     <w:p>
@@ -3514,7 +4205,23 @@
           <w:b/>
           <w:sz w:val="28"/>
         </w:rPr>
-        <w:t xml:space="preserve">9.2. Segundo Bimestre (Fronted): </w:t>
+        <w:t>9.2. Segundo Bimestre (</w:t>
+      </w:r>
+      <w:proofErr w:type="spellStart"/>
+      <w:r>
+        <w:rPr>
+          <w:b/>
+          <w:sz w:val="28"/>
+        </w:rPr>
+        <w:t>Fronted</w:t>
+      </w:r>
+      <w:proofErr w:type="spellEnd"/>
+      <w:r>
+        <w:rPr>
+          <w:b/>
+          <w:sz w:val="28"/>
+        </w:rPr>
+        <w:t xml:space="preserve">): </w:t>
       </w:r>
       <w:r>
         <w:t xml:space="preserve">  </w:t>
@@ -3545,11 +4252,19 @@
           <w:rFonts w:ascii="Arial" w:hAnsi="Arial" w:cs="Arial"/>
         </w:rPr>
       </w:pPr>
-      <w:r>
-        <w:rPr>
-          <w:rFonts w:ascii="Arial" w:hAnsi="Arial" w:cs="Arial"/>
-        </w:rPr>
-        <w:t xml:space="preserve">Pagina principal </w:t>
+      <w:proofErr w:type="spellStart"/>
+      <w:r>
+        <w:rPr>
+          <w:rFonts w:ascii="Arial" w:hAnsi="Arial" w:cs="Arial"/>
+        </w:rPr>
+        <w:t>Pagina</w:t>
+      </w:r>
+      <w:proofErr w:type="spellEnd"/>
+      <w:r>
+        <w:rPr>
+          <w:rFonts w:ascii="Arial" w:hAnsi="Arial" w:cs="Arial"/>
+        </w:rPr>
+        <w:t xml:space="preserve"> principal </w:t>
       </w:r>
       <w:r>
         <w:rPr>
@@ -3576,11 +4291,19 @@
         </w:rPr>
         <w:t xml:space="preserve">Componente de </w:t>
       </w:r>
-      <w:r>
-        <w:rPr>
-          <w:rFonts w:ascii="Arial" w:hAnsi="Arial" w:cs="Arial"/>
-        </w:rPr>
-        <w:t>React para gestión</w:t>
+      <w:proofErr w:type="spellStart"/>
+      <w:r>
+        <w:rPr>
+          <w:rFonts w:ascii="Arial" w:hAnsi="Arial" w:cs="Arial"/>
+        </w:rPr>
+        <w:t>React</w:t>
+      </w:r>
+      <w:proofErr w:type="spellEnd"/>
+      <w:r>
+        <w:rPr>
+          <w:rFonts w:ascii="Arial" w:hAnsi="Arial" w:cs="Arial"/>
+        </w:rPr>
+        <w:t xml:space="preserve"> para gestión</w:t>
       </w:r>
       <w:r>
         <w:rPr>
@@ -3623,7 +4346,21 @@
         <w:rPr>
           <w:rFonts w:ascii="Arial" w:hAnsi="Arial" w:cs="Arial"/>
         </w:rPr>
-        <w:t xml:space="preserve">Store y Hooks </w:t>
+        <w:t xml:space="preserve">Store y </w:t>
+      </w:r>
+      <w:proofErr w:type="spellStart"/>
+      <w:r>
+        <w:rPr>
+          <w:rFonts w:ascii="Arial" w:hAnsi="Arial" w:cs="Arial"/>
+        </w:rPr>
+        <w:t>Hooks</w:t>
+      </w:r>
+      <w:proofErr w:type="spellEnd"/>
+      <w:r>
+        <w:rPr>
+          <w:rFonts w:ascii="Arial" w:hAnsi="Arial" w:cs="Arial"/>
+        </w:rPr>
+        <w:t xml:space="preserve"> </w:t>
       </w:r>
       <w:r>
         <w:rPr>
@@ -3694,11 +4431,19 @@
         </w:rPr>
         <w:t xml:space="preserve">Componente de </w:t>
       </w:r>
-      <w:r>
-        <w:rPr>
-          <w:rFonts w:ascii="Arial" w:hAnsi="Arial" w:cs="Arial"/>
-        </w:rPr>
-        <w:t>React para gestión</w:t>
+      <w:proofErr w:type="spellStart"/>
+      <w:r>
+        <w:rPr>
+          <w:rFonts w:ascii="Arial" w:hAnsi="Arial" w:cs="Arial"/>
+        </w:rPr>
+        <w:t>React</w:t>
+      </w:r>
+      <w:proofErr w:type="spellEnd"/>
+      <w:r>
+        <w:rPr>
+          <w:rFonts w:ascii="Arial" w:hAnsi="Arial" w:cs="Arial"/>
+        </w:rPr>
+        <w:t xml:space="preserve"> para gestión</w:t>
       </w:r>
       <w:r>
         <w:rPr>
@@ -3741,7 +4486,21 @@
         <w:rPr>
           <w:rFonts w:ascii="Arial" w:hAnsi="Arial" w:cs="Arial"/>
         </w:rPr>
-        <w:t xml:space="preserve">Store y Hooks </w:t>
+        <w:t xml:space="preserve">Store y </w:t>
+      </w:r>
+      <w:proofErr w:type="spellStart"/>
+      <w:r>
+        <w:rPr>
+          <w:rFonts w:ascii="Arial" w:hAnsi="Arial" w:cs="Arial"/>
+        </w:rPr>
+        <w:t>Hooks</w:t>
+      </w:r>
+      <w:proofErr w:type="spellEnd"/>
+      <w:r>
+        <w:rPr>
+          <w:rFonts w:ascii="Arial" w:hAnsi="Arial" w:cs="Arial"/>
+        </w:rPr>
+        <w:t xml:space="preserve"> </w:t>
       </w:r>
       <w:r>
         <w:rPr>
@@ -3768,11 +4527,19 @@
         <w:ind w:left="10" w:right="842"/>
         <w:jc w:val="left"/>
       </w:pPr>
-      <w:r>
-        <w:rPr>
-          <w:b/>
-        </w:rPr>
-        <w:t xml:space="preserve">Moises Morales: </w:t>
+      <w:proofErr w:type="spellStart"/>
+      <w:r>
+        <w:rPr>
+          <w:b/>
+        </w:rPr>
+        <w:t>Moises</w:t>
+      </w:r>
+      <w:proofErr w:type="spellEnd"/>
+      <w:r>
+        <w:rPr>
+          <w:b/>
+        </w:rPr>
+        <w:t xml:space="preserve"> Morales: </w:t>
       </w:r>
     </w:p>
     <w:p>
@@ -3791,7 +4558,21 @@
         <w:rPr>
           <w:rFonts w:ascii="Arial" w:hAnsi="Arial" w:cs="Arial"/>
         </w:rPr>
-        <w:t>Estructura inicial del proyecto React (Configuración y arquitectura de carpetas).</w:t>
+        <w:t xml:space="preserve">Estructura inicial del proyecto </w:t>
+      </w:r>
+      <w:proofErr w:type="spellStart"/>
+      <w:r>
+        <w:rPr>
+          <w:rFonts w:ascii="Arial" w:hAnsi="Arial" w:cs="Arial"/>
+        </w:rPr>
+        <w:t>React</w:t>
+      </w:r>
+      <w:proofErr w:type="spellEnd"/>
+      <w:r>
+        <w:rPr>
+          <w:rFonts w:ascii="Arial" w:hAnsi="Arial" w:cs="Arial"/>
+        </w:rPr>
+        <w:t xml:space="preserve"> (Configuración y arquitectura de carpetas).</w:t>
       </w:r>
     </w:p>
     <w:p>
@@ -3829,7 +4610,35 @@
         <w:rPr>
           <w:rFonts w:ascii="Arial" w:hAnsi="Arial" w:cs="Arial"/>
         </w:rPr>
-        <w:t>Conexión entre los endpoints del backend y las vistas del cliente.</w:t>
+        <w:t xml:space="preserve">Conexión entre los </w:t>
+      </w:r>
+      <w:proofErr w:type="spellStart"/>
+      <w:r>
+        <w:rPr>
+          <w:rFonts w:ascii="Arial" w:hAnsi="Arial" w:cs="Arial"/>
+        </w:rPr>
+        <w:t>endpoints</w:t>
+      </w:r>
+      <w:proofErr w:type="spellEnd"/>
+      <w:r>
+        <w:rPr>
+          <w:rFonts w:ascii="Arial" w:hAnsi="Arial" w:cs="Arial"/>
+        </w:rPr>
+        <w:t xml:space="preserve"> del </w:t>
+      </w:r>
+      <w:proofErr w:type="spellStart"/>
+      <w:r>
+        <w:rPr>
+          <w:rFonts w:ascii="Arial" w:hAnsi="Arial" w:cs="Arial"/>
+        </w:rPr>
+        <w:t>backend</w:t>
+      </w:r>
+      <w:proofErr w:type="spellEnd"/>
+      <w:r>
+        <w:rPr>
+          <w:rFonts w:ascii="Arial" w:hAnsi="Arial" w:cs="Arial"/>
+        </w:rPr>
+        <w:t xml:space="preserve"> y las vistas del cliente.</w:t>
       </w:r>
     </w:p>
     <w:p>
@@ -3925,11 +4734,19 @@
         </w:rPr>
         <w:t xml:space="preserve">Componente de </w:t>
       </w:r>
-      <w:r>
-        <w:rPr>
-          <w:rFonts w:ascii="Arial" w:hAnsi="Arial" w:cs="Arial"/>
-        </w:rPr>
-        <w:t>React para gestión</w:t>
+      <w:proofErr w:type="spellStart"/>
+      <w:r>
+        <w:rPr>
+          <w:rFonts w:ascii="Arial" w:hAnsi="Arial" w:cs="Arial"/>
+        </w:rPr>
+        <w:t>React</w:t>
+      </w:r>
+      <w:proofErr w:type="spellEnd"/>
+      <w:r>
+        <w:rPr>
+          <w:rFonts w:ascii="Arial" w:hAnsi="Arial" w:cs="Arial"/>
+        </w:rPr>
+        <w:t xml:space="preserve"> para gestión</w:t>
       </w:r>
       <w:r>
         <w:rPr>
@@ -3972,7 +4789,21 @@
         <w:rPr>
           <w:rFonts w:ascii="Arial" w:hAnsi="Arial" w:cs="Arial"/>
         </w:rPr>
-        <w:t xml:space="preserve">Store y Hooks </w:t>
+        <w:t xml:space="preserve">Store y </w:t>
+      </w:r>
+      <w:proofErr w:type="spellStart"/>
+      <w:r>
+        <w:rPr>
+          <w:rFonts w:ascii="Arial" w:hAnsi="Arial" w:cs="Arial"/>
+        </w:rPr>
+        <w:t>Hooks</w:t>
+      </w:r>
+      <w:proofErr w:type="spellEnd"/>
+      <w:r>
+        <w:rPr>
+          <w:rFonts w:ascii="Arial" w:hAnsi="Arial" w:cs="Arial"/>
+        </w:rPr>
+        <w:t xml:space="preserve"> </w:t>
       </w:r>
       <w:r>
         <w:rPr>
@@ -4020,7 +4851,6 @@
         <w:rPr>
           <w:b/>
         </w:rPr>
-        <w:lastRenderedPageBreak/>
         <w:t xml:space="preserve">Wilson Adrián: </w:t>
       </w:r>
     </w:p>
@@ -4061,11 +4891,19 @@
         </w:rPr>
         <w:t xml:space="preserve">Componente de </w:t>
       </w:r>
-      <w:r>
-        <w:rPr>
-          <w:rFonts w:ascii="Arial" w:hAnsi="Arial" w:cs="Arial"/>
-        </w:rPr>
-        <w:t>React para gestión</w:t>
+      <w:proofErr w:type="spellStart"/>
+      <w:r>
+        <w:rPr>
+          <w:rFonts w:ascii="Arial" w:hAnsi="Arial" w:cs="Arial"/>
+        </w:rPr>
+        <w:t>React</w:t>
+      </w:r>
+      <w:proofErr w:type="spellEnd"/>
+      <w:r>
+        <w:rPr>
+          <w:rFonts w:ascii="Arial" w:hAnsi="Arial" w:cs="Arial"/>
+        </w:rPr>
+        <w:t xml:space="preserve"> para gestión</w:t>
       </w:r>
       <w:r>
         <w:rPr>
@@ -4108,7 +4946,21 @@
         <w:rPr>
           <w:rFonts w:ascii="Arial" w:hAnsi="Arial" w:cs="Arial"/>
         </w:rPr>
-        <w:t xml:space="preserve">Store y Hooks </w:t>
+        <w:t xml:space="preserve">Store y </w:t>
+      </w:r>
+      <w:proofErr w:type="spellStart"/>
+      <w:r>
+        <w:rPr>
+          <w:rFonts w:ascii="Arial" w:hAnsi="Arial" w:cs="Arial"/>
+        </w:rPr>
+        <w:t>Hooks</w:t>
+      </w:r>
+      <w:proofErr w:type="spellEnd"/>
+      <w:r>
+        <w:rPr>
+          <w:rFonts w:ascii="Arial" w:hAnsi="Arial" w:cs="Arial"/>
+        </w:rPr>
+        <w:t xml:space="preserve"> </w:t>
       </w:r>
       <w:r>
         <w:rPr>
@@ -4179,11 +5031,19 @@
         </w:rPr>
         <w:t xml:space="preserve">Componente de </w:t>
       </w:r>
-      <w:r>
-        <w:rPr>
-          <w:rFonts w:ascii="Arial" w:hAnsi="Arial" w:cs="Arial"/>
-        </w:rPr>
-        <w:t>React para gestión</w:t>
+      <w:proofErr w:type="spellStart"/>
+      <w:r>
+        <w:rPr>
+          <w:rFonts w:ascii="Arial" w:hAnsi="Arial" w:cs="Arial"/>
+        </w:rPr>
+        <w:t>React</w:t>
+      </w:r>
+      <w:proofErr w:type="spellEnd"/>
+      <w:r>
+        <w:rPr>
+          <w:rFonts w:ascii="Arial" w:hAnsi="Arial" w:cs="Arial"/>
+        </w:rPr>
+        <w:t xml:space="preserve"> para gestión</w:t>
       </w:r>
       <w:r>
         <w:rPr>
@@ -4226,7 +5086,21 @@
         <w:rPr>
           <w:rFonts w:ascii="Arial" w:hAnsi="Arial" w:cs="Arial"/>
         </w:rPr>
-        <w:t xml:space="preserve">Store y Hooks </w:t>
+        <w:t xml:space="preserve">Store y </w:t>
+      </w:r>
+      <w:proofErr w:type="spellStart"/>
+      <w:r>
+        <w:rPr>
+          <w:rFonts w:ascii="Arial" w:hAnsi="Arial" w:cs="Arial"/>
+        </w:rPr>
+        <w:t>Hooks</w:t>
+      </w:r>
+      <w:proofErr w:type="spellEnd"/>
+      <w:r>
+        <w:rPr>
+          <w:rFonts w:ascii="Arial" w:hAnsi="Arial" w:cs="Arial"/>
+        </w:rPr>
+        <w:t xml:space="preserve"> </w:t>
       </w:r>
       <w:r>
         <w:rPr>
@@ -4309,11 +5183,19 @@
         </w:rPr>
         <w:t xml:space="preserve">Componente de </w:t>
       </w:r>
-      <w:r>
-        <w:rPr>
-          <w:rFonts w:ascii="Arial" w:hAnsi="Arial" w:cs="Arial"/>
-        </w:rPr>
-        <w:t>React para gestión</w:t>
+      <w:proofErr w:type="spellStart"/>
+      <w:r>
+        <w:rPr>
+          <w:rFonts w:ascii="Arial" w:hAnsi="Arial" w:cs="Arial"/>
+        </w:rPr>
+        <w:t>React</w:t>
+      </w:r>
+      <w:proofErr w:type="spellEnd"/>
+      <w:r>
+        <w:rPr>
+          <w:rFonts w:ascii="Arial" w:hAnsi="Arial" w:cs="Arial"/>
+        </w:rPr>
+        <w:t xml:space="preserve"> para gestión</w:t>
       </w:r>
       <w:r>
         <w:rPr>
@@ -4356,7 +5238,21 @@
         <w:rPr>
           <w:rFonts w:ascii="Arial" w:hAnsi="Arial" w:cs="Arial"/>
         </w:rPr>
-        <w:t xml:space="preserve">Store y Hooks </w:t>
+        <w:t xml:space="preserve">Store y </w:t>
+      </w:r>
+      <w:proofErr w:type="spellStart"/>
+      <w:r>
+        <w:rPr>
+          <w:rFonts w:ascii="Arial" w:hAnsi="Arial" w:cs="Arial"/>
+        </w:rPr>
+        <w:t>Hooks</w:t>
+      </w:r>
+      <w:proofErr w:type="spellEnd"/>
+      <w:r>
+        <w:rPr>
+          <w:rFonts w:ascii="Arial" w:hAnsi="Arial" w:cs="Arial"/>
+        </w:rPr>
+        <w:t xml:space="preserve"> </w:t>
       </w:r>
       <w:r>
         <w:rPr>
@@ -4416,7 +5312,7 @@
           <w:rFonts w:ascii="Arial" w:hAnsi="Arial" w:cs="Arial"/>
           <w:b/>
         </w:rPr>
-        <w:t>Dany Lucas</w:t>
+        <w:t>Diego Monterroso</w:t>
       </w:r>
       <w:r>
         <w:rPr>
@@ -4424,6 +5320,65 @@
           <w:b/>
         </w:rPr>
         <w:t xml:space="preserve">: </w:t>
+      </w:r>
+    </w:p>
+    <w:p>
+      <w:pPr>
+        <w:numPr>
+          <w:ilvl w:val="0"/>
+          <w:numId w:val="34"/>
+        </w:numPr>
+        <w:spacing w:after="302"/>
+        <w:ind w:right="640"/>
+        <w:rPr>
+          <w:b/>
+        </w:rPr>
+      </w:pPr>
+      <w:r>
+        <w:rPr>
+          <w:b/>
+          <w:bCs/>
+        </w:rPr>
+        <w:t xml:space="preserve">Módulos </w:t>
+      </w:r>
+      <w:proofErr w:type="spellStart"/>
+      <w:r>
+        <w:rPr>
+          <w:b/>
+          <w:bCs/>
+        </w:rPr>
+        <w:t>Auth</w:t>
+      </w:r>
+      <w:proofErr w:type="spellEnd"/>
+      <w:r>
+        <w:rPr>
+          <w:b/>
+          <w:bCs/>
+        </w:rPr>
+        <w:t>, Eventos y Menú:</w:t>
+      </w:r>
+      <w:r>
+        <w:t xml:space="preserve"> Desarrollo integral de la lógica funcional y los componentes de interfaz para el registro, gestión de eventos y catálogo de platillos.</w:t>
+      </w:r>
+    </w:p>
+    <w:p>
+      <w:pPr>
+        <w:spacing w:after="302"/>
+        <w:ind w:right="640"/>
+      </w:pPr>
+      <w:proofErr w:type="spellStart"/>
+      <w:r>
+        <w:rPr>
+          <w:b/>
+        </w:rPr>
+        <w:t>Moises</w:t>
+      </w:r>
+      <w:proofErr w:type="spellEnd"/>
+      <w:r>
+        <w:rPr>
+          <w:b/>
+        </w:rPr>
+        <w:t xml:space="preserve"> Morales: </w:t>
       </w:r>
     </w:p>
     <w:p>
@@ -4431,18 +5386,73 @@
         <w:pStyle w:val="NormalWeb"/>
         <w:numPr>
           <w:ilvl w:val="0"/>
-          <w:numId w:val="17"/>
+          <w:numId w:val="34"/>
         </w:numPr>
-        <w:spacing w:line="360" w:lineRule="auto"/>
-        <w:rPr>
-          <w:rFonts w:ascii="Arial" w:hAnsi="Arial" w:cs="Arial"/>
-        </w:rPr>
-      </w:pPr>
-      <w:r>
-        <w:rPr>
-          <w:rFonts w:ascii="Arial" w:hAnsi="Arial" w:cs="Arial"/>
-        </w:rPr>
-        <w:t>Lógica de hooks para Reportes Financieros y Estadísticas.</w:t>
+        <w:rPr>
+          <w:rFonts w:ascii="Arial" w:hAnsi="Arial" w:cs="Arial"/>
+          <w:bCs/>
+        </w:rPr>
+      </w:pPr>
+      <w:r>
+        <w:rPr>
+          <w:rFonts w:ascii="Arial" w:hAnsi="Arial" w:cs="Arial"/>
+          <w:b/>
+          <w:bCs/>
+        </w:rPr>
+        <w:t>Arquitectura, Restaurantes y Mesas:</w:t>
+      </w:r>
+      <w:r>
+        <w:rPr>
+          <w:rFonts w:ascii="Arial" w:hAnsi="Arial" w:cs="Arial"/>
+        </w:rPr>
+        <w:t xml:space="preserve"> </w:t>
+      </w:r>
+      <w:r>
+        <w:rPr>
+          <w:rFonts w:ascii="Arial" w:hAnsi="Arial" w:cs="Arial"/>
+          <w:bCs/>
+        </w:rPr>
+        <w:t>Inicialización y estructura base del proyecto</w:t>
+      </w:r>
+      <w:r>
+        <w:rPr>
+          <w:rFonts w:ascii="Arial" w:hAnsi="Arial" w:cs="Arial"/>
+        </w:rPr>
+        <w:t>, desarrollo de lógica y v</w:t>
+      </w:r>
+      <w:r>
+        <w:rPr>
+          <w:rFonts w:ascii="Arial" w:hAnsi="Arial" w:cs="Arial"/>
+        </w:rPr>
+        <w:t>istas para restaurantes y mesas,</w:t>
+      </w:r>
+      <w:r>
+        <w:rPr>
+          <w:rFonts w:ascii="Arial" w:hAnsi="Arial" w:cs="Arial"/>
+        </w:rPr>
+        <w:t xml:space="preserve"> responsable de la </w:t>
+      </w:r>
+      <w:r>
+        <w:rPr>
+          <w:rFonts w:ascii="Arial" w:hAnsi="Arial" w:cs="Arial"/>
+          <w:bCs/>
+        </w:rPr>
+        <w:t xml:space="preserve">detección y corrección de bugs </w:t>
+      </w:r>
+    </w:p>
+    <w:p>
+      <w:pPr>
+        <w:pStyle w:val="NormalWeb"/>
+        <w:rPr>
+          <w:rFonts w:ascii="Arial" w:hAnsi="Arial" w:cs="Arial"/>
+        </w:rPr>
+      </w:pPr>
+      <w:r>
+        <w:rPr>
+          <w:rFonts w:ascii="Arial" w:hAnsi="Arial" w:cs="Arial"/>
+          <w:b/>
+        </w:rPr>
+        <w:t xml:space="preserve">Ricardo Hernández: </w:t>
       </w:r>
     </w:p>
     <w:p>
@@ -4450,270 +5460,197 @@
         <w:pStyle w:val="NormalWeb"/>
         <w:numPr>
           <w:ilvl w:val="0"/>
-          <w:numId w:val="17"/>
+          <w:numId w:val="34"/>
         </w:numPr>
-        <w:spacing w:line="360" w:lineRule="auto"/>
-        <w:rPr>
-          <w:rFonts w:ascii="Arial" w:hAnsi="Arial" w:cs="Arial"/>
-        </w:rPr>
-      </w:pPr>
-      <w:r>
-        <w:rPr>
-          <w:rFonts w:ascii="Arial" w:hAnsi="Arial" w:cs="Arial"/>
-        </w:rPr>
-        <w:t>Componente de visualización de analíticas y KPIs para la gerencia (Platos más vendidos).</w:t>
-      </w:r>
-    </w:p>
-    <w:p>
-      <w:pPr>
-        <w:spacing w:after="302"/>
-        <w:ind w:right="640"/>
-      </w:pPr>
-      <w:r>
-        <w:rPr>
-          <w:b/>
-        </w:rPr>
-        <w:t xml:space="preserve">Moises Morales: </w:t>
-      </w:r>
-    </w:p>
-    <w:p>
-      <w:pPr>
-        <w:pStyle w:val="NormalWeb"/>
+        <w:rPr>
+          <w:rFonts w:ascii="Arial" w:hAnsi="Arial" w:cs="Arial"/>
+          <w:b/>
+        </w:rPr>
+      </w:pPr>
+      <w:r>
+        <w:rPr>
+          <w:rFonts w:ascii="Arial" w:hAnsi="Arial" w:cs="Arial"/>
+          <w:b/>
+          <w:bCs/>
+        </w:rPr>
+        <w:t>Módulos Pedidos, Reportes y Reservaciones:</w:t>
+      </w:r>
+      <w:r>
+        <w:rPr>
+          <w:rFonts w:ascii="Arial" w:hAnsi="Arial" w:cs="Arial"/>
+        </w:rPr>
+        <w:t xml:space="preserve"> Desarrollo integral de la lógica de negocio y las vistas para el flujo de comandas, analíticas financieras y gestión de reservaciones.</w:t>
+      </w:r>
+    </w:p>
+    <w:p>
+      <w:pPr>
+        <w:spacing w:after="256" w:line="263" w:lineRule="auto"/>
+        <w:ind w:left="10" w:right="842"/>
+        <w:jc w:val="left"/>
+        <w:rPr>
+          <w:b/>
+        </w:rPr>
+      </w:pPr>
+    </w:p>
+    <w:p>
+      <w:pPr>
+        <w:spacing w:after="256" w:line="263" w:lineRule="auto"/>
+        <w:ind w:left="10" w:right="842"/>
+        <w:jc w:val="left"/>
+        <w:rPr>
+          <w:b/>
+        </w:rPr>
+      </w:pPr>
+    </w:p>
+    <w:p>
+      <w:pPr>
+        <w:spacing w:after="256" w:line="263" w:lineRule="auto"/>
+        <w:ind w:left="10" w:right="842"/>
+        <w:jc w:val="left"/>
+        <w:rPr>
+          <w:b/>
+        </w:rPr>
+      </w:pPr>
+      <w:r>
+        <w:rPr>
+          <w:b/>
+        </w:rPr>
+        <w:t xml:space="preserve">Los </w:t>
+      </w:r>
+      <w:proofErr w:type="gramStart"/>
+      <w:r>
+        <w:rPr>
+          <w:b/>
+        </w:rPr>
+        <w:t>siguiente compañeros</w:t>
+      </w:r>
+      <w:proofErr w:type="gramEnd"/>
+      <w:r>
+        <w:rPr>
+          <w:b/>
+        </w:rPr>
+        <w:t xml:space="preserve"> está</w:t>
+      </w:r>
+      <w:bookmarkStart w:id="0" w:name="_GoBack"/>
+      <w:bookmarkEnd w:id="0"/>
+      <w:r>
+        <w:rPr>
+          <w:b/>
+        </w:rPr>
+        <w:t xml:space="preserve">n encargados de la </w:t>
+      </w:r>
+      <w:proofErr w:type="spellStart"/>
+      <w:r>
+        <w:rPr>
+          <w:b/>
+        </w:rPr>
+        <w:t>Dockerización</w:t>
+      </w:r>
+      <w:proofErr w:type="spellEnd"/>
+      <w:r>
+        <w:rPr>
+          <w:b/>
+        </w:rPr>
+        <w:t xml:space="preserve">: </w:t>
+      </w:r>
+    </w:p>
+    <w:p>
+      <w:pPr>
         <w:numPr>
           <w:ilvl w:val="0"/>
-          <w:numId w:val="17"/>
+          <w:numId w:val="34"/>
         </w:numPr>
-        <w:spacing w:line="360" w:lineRule="auto"/>
-        <w:rPr>
-          <w:rFonts w:ascii="Arial" w:hAnsi="Arial" w:cs="Arial"/>
-        </w:rPr>
-      </w:pPr>
-      <w:r>
-        <w:rPr>
-          <w:rFonts w:ascii="Arial" w:hAnsi="Arial" w:cs="Arial"/>
-        </w:rPr>
-        <w:t>Pruebas de integración del ecosistema híbrido MERN + .NET.</w:t>
-      </w:r>
-    </w:p>
-    <w:p>
-      <w:pPr>
-        <w:pStyle w:val="NormalWeb"/>
+        <w:spacing w:after="256" w:line="263" w:lineRule="auto"/>
+        <w:ind w:right="842"/>
+        <w:jc w:val="left"/>
+        <w:rPr>
+          <w:b/>
+        </w:rPr>
+      </w:pPr>
+      <w:r>
+        <w:rPr>
+          <w:b/>
+        </w:rPr>
+        <w:t>Dany Lucas</w:t>
+      </w:r>
+    </w:p>
+    <w:p>
+      <w:pPr>
         <w:numPr>
           <w:ilvl w:val="0"/>
-          <w:numId w:val="17"/>
+          <w:numId w:val="34"/>
         </w:numPr>
-        <w:spacing w:line="360" w:lineRule="auto"/>
-        <w:rPr>
-          <w:rFonts w:ascii="Arial" w:hAnsi="Arial" w:cs="Arial"/>
-        </w:rPr>
-      </w:pPr>
-      <w:r>
-        <w:rPr>
-          <w:rFonts w:ascii="Arial" w:hAnsi="Arial" w:cs="Arial"/>
-        </w:rPr>
-        <w:t>Conexión de los endpoints de reportes del Backend con las vistas del cliente.</w:t>
-      </w:r>
-    </w:p>
-    <w:p>
-      <w:pPr>
-        <w:pStyle w:val="NormalWeb"/>
-        <w:rPr>
-          <w:rFonts w:hAnsi="Symbol"/>
-        </w:rPr>
-      </w:pPr>
-      <w:r>
-        <w:rPr>
-          <w:b/>
-        </w:rPr>
-        <w:t xml:space="preserve">Ricardo Hernández: </w:t>
-      </w:r>
-    </w:p>
-    <w:p>
-      <w:pPr>
-        <w:pStyle w:val="NormalWeb"/>
+        <w:spacing w:after="256" w:line="263" w:lineRule="auto"/>
+        <w:ind w:right="842"/>
+        <w:jc w:val="left"/>
+        <w:rPr>
+          <w:b/>
+        </w:rPr>
+      </w:pPr>
+      <w:r>
+        <w:rPr>
+          <w:b/>
+        </w:rPr>
+        <w:t>Wilson Adrián</w:t>
+      </w:r>
+    </w:p>
+    <w:p>
+      <w:pPr>
         <w:numPr>
           <w:ilvl w:val="0"/>
-          <w:numId w:val="17"/>
+          <w:numId w:val="34"/>
         </w:numPr>
-        <w:spacing w:line="360" w:lineRule="auto"/>
-        <w:rPr>
-          <w:rFonts w:ascii="Arial" w:hAnsi="Arial" w:cs="Arial"/>
-        </w:rPr>
-      </w:pPr>
-      <w:r>
-        <w:rPr>
-          <w:rFonts w:ascii="Arial" w:hAnsi="Arial" w:cs="Arial"/>
-        </w:rPr>
-        <w:t>Manejo de sesiones seguras y tokens JWT dentro de la App móvil en React Native.</w:t>
-      </w:r>
-    </w:p>
-    <w:p>
-      <w:pPr>
-        <w:pStyle w:val="NormalWeb"/>
+        <w:spacing w:after="256" w:line="263" w:lineRule="auto"/>
+        <w:ind w:right="842"/>
+        <w:jc w:val="left"/>
+        <w:rPr>
+          <w:b/>
+        </w:rPr>
+      </w:pPr>
+      <w:proofErr w:type="spellStart"/>
+      <w:r>
+        <w:rPr>
+          <w:b/>
+        </w:rPr>
+        <w:t>Jeferson</w:t>
+      </w:r>
+      <w:proofErr w:type="spellEnd"/>
+      <w:r>
+        <w:rPr>
+          <w:b/>
+        </w:rPr>
+        <w:t xml:space="preserve"> Cano</w:t>
+      </w:r>
+    </w:p>
+    <w:p>
+      <w:pPr>
         <w:numPr>
           <w:ilvl w:val="0"/>
-          <w:numId w:val="17"/>
+          <w:numId w:val="34"/>
         </w:numPr>
-        <w:spacing w:line="360" w:lineRule="auto"/>
-        <w:rPr>
-          <w:rFonts w:ascii="Arial" w:hAnsi="Arial" w:cs="Arial"/>
-        </w:rPr>
-      </w:pPr>
-      <w:r>
-        <w:rPr>
-          <w:rFonts w:ascii="Arial" w:hAnsi="Arial" w:cs="Arial"/>
-        </w:rPr>
-        <w:t>Control de acceso y protección de vistas según el rol del empleado en la aplicación móvil.</w:t>
-      </w:r>
-    </w:p>
-    <w:p>
-      <w:pPr>
-        <w:spacing w:after="302"/>
-        <w:ind w:right="3"/>
-        <w:rPr>
-          <w:b/>
-        </w:rPr>
-      </w:pPr>
-      <w:r>
-        <w:rPr>
-          <w:b/>
-        </w:rPr>
-        <w:lastRenderedPageBreak/>
-        <w:t xml:space="preserve">Otto: </w:t>
-      </w:r>
-    </w:p>
-    <w:p>
-      <w:pPr>
-        <w:pStyle w:val="NormalWeb"/>
-        <w:numPr>
-          <w:ilvl w:val="0"/>
-          <w:numId w:val="17"/>
-        </w:numPr>
-        <w:spacing w:line="360" w:lineRule="auto"/>
-        <w:rPr>
-          <w:rFonts w:ascii="Arial" w:hAnsi="Arial" w:cs="Arial"/>
-        </w:rPr>
-      </w:pPr>
-      <w:r>
-        <w:rPr>
-          <w:rFonts w:ascii="Arial" w:hAnsi="Arial" w:cs="Arial"/>
-        </w:rPr>
-        <w:t>Componente e interfaz de toma de pedidos y selección de mesas en React Native para la App de meseros.</w:t>
-      </w:r>
-    </w:p>
-    <w:p>
-      <w:pPr>
-        <w:pStyle w:val="NormalWeb"/>
-        <w:numPr>
-          <w:ilvl w:val="0"/>
-          <w:numId w:val="17"/>
-        </w:numPr>
-        <w:spacing w:line="360" w:lineRule="auto"/>
-        <w:rPr>
-          <w:rFonts w:ascii="Arial" w:hAnsi="Arial" w:cs="Arial"/>
-        </w:rPr>
-      </w:pPr>
-      <w:r>
-        <w:rPr>
-          <w:rFonts w:ascii="Arial" w:hAnsi="Arial" w:cs="Arial"/>
-        </w:rPr>
-        <w:t>Lógica de hooks en la aplicación móvil para el envío transaccional de comandas hacia la API.</w:t>
-      </w:r>
-    </w:p>
-    <w:p>
-      <w:pPr>
-        <w:pStyle w:val="NormalWeb"/>
-        <w:rPr>
-          <w:rFonts w:ascii="Arial" w:hAnsi="Arial" w:cs="Arial"/>
-          <w:b/>
-        </w:rPr>
-      </w:pPr>
-      <w:r>
-        <w:rPr>
-          <w:rFonts w:ascii="Arial" w:hAnsi="Arial" w:cs="Arial"/>
-          <w:b/>
-        </w:rPr>
-        <w:t xml:space="preserve">Jeferson: </w:t>
-      </w:r>
-    </w:p>
-    <w:p>
-      <w:pPr>
-        <w:pStyle w:val="NormalWeb"/>
-        <w:numPr>
-          <w:ilvl w:val="0"/>
-          <w:numId w:val="17"/>
-        </w:numPr>
-        <w:spacing w:line="360" w:lineRule="auto"/>
-        <w:rPr>
-          <w:rFonts w:ascii="Arial" w:hAnsi="Arial" w:cs="Arial"/>
-        </w:rPr>
-      </w:pPr>
-      <w:r>
-        <w:rPr>
-          <w:rFonts w:ascii="Arial" w:hAnsi="Arial" w:cs="Arial"/>
-        </w:rPr>
-        <w:t xml:space="preserve">Dockerización de servicios: Creación de archivos </w:t>
-      </w:r>
-      <w:r>
-        <w:rPr>
-          <w:rStyle w:val="CdigoHTML"/>
-          <w:rFonts w:ascii="Arial" w:eastAsia="Arial" w:hAnsi="Arial" w:cs="Arial"/>
-          <w:sz w:val="24"/>
-          <w:szCs w:val="24"/>
-        </w:rPr>
-        <w:t>Dockerfile</w:t>
-      </w:r>
-      <w:r>
-        <w:rPr>
-          <w:rFonts w:ascii="Arial" w:hAnsi="Arial" w:cs="Arial"/>
-        </w:rPr>
-        <w:t xml:space="preserve"> y construcción de imágenes optimizadas para el Frontend y el Backend.</w:t>
-      </w:r>
-    </w:p>
-    <w:p>
-      <w:pPr>
-        <w:pStyle w:val="NormalWeb"/>
-        <w:numPr>
-          <w:ilvl w:val="0"/>
-          <w:numId w:val="17"/>
-        </w:numPr>
-        <w:spacing w:line="360" w:lineRule="auto"/>
-        <w:rPr>
-          <w:rFonts w:ascii="Arial" w:hAnsi="Arial" w:cs="Arial"/>
-        </w:rPr>
-      </w:pPr>
-      <w:r>
-        <w:rPr>
-          <w:rFonts w:ascii="Arial" w:hAnsi="Arial" w:cs="Arial"/>
-        </w:rPr>
-        <w:t>Configuración de las variables de entorno seguras dentro de los contenedores de la aplicación.</w:t>
-      </w:r>
-    </w:p>
-    <w:p>
-      <w:pPr>
-        <w:pStyle w:val="NormalWeb"/>
-        <w:spacing w:line="360" w:lineRule="auto"/>
-        <w:rPr>
-          <w:rFonts w:ascii="Arial" w:hAnsi="Arial" w:cs="Arial"/>
-        </w:rPr>
-      </w:pPr>
-    </w:p>
-    <w:p>
-      <w:pPr>
-        <w:tabs>
-          <w:tab w:val="center" w:pos="4768"/>
-        </w:tabs>
-        <w:sectPr>
-          <w:pgSz w:w="11906" w:h="16838"/>
-          <w:pgMar w:top="1426" w:right="678" w:bottom="1556" w:left="1688" w:header="720" w:footer="720" w:gutter="0"/>
-          <w:pgNumType w:start="5"/>
-          <w:cols w:space="720"/>
-          <w:titlePg/>
-        </w:sectPr>
-      </w:pPr>
-      <w:r>
-        <w:tab/>
-      </w:r>
+        <w:spacing w:after="256" w:line="263" w:lineRule="auto"/>
+        <w:ind w:right="842"/>
+        <w:jc w:val="left"/>
+        <w:rPr>
+          <w:b/>
+        </w:rPr>
+      </w:pPr>
+      <w:r>
+        <w:rPr>
+          <w:b/>
+        </w:rPr>
+        <w:t>Otto Díaz</w:t>
+      </w:r>
+    </w:p>
+    <w:p>
+      <w:pPr>
+        <w:spacing w:after="256" w:line="263" w:lineRule="auto"/>
+        <w:ind w:left="10" w:right="842"/>
+        <w:jc w:val="left"/>
+        <w:rPr>
+          <w:b/>
+        </w:rPr>
+      </w:pPr>
     </w:p>
     <w:p>
       <w:pPr>
@@ -4726,15 +5663,23 @@
           <w:b/>
           <w:sz w:val="28"/>
         </w:rPr>
-        <w:lastRenderedPageBreak/>
         <w:t xml:space="preserve">10. </w:t>
       </w:r>
+      <w:proofErr w:type="spellStart"/>
       <w:r>
         <w:rPr>
           <w:b/>
           <w:sz w:val="28"/>
         </w:rPr>
-        <w:t xml:space="preserve">Stack Tecnológico. </w:t>
+        <w:t>Stack</w:t>
+      </w:r>
+      <w:proofErr w:type="spellEnd"/>
+      <w:r>
+        <w:rPr>
+          <w:b/>
+          <w:sz w:val="28"/>
+        </w:rPr>
+        <w:t xml:space="preserve"> Tecnológico. </w:t>
       </w:r>
       <w:r>
         <w:rPr>
@@ -4803,9 +5748,19 @@
         <w:spacing w:after="55" w:line="329" w:lineRule="auto"/>
         <w:ind w:right="3" w:hanging="360"/>
       </w:pPr>
-      <w:r>
-        <w:t>React Native</w:t>
-      </w:r>
+      <w:proofErr w:type="spellStart"/>
+      <w:r>
+        <w:t>React</w:t>
+      </w:r>
+      <w:proofErr w:type="spellEnd"/>
+      <w:r>
+        <w:t xml:space="preserve"> </w:t>
+      </w:r>
+      <w:proofErr w:type="spellStart"/>
+      <w:r>
+        <w:t>Native</w:t>
+      </w:r>
+      <w:proofErr w:type="spellEnd"/>
     </w:p>
     <w:p>
       <w:pPr>
@@ -4816,9 +5771,19 @@
         <w:spacing w:after="55" w:line="329" w:lineRule="auto"/>
         <w:ind w:right="3" w:hanging="360"/>
       </w:pPr>
-      <w:r>
-        <w:t>Tailwind CSS / NativeWind</w:t>
-      </w:r>
+      <w:proofErr w:type="spellStart"/>
+      <w:r>
+        <w:t>Tailwind</w:t>
+      </w:r>
+      <w:proofErr w:type="spellEnd"/>
+      <w:r>
+        <w:t xml:space="preserve"> CSS / </w:t>
+      </w:r>
+      <w:proofErr w:type="spellStart"/>
+      <w:r>
+        <w:t>NativeWind</w:t>
+      </w:r>
+      <w:proofErr w:type="spellEnd"/>
     </w:p>
     <w:p>
       <w:pPr>
@@ -4849,7 +5814,21 @@
         <w:rPr>
           <w:b/>
         </w:rPr>
-        <w:t xml:space="preserve">10.2. Backend: </w:t>
+        <w:t xml:space="preserve">10.2. </w:t>
+      </w:r>
+      <w:proofErr w:type="spellStart"/>
+      <w:r>
+        <w:rPr>
+          <w:b/>
+        </w:rPr>
+        <w:t>Backend</w:t>
+      </w:r>
+      <w:proofErr w:type="spellEnd"/>
+      <w:r>
+        <w:rPr>
+          <w:b/>
+        </w:rPr>
+        <w:t xml:space="preserve">: </w:t>
       </w:r>
     </w:p>
     <w:p>
@@ -4907,7 +5886,21 @@
         <w:rPr>
           <w:b/>
         </w:rPr>
-        <w:t>10.3. DevOps y Despliegue:</w:t>
+        <w:t xml:space="preserve">10.3. </w:t>
+      </w:r>
+      <w:proofErr w:type="spellStart"/>
+      <w:r>
+        <w:rPr>
+          <w:b/>
+        </w:rPr>
+        <w:t>DevOps</w:t>
+      </w:r>
+      <w:proofErr w:type="spellEnd"/>
+      <w:r>
+        <w:rPr>
+          <w:b/>
+        </w:rPr>
+        <w:t xml:space="preserve"> y Despliegue:</w:t>
       </w:r>
       <w:r>
         <w:t xml:space="preserve"> </w:t>
@@ -4922,11 +5915,32 @@
         <w:spacing w:after="248"/>
         <w:ind w:right="3" w:hanging="360"/>
       </w:pPr>
-      <w:r>
-        <w:t>Docker y</w:t>
-      </w:r>
-      <w:r>
-        <w:t xml:space="preserve"> Docker Compose  </w:t>
+      <w:proofErr w:type="spellStart"/>
+      <w:r>
+        <w:t>Docker</w:t>
+      </w:r>
+      <w:proofErr w:type="spellEnd"/>
+      <w:r>
+        <w:t xml:space="preserve"> y</w:t>
+      </w:r>
+      <w:r>
+        <w:t xml:space="preserve"> </w:t>
+      </w:r>
+      <w:proofErr w:type="spellStart"/>
+      <w:r>
+        <w:t>Docker</w:t>
+      </w:r>
+      <w:proofErr w:type="spellEnd"/>
+      <w:r>
+        <w:t xml:space="preserve"> </w:t>
+      </w:r>
+      <w:proofErr w:type="spellStart"/>
+      <w:r>
+        <w:t>Compose</w:t>
+      </w:r>
+      <w:proofErr w:type="spellEnd"/>
+      <w:r>
+        <w:t xml:space="preserve">  </w:t>
       </w:r>
     </w:p>
     <w:p>
@@ -4938,8 +5952,13 @@
         <w:spacing w:after="248"/>
         <w:ind w:right="3" w:hanging="360"/>
       </w:pPr>
-      <w:r>
-        <w:t xml:space="preserve">Vercel </w:t>
+      <w:proofErr w:type="spellStart"/>
+      <w:r>
+        <w:t>Vercel</w:t>
+      </w:r>
+      <w:proofErr w:type="spellEnd"/>
+      <w:r>
+        <w:t xml:space="preserve"> </w:t>
       </w:r>
       <w:r>
         <w:t xml:space="preserve"> </w:t>
@@ -4954,8 +5973,13 @@
         <w:spacing w:after="248"/>
         <w:ind w:right="3" w:hanging="360"/>
       </w:pPr>
-      <w:r>
-        <w:t xml:space="preserve">Netlify  </w:t>
+      <w:proofErr w:type="spellStart"/>
+      <w:r>
+        <w:t>Netlify</w:t>
+      </w:r>
+      <w:proofErr w:type="spellEnd"/>
+      <w:r>
+        <w:t xml:space="preserve">  </w:t>
       </w:r>
     </w:p>
     <w:p>
@@ -4967,8 +5991,13 @@
         <w:spacing w:after="248"/>
         <w:ind w:right="3" w:hanging="360"/>
       </w:pPr>
-      <w:r>
-        <w:t xml:space="preserve">Firebase </w:t>
+      <w:proofErr w:type="spellStart"/>
+      <w:r>
+        <w:t>Firebase</w:t>
+      </w:r>
+      <w:proofErr w:type="spellEnd"/>
+      <w:r>
+        <w:t xml:space="preserve"> </w:t>
       </w:r>
       <w:r>
         <w:t xml:space="preserve"> </w:t>
@@ -4993,12 +6022,6 @@
         <w:ind w:left="14" w:right="0" w:firstLine="0"/>
         <w:jc w:val="left"/>
       </w:pPr>
-      <w:r>
-        <w:rPr>
-          <w:b/>
-        </w:rPr>
-        <w:t xml:space="preserve"> </w:t>
-      </w:r>
     </w:p>
     <w:p>
       <w:pPr>
@@ -5021,20 +6044,18 @@
     </w:p>
     <w:p>
       <w:pPr>
-        <w:pStyle w:val="Prrafodelista"/>
         <w:numPr>
           <w:ilvl w:val="1"/>
           <w:numId w:val="7"/>
         </w:numPr>
-        <w:spacing w:after="163"/>
-        <w:ind w:right="3"/>
-      </w:pPr>
+        <w:spacing w:after="248"/>
+        <w:ind w:right="3" w:hanging="360"/>
+      </w:pPr>
+      <w:proofErr w:type="spellStart"/>
       <w:r>
         <w:t>MongoDB</w:t>
       </w:r>
-      <w:r>
-        <w:t xml:space="preserve">  </w:t>
-      </w:r>
+      <w:proofErr w:type="spellEnd"/>
     </w:p>
     <w:p>
       <w:pPr>
@@ -5067,9 +6088,11 @@
         <w:spacing w:after="236"/>
         <w:ind w:right="3" w:hanging="360"/>
       </w:pPr>
+      <w:proofErr w:type="spellStart"/>
       <w:r>
         <w:t>Postman</w:t>
       </w:r>
+      <w:proofErr w:type="spellEnd"/>
       <w:r>
         <w:t xml:space="preserve"> </w:t>
       </w:r>
@@ -5083,9 +6106,11 @@
         <w:spacing w:line="463" w:lineRule="auto"/>
         <w:ind w:right="3" w:hanging="360"/>
       </w:pPr>
+      <w:proofErr w:type="spellStart"/>
       <w:r>
         <w:t>Cloudinary</w:t>
       </w:r>
+      <w:proofErr w:type="spellEnd"/>
     </w:p>
     <w:p>
       <w:pPr>
@@ -5113,7 +6138,7 @@
 </file>
 
 <file path=word/endnotes.xml><?xml version="1.0" encoding="utf-8"?>
-<w:endnotes xmlns:wpc="http://schemas.microsoft.com/office/word/2010/wordprocessingCanvas" xmlns:cx="http://schemas.microsoft.com/office/drawing/2014/chartex" xmlns:cx1="http://schemas.microsoft.com/office/drawing/2015/9/8/chartex" xmlns:cx2="http://schemas.microsoft.com/office/drawing/2015/10/21/chartex" xmlns:cx3="http://schemas.microsoft.com/office/drawing/2016/5/9/chartex" xmlns:cx4="http://schemas.microsoft.com/office/drawing/2016/5/10/chartex" xmlns:cx5="http://schemas.microsoft.com/office/drawing/2016/5/11/chartex" xmlns:cx6="http://schemas.microsoft.com/office/drawing/2016/5/12/chartex" xmlns:cx7="http://schemas.microsoft.com/office/drawing/2016/5/13/chartex" xmlns:cx8="http://schemas.microsoft.com/office/drawing/2016/5/14/chartex" xmlns:mc="http://schemas.openxmlformats.org/markup-compatibility/2006" xmlns:aink="http://schemas.microsoft.com/office/drawing/2016/ink" xmlns:am3d="http://schemas.microsoft.com/office/drawing/2017/model3d" xmlns:o="urn:schemas-microsoft-com:office:office" xmlns:oel="http://schemas.microsoft.com/office/2019/extlst" xmlns:r="http://schemas.openxmlformats.org/officeDocument/2006/relationships" xmlns:m="http://schemas.openxmlformats.org/officeDocument/2006/math" xmlns:v="urn:schemas-microsoft-com:vml" xmlns:wp14="http://schemas.microsoft.com/office/word/2010/wordprocessingDrawing" xmlns:wp="http://schemas.openxmlformats.org/drawingml/2006/wordprocessingDrawing" xmlns:w10="urn:schemas-microsoft-com:office:word" xmlns:w="http://schemas.openxmlformats.org/wordprocessingml/2006/main" xmlns:w14="http://schemas.microsoft.com/office/word/2010/wordml" xmlns:w15="http://schemas.microsoft.com/office/word/2012/wordml" xmlns:w16cex="http://schemas.microsoft.com/office/word/2018/wordml/cex" xmlns:w16cid="http://schemas.microsoft.com/office/word/2016/wordml/cid" xmlns:w16="http://schemas.microsoft.com/office/word/2018/wordml" xmlns:w16du="http://schemas.microsoft.com/office/word/2023/wordml/word16du" xmlns:w16sdtdh="http://schemas.microsoft.com/office/word/2020/wordml/sdtdatahash" xmlns:w16sdtfl="http://schemas.microsoft.com/office/word/2024/wordml/sdtformatlock" xmlns:w16se="http://schemas.microsoft.com/office/word/2015/wordml/symex" xmlns:wpg="http://schemas.microsoft.com/office/word/2010/wordprocessingGroup" xmlns:wpi="http://schemas.microsoft.com/office/word/2010/wordprocessingInk" xmlns:wne="http://schemas.microsoft.com/office/word/2006/wordml" xmlns:wps="http://schemas.microsoft.com/office/word/2010/wordprocessingShape" mc:Ignorable="w14 w15 w16se w16cid w16 w16cex w16sdtdh w16sdtfl w16du wp14">
+<w:endnotes xmlns:wpc="http://schemas.microsoft.com/office/word/2010/wordprocessingCanvas" xmlns:cx="http://schemas.microsoft.com/office/drawing/2014/chartex" xmlns:cx1="http://schemas.microsoft.com/office/drawing/2015/9/8/chartex" xmlns:mc="http://schemas.openxmlformats.org/markup-compatibility/2006" xmlns:o="urn:schemas-microsoft-com:office:office" xmlns:r="http://schemas.openxmlformats.org/officeDocument/2006/relationships" xmlns:m="http://schemas.openxmlformats.org/officeDocument/2006/math" xmlns:v="urn:schemas-microsoft-com:vml" xmlns:wp14="http://schemas.microsoft.com/office/word/2010/wordprocessingDrawing" xmlns:wp="http://schemas.openxmlformats.org/drawingml/2006/wordprocessingDrawing" xmlns:w10="urn:schemas-microsoft-com:office:word" xmlns:w="http://schemas.openxmlformats.org/wordprocessingml/2006/main" xmlns:w14="http://schemas.microsoft.com/office/word/2010/wordml" xmlns:w15="http://schemas.microsoft.com/office/word/2012/wordml" xmlns:w16se="http://schemas.microsoft.com/office/word/2015/wordml/symex" xmlns:wpg="http://schemas.microsoft.com/office/word/2010/wordprocessingGroup" xmlns:wpi="http://schemas.microsoft.com/office/word/2010/wordprocessingInk" xmlns:wne="http://schemas.microsoft.com/office/word/2006/wordml" xmlns:wps="http://schemas.microsoft.com/office/word/2010/wordprocessingShape" mc:Ignorable="w14 w15 w16se wp14">
   <w:endnote w:type="separator" w:id="-1">
     <w:p>
       <w:pPr>
@@ -5138,7 +6163,7 @@
 </file>
 
 <file path=word/footnotes.xml><?xml version="1.0" encoding="utf-8"?>
-<w:footnotes xmlns:wpc="http://schemas.microsoft.com/office/word/2010/wordprocessingCanvas" xmlns:cx="http://schemas.microsoft.com/office/drawing/2014/chartex" xmlns:cx1="http://schemas.microsoft.com/office/drawing/2015/9/8/chartex" xmlns:cx2="http://schemas.microsoft.com/office/drawing/2015/10/21/chartex" xmlns:cx3="http://schemas.microsoft.com/office/drawing/2016/5/9/chartex" xmlns:cx4="http://schemas.microsoft.com/office/drawing/2016/5/10/chartex" xmlns:cx5="http://schemas.microsoft.com/office/drawing/2016/5/11/chartex" xmlns:cx6="http://schemas.microsoft.com/office/drawing/2016/5/12/chartex" xmlns:cx7="http://schemas.microsoft.com/office/drawing/2016/5/13/chartex" xmlns:cx8="http://schemas.microsoft.com/office/drawing/2016/5/14/chartex" xmlns:mc="http://schemas.openxmlformats.org/markup-compatibility/2006" xmlns:aink="http://schemas.microsoft.com/office/drawing/2016/ink" xmlns:am3d="http://schemas.microsoft.com/office/drawing/2017/model3d" xmlns:o="urn:schemas-microsoft-com:office:office" xmlns:oel="http://schemas.microsoft.com/office/2019/extlst" xmlns:r="http://schemas.openxmlformats.org/officeDocument/2006/relationships" xmlns:m="http://schemas.openxmlformats.org/officeDocument/2006/math" xmlns:v="urn:schemas-microsoft-com:vml" xmlns:wp14="http://schemas.microsoft.com/office/word/2010/wordprocessingDrawing" xmlns:wp="http://schemas.openxmlformats.org/drawingml/2006/wordprocessingDrawing" xmlns:w10="urn:schemas-microsoft-com:office:word" xmlns:w="http://schemas.openxmlformats.org/wordprocessingml/2006/main" xmlns:w14="http://schemas.microsoft.com/office/word/2010/wordml" xmlns:w15="http://schemas.microsoft.com/office/word/2012/wordml" xmlns:w16cex="http://schemas.microsoft.com/office/word/2018/wordml/cex" xmlns:w16cid="http://schemas.microsoft.com/office/word/2016/wordml/cid" xmlns:w16="http://schemas.microsoft.com/office/word/2018/wordml" xmlns:w16du="http://schemas.microsoft.com/office/word/2023/wordml/word16du" xmlns:w16sdtdh="http://schemas.microsoft.com/office/word/2020/wordml/sdtdatahash" xmlns:w16sdtfl="http://schemas.microsoft.com/office/word/2024/wordml/sdtformatlock" xmlns:w16se="http://schemas.microsoft.com/office/word/2015/wordml/symex" xmlns:wpg="http://schemas.microsoft.com/office/word/2010/wordprocessingGroup" xmlns:wpi="http://schemas.microsoft.com/office/word/2010/wordprocessingInk" xmlns:wne="http://schemas.microsoft.com/office/word/2006/wordml" xmlns:wps="http://schemas.microsoft.com/office/word/2010/wordprocessingShape" mc:Ignorable="w14 w15 w16se w16cid w16 w16cex w16sdtdh w16sdtfl w16du wp14">
+<w:footnotes xmlns:wpc="http://schemas.microsoft.com/office/word/2010/wordprocessingCanvas" xmlns:cx="http://schemas.microsoft.com/office/drawing/2014/chartex" xmlns:cx1="http://schemas.microsoft.com/office/drawing/2015/9/8/chartex" xmlns:mc="http://schemas.openxmlformats.org/markup-compatibility/2006" xmlns:o="urn:schemas-microsoft-com:office:office" xmlns:r="http://schemas.openxmlformats.org/officeDocument/2006/relationships" xmlns:m="http://schemas.openxmlformats.org/officeDocument/2006/math" xmlns:v="urn:schemas-microsoft-com:vml" xmlns:wp14="http://schemas.microsoft.com/office/word/2010/wordprocessingDrawing" xmlns:wp="http://schemas.openxmlformats.org/drawingml/2006/wordprocessingDrawing" xmlns:w10="urn:schemas-microsoft-com:office:word" xmlns:w="http://schemas.openxmlformats.org/wordprocessingml/2006/main" xmlns:w14="http://schemas.microsoft.com/office/word/2010/wordml" xmlns:w15="http://schemas.microsoft.com/office/word/2012/wordml" xmlns:w16se="http://schemas.microsoft.com/office/word/2015/wordml/symex" xmlns:wpg="http://schemas.microsoft.com/office/word/2010/wordprocessingGroup" xmlns:wpi="http://schemas.microsoft.com/office/word/2010/wordprocessingInk" xmlns:wne="http://schemas.microsoft.com/office/word/2006/wordml" xmlns:wps="http://schemas.microsoft.com/office/word/2010/wordprocessingShape" mc:Ignorable="w14 w15 w16se wp14">
   <w:footnote w:type="separator" w:id="-1">
     <w:p>
       <w:pPr>
@@ -5163,7 +6188,7 @@
 </file>
 
 <file path=word/header1.xml><?xml version="1.0" encoding="utf-8"?>
-<w:hdr xmlns:wpc="http://schemas.microsoft.com/office/word/2010/wordprocessingCanvas" xmlns:cx="http://schemas.microsoft.com/office/drawing/2014/chartex" xmlns:cx1="http://schemas.microsoft.com/office/drawing/2015/9/8/chartex" xmlns:cx2="http://schemas.microsoft.com/office/drawing/2015/10/21/chartex" xmlns:cx3="http://schemas.microsoft.com/office/drawing/2016/5/9/chartex" xmlns:cx4="http://schemas.microsoft.com/office/drawing/2016/5/10/chartex" xmlns:cx5="http://schemas.microsoft.com/office/drawing/2016/5/11/chartex" xmlns:cx6="http://schemas.microsoft.com/office/drawing/2016/5/12/chartex" xmlns:cx7="http://schemas.microsoft.com/office/drawing/2016/5/13/chartex" xmlns:cx8="http://schemas.microsoft.com/office/drawing/2016/5/14/chartex" xmlns:mc="http://schemas.openxmlformats.org/markup-compatibility/2006" xmlns:aink="http://schemas.microsoft.com/office/drawing/2016/ink" xmlns:am3d="http://schemas.microsoft.com/office/drawing/2017/model3d" xmlns:o="urn:schemas-microsoft-com:office:office" xmlns:oel="http://schemas.microsoft.com/office/2019/extlst" xmlns:r="http://schemas.openxmlformats.org/officeDocument/2006/relationships" xmlns:m="http://schemas.openxmlformats.org/officeDocument/2006/math" xmlns:v="urn:schemas-microsoft-com:vml" xmlns:wp14="http://schemas.microsoft.com/office/word/2010/wordprocessingDrawing" xmlns:wp="http://schemas.openxmlformats.org/drawingml/2006/wordprocessingDrawing" xmlns:w10="urn:schemas-microsoft-com:office:word" xmlns:w="http://schemas.openxmlformats.org/wordprocessingml/2006/main" xmlns:w14="http://schemas.microsoft.com/office/word/2010/wordml" xmlns:w15="http://schemas.microsoft.com/office/word/2012/wordml" xmlns:w16cex="http://schemas.microsoft.com/office/word/2018/wordml/cex" xmlns:w16cid="http://schemas.microsoft.com/office/word/2016/wordml/cid" xmlns:w16="http://schemas.microsoft.com/office/word/2018/wordml" xmlns:w16du="http://schemas.microsoft.com/office/word/2023/wordml/word16du" xmlns:w16sdtdh="http://schemas.microsoft.com/office/word/2020/wordml/sdtdatahash" xmlns:w16sdtfl="http://schemas.microsoft.com/office/word/2024/wordml/sdtformatlock" xmlns:w16se="http://schemas.microsoft.com/office/word/2015/wordml/symex" xmlns:wpg="http://schemas.microsoft.com/office/word/2010/wordprocessingGroup" xmlns:wpi="http://schemas.microsoft.com/office/word/2010/wordprocessingInk" xmlns:wne="http://schemas.microsoft.com/office/word/2006/wordml" xmlns:wps="http://schemas.microsoft.com/office/word/2010/wordprocessingShape" mc:Ignorable="w14 w15 w16se w16cid w16 w16cex w16sdtdh w16sdtfl w16du wp14">
+<w:hdr xmlns:wpc="http://schemas.microsoft.com/office/word/2010/wordprocessingCanvas" xmlns:cx="http://schemas.microsoft.com/office/drawing/2014/chartex" xmlns:cx1="http://schemas.microsoft.com/office/drawing/2015/9/8/chartex" xmlns:mc="http://schemas.openxmlformats.org/markup-compatibility/2006" xmlns:o="urn:schemas-microsoft-com:office:office" xmlns:r="http://schemas.openxmlformats.org/officeDocument/2006/relationships" xmlns:m="http://schemas.openxmlformats.org/officeDocument/2006/math" xmlns:v="urn:schemas-microsoft-com:vml" xmlns:wp14="http://schemas.microsoft.com/office/word/2010/wordprocessingDrawing" xmlns:wp="http://schemas.openxmlformats.org/drawingml/2006/wordprocessingDrawing" xmlns:w10="urn:schemas-microsoft-com:office:word" xmlns:w="http://schemas.openxmlformats.org/wordprocessingml/2006/main" xmlns:w14="http://schemas.microsoft.com/office/word/2010/wordml" xmlns:w15="http://schemas.microsoft.com/office/word/2012/wordml" xmlns:w16se="http://schemas.microsoft.com/office/word/2015/wordml/symex" xmlns:wpg="http://schemas.microsoft.com/office/word/2010/wordprocessingGroup" xmlns:wpi="http://schemas.microsoft.com/office/word/2010/wordprocessingInk" xmlns:wne="http://schemas.microsoft.com/office/word/2006/wordml" xmlns:wps="http://schemas.microsoft.com/office/word/2010/wordprocessingShape" mc:Ignorable="w14 w15 w16se wp14">
   <w:p>
     <w:pPr>
       <w:spacing w:after="0" w:line="259" w:lineRule="auto"/>
@@ -5217,7 +6242,7 @@
 </file>
 
 <file path=word/header2.xml><?xml version="1.0" encoding="utf-8"?>
-<w:hdr xmlns:wpc="http://schemas.microsoft.com/office/word/2010/wordprocessingCanvas" xmlns:cx="http://schemas.microsoft.com/office/drawing/2014/chartex" xmlns:cx1="http://schemas.microsoft.com/office/drawing/2015/9/8/chartex" xmlns:cx2="http://schemas.microsoft.com/office/drawing/2015/10/21/chartex" xmlns:cx3="http://schemas.microsoft.com/office/drawing/2016/5/9/chartex" xmlns:cx4="http://schemas.microsoft.com/office/drawing/2016/5/10/chartex" xmlns:cx5="http://schemas.microsoft.com/office/drawing/2016/5/11/chartex" xmlns:cx6="http://schemas.microsoft.com/office/drawing/2016/5/12/chartex" xmlns:cx7="http://schemas.microsoft.com/office/drawing/2016/5/13/chartex" xmlns:cx8="http://schemas.microsoft.com/office/drawing/2016/5/14/chartex" xmlns:mc="http://schemas.openxmlformats.org/markup-compatibility/2006" xmlns:aink="http://schemas.microsoft.com/office/drawing/2016/ink" xmlns:am3d="http://schemas.microsoft.com/office/drawing/2017/model3d" xmlns:o="urn:schemas-microsoft-com:office:office" xmlns:oel="http://schemas.microsoft.com/office/2019/extlst" xmlns:r="http://schemas.openxmlformats.org/officeDocument/2006/relationships" xmlns:m="http://schemas.openxmlformats.org/officeDocument/2006/math" xmlns:v="urn:schemas-microsoft-com:vml" xmlns:wp14="http://schemas.microsoft.com/office/word/2010/wordprocessingDrawing" xmlns:wp="http://schemas.openxmlformats.org/drawingml/2006/wordprocessingDrawing" xmlns:w10="urn:schemas-microsoft-com:office:word" xmlns:w="http://schemas.openxmlformats.org/wordprocessingml/2006/main" xmlns:w14="http://schemas.microsoft.com/office/word/2010/wordml" xmlns:w15="http://schemas.microsoft.com/office/word/2012/wordml" xmlns:w16cex="http://schemas.microsoft.com/office/word/2018/wordml/cex" xmlns:w16cid="http://schemas.microsoft.com/office/word/2016/wordml/cid" xmlns:w16="http://schemas.microsoft.com/office/word/2018/wordml" xmlns:w16du="http://schemas.microsoft.com/office/word/2023/wordml/word16du" xmlns:w16sdtdh="http://schemas.microsoft.com/office/word/2020/wordml/sdtdatahash" xmlns:w16sdtfl="http://schemas.microsoft.com/office/word/2024/wordml/sdtformatlock" xmlns:w16se="http://schemas.microsoft.com/office/word/2015/wordml/symex" xmlns:wpg="http://schemas.microsoft.com/office/word/2010/wordprocessingGroup" xmlns:wpi="http://schemas.microsoft.com/office/word/2010/wordprocessingInk" xmlns:wne="http://schemas.microsoft.com/office/word/2006/wordml" xmlns:wps="http://schemas.microsoft.com/office/word/2010/wordprocessingShape" mc:Ignorable="w14 w15 w16se w16cid w16 w16cex w16sdtdh w16sdtfl w16du wp14">
+<w:hdr xmlns:wpc="http://schemas.microsoft.com/office/word/2010/wordprocessingCanvas" xmlns:cx="http://schemas.microsoft.com/office/drawing/2014/chartex" xmlns:cx1="http://schemas.microsoft.com/office/drawing/2015/9/8/chartex" xmlns:mc="http://schemas.openxmlformats.org/markup-compatibility/2006" xmlns:o="urn:schemas-microsoft-com:office:office" xmlns:r="http://schemas.openxmlformats.org/officeDocument/2006/relationships" xmlns:m="http://schemas.openxmlformats.org/officeDocument/2006/math" xmlns:v="urn:schemas-microsoft-com:vml" xmlns:wp14="http://schemas.microsoft.com/office/word/2010/wordprocessingDrawing" xmlns:wp="http://schemas.openxmlformats.org/drawingml/2006/wordprocessingDrawing" xmlns:w10="urn:schemas-microsoft-com:office:word" xmlns:w="http://schemas.openxmlformats.org/wordprocessingml/2006/main" xmlns:w14="http://schemas.microsoft.com/office/word/2010/wordml" xmlns:w15="http://schemas.microsoft.com/office/word/2012/wordml" xmlns:w16se="http://schemas.microsoft.com/office/word/2015/wordml/symex" xmlns:wpg="http://schemas.microsoft.com/office/word/2010/wordprocessingGroup" xmlns:wpi="http://schemas.microsoft.com/office/word/2010/wordprocessingInk" xmlns:wne="http://schemas.microsoft.com/office/word/2006/wordml" xmlns:wps="http://schemas.microsoft.com/office/word/2010/wordprocessingShape" mc:Ignorable="w14 w15 w16se wp14">
   <w:p>
     <w:pPr>
       <w:spacing w:after="0" w:line="259" w:lineRule="auto"/>
@@ -5229,7 +6254,7 @@
 </file>
 
 <file path=word/header3.xml><?xml version="1.0" encoding="utf-8"?>
-<w:hdr xmlns:wpc="http://schemas.microsoft.com/office/word/2010/wordprocessingCanvas" xmlns:cx="http://schemas.microsoft.com/office/drawing/2014/chartex" xmlns:cx1="http://schemas.microsoft.com/office/drawing/2015/9/8/chartex" xmlns:cx2="http://schemas.microsoft.com/office/drawing/2015/10/21/chartex" xmlns:cx3="http://schemas.microsoft.com/office/drawing/2016/5/9/chartex" xmlns:cx4="http://schemas.microsoft.com/office/drawing/2016/5/10/chartex" xmlns:cx5="http://schemas.microsoft.com/office/drawing/2016/5/11/chartex" xmlns:cx6="http://schemas.microsoft.com/office/drawing/2016/5/12/chartex" xmlns:cx7="http://schemas.microsoft.com/office/drawing/2016/5/13/chartex" xmlns:cx8="http://schemas.microsoft.com/office/drawing/2016/5/14/chartex" xmlns:mc="http://schemas.openxmlformats.org/markup-compatibility/2006" xmlns:aink="http://schemas.microsoft.com/office/drawing/2016/ink" xmlns:am3d="http://schemas.microsoft.com/office/drawing/2017/model3d" xmlns:o="urn:schemas-microsoft-com:office:office" xmlns:oel="http://schemas.microsoft.com/office/2019/extlst" xmlns:r="http://schemas.openxmlformats.org/officeDocument/2006/relationships" xmlns:m="http://schemas.openxmlformats.org/officeDocument/2006/math" xmlns:v="urn:schemas-microsoft-com:vml" xmlns:wp14="http://schemas.microsoft.com/office/word/2010/wordprocessingDrawing" xmlns:wp="http://schemas.openxmlformats.org/drawingml/2006/wordprocessingDrawing" xmlns:w10="urn:schemas-microsoft-com:office:word" xmlns:w="http://schemas.openxmlformats.org/wordprocessingml/2006/main" xmlns:w14="http://schemas.microsoft.com/office/word/2010/wordml" xmlns:w15="http://schemas.microsoft.com/office/word/2012/wordml" xmlns:w16cex="http://schemas.microsoft.com/office/word/2018/wordml/cex" xmlns:w16cid="http://schemas.microsoft.com/office/word/2016/wordml/cid" xmlns:w16="http://schemas.microsoft.com/office/word/2018/wordml" xmlns:w16du="http://schemas.microsoft.com/office/word/2023/wordml/word16du" xmlns:w16sdtdh="http://schemas.microsoft.com/office/word/2020/wordml/sdtdatahash" xmlns:w16sdtfl="http://schemas.microsoft.com/office/word/2024/wordml/sdtformatlock" xmlns:w16se="http://schemas.microsoft.com/office/word/2015/wordml/symex" xmlns:wpg="http://schemas.microsoft.com/office/word/2010/wordprocessingGroup" xmlns:wpi="http://schemas.microsoft.com/office/word/2010/wordprocessingInk" xmlns:wne="http://schemas.microsoft.com/office/word/2006/wordml" xmlns:wps="http://schemas.microsoft.com/office/word/2010/wordprocessingShape" mc:Ignorable="w14 w15 w16se w16cid w16 w16cex w16sdtdh w16sdtfl w16du wp14">
+<w:hdr xmlns:wpc="http://schemas.microsoft.com/office/word/2010/wordprocessingCanvas" xmlns:cx="http://schemas.microsoft.com/office/drawing/2014/chartex" xmlns:cx1="http://schemas.microsoft.com/office/drawing/2015/9/8/chartex" xmlns:mc="http://schemas.openxmlformats.org/markup-compatibility/2006" xmlns:o="urn:schemas-microsoft-com:office:office" xmlns:r="http://schemas.openxmlformats.org/officeDocument/2006/relationships" xmlns:m="http://schemas.openxmlformats.org/officeDocument/2006/math" xmlns:v="urn:schemas-microsoft-com:vml" xmlns:wp14="http://schemas.microsoft.com/office/word/2010/wordprocessingDrawing" xmlns:wp="http://schemas.openxmlformats.org/drawingml/2006/wordprocessingDrawing" xmlns:w10="urn:schemas-microsoft-com:office:word" xmlns:w="http://schemas.openxmlformats.org/wordprocessingml/2006/main" xmlns:w14="http://schemas.microsoft.com/office/word/2010/wordml" xmlns:w15="http://schemas.microsoft.com/office/word/2012/wordml" xmlns:w16se="http://schemas.microsoft.com/office/word/2015/wordml/symex" xmlns:wpg="http://schemas.microsoft.com/office/word/2010/wordprocessingGroup" xmlns:wpi="http://schemas.microsoft.com/office/word/2010/wordprocessingInk" xmlns:wne="http://schemas.microsoft.com/office/word/2006/wordml" xmlns:wps="http://schemas.microsoft.com/office/word/2010/wordprocessingShape" mc:Ignorable="w14 w15 w16se wp14">
   <w:p>
     <w:pPr>
       <w:spacing w:after="160" w:line="259" w:lineRule="auto"/>
@@ -5241,7 +6266,7 @@
 </file>
 
 <file path=word/header4.xml><?xml version="1.0" encoding="utf-8"?>
-<w:hdr xmlns:wpc="http://schemas.microsoft.com/office/word/2010/wordprocessingCanvas" xmlns:cx="http://schemas.microsoft.com/office/drawing/2014/chartex" xmlns:cx1="http://schemas.microsoft.com/office/drawing/2015/9/8/chartex" xmlns:cx2="http://schemas.microsoft.com/office/drawing/2015/10/21/chartex" xmlns:cx3="http://schemas.microsoft.com/office/drawing/2016/5/9/chartex" xmlns:cx4="http://schemas.microsoft.com/office/drawing/2016/5/10/chartex" xmlns:cx5="http://schemas.microsoft.com/office/drawing/2016/5/11/chartex" xmlns:cx6="http://schemas.microsoft.com/office/drawing/2016/5/12/chartex" xmlns:cx7="http://schemas.microsoft.com/office/drawing/2016/5/13/chartex" xmlns:cx8="http://schemas.microsoft.com/office/drawing/2016/5/14/chartex" xmlns:mc="http://schemas.openxmlformats.org/markup-compatibility/2006" xmlns:aink="http://schemas.microsoft.com/office/drawing/2016/ink" xmlns:am3d="http://schemas.microsoft.com/office/drawing/2017/model3d" xmlns:o="urn:schemas-microsoft-com:office:office" xmlns:oel="http://schemas.microsoft.com/office/2019/extlst" xmlns:r="http://schemas.openxmlformats.org/officeDocument/2006/relationships" xmlns:m="http://schemas.openxmlformats.org/officeDocument/2006/math" xmlns:v="urn:schemas-microsoft-com:vml" xmlns:wp14="http://schemas.microsoft.com/office/word/2010/wordprocessingDrawing" xmlns:wp="http://schemas.openxmlformats.org/drawingml/2006/wordprocessingDrawing" xmlns:w10="urn:schemas-microsoft-com:office:word" xmlns:w="http://schemas.openxmlformats.org/wordprocessingml/2006/main" xmlns:w14="http://schemas.microsoft.com/office/word/2010/wordml" xmlns:w15="http://schemas.microsoft.com/office/word/2012/wordml" xmlns:w16cex="http://schemas.microsoft.com/office/word/2018/wordml/cex" xmlns:w16cid="http://schemas.microsoft.com/office/word/2016/wordml/cid" xmlns:w16="http://schemas.microsoft.com/office/word/2018/wordml" xmlns:w16du="http://schemas.microsoft.com/office/word/2023/wordml/word16du" xmlns:w16sdtdh="http://schemas.microsoft.com/office/word/2020/wordml/sdtdatahash" xmlns:w16sdtfl="http://schemas.microsoft.com/office/word/2024/wordml/sdtformatlock" xmlns:w16se="http://schemas.microsoft.com/office/word/2015/wordml/symex" xmlns:wpg="http://schemas.microsoft.com/office/word/2010/wordprocessingGroup" xmlns:wpi="http://schemas.microsoft.com/office/word/2010/wordprocessingInk" xmlns:wne="http://schemas.microsoft.com/office/word/2006/wordml" xmlns:wps="http://schemas.microsoft.com/office/word/2010/wordprocessingShape" mc:Ignorable="w14 w15 w16se w16cid w16 w16cex w16sdtdh w16sdtfl w16du wp14">
+<w:hdr xmlns:wpc="http://schemas.microsoft.com/office/word/2010/wordprocessingCanvas" xmlns:cx="http://schemas.microsoft.com/office/drawing/2014/chartex" xmlns:cx1="http://schemas.microsoft.com/office/drawing/2015/9/8/chartex" xmlns:mc="http://schemas.openxmlformats.org/markup-compatibility/2006" xmlns:o="urn:schemas-microsoft-com:office:office" xmlns:r="http://schemas.openxmlformats.org/officeDocument/2006/relationships" xmlns:m="http://schemas.openxmlformats.org/officeDocument/2006/math" xmlns:v="urn:schemas-microsoft-com:vml" xmlns:wp14="http://schemas.microsoft.com/office/word/2010/wordprocessingDrawing" xmlns:wp="http://schemas.openxmlformats.org/drawingml/2006/wordprocessingDrawing" xmlns:w10="urn:schemas-microsoft-com:office:word" xmlns:w="http://schemas.openxmlformats.org/wordprocessingml/2006/main" xmlns:w14="http://schemas.microsoft.com/office/word/2010/wordml" xmlns:w15="http://schemas.microsoft.com/office/word/2012/wordml" xmlns:w16se="http://schemas.microsoft.com/office/word/2015/wordml/symex" xmlns:wpg="http://schemas.microsoft.com/office/word/2010/wordprocessingGroup" xmlns:wpi="http://schemas.microsoft.com/office/word/2010/wordprocessingInk" xmlns:wne="http://schemas.microsoft.com/office/word/2006/wordml" xmlns:wps="http://schemas.microsoft.com/office/word/2010/wordprocessingShape" mc:Ignorable="w14 w15 w16se wp14">
   <w:p>
     <w:pPr>
       <w:spacing w:after="0" w:line="259" w:lineRule="auto"/>
@@ -5295,7 +6320,7 @@
 </file>
 
 <file path=word/header5.xml><?xml version="1.0" encoding="utf-8"?>
-<w:hdr xmlns:wpc="http://schemas.microsoft.com/office/word/2010/wordprocessingCanvas" xmlns:cx="http://schemas.microsoft.com/office/drawing/2014/chartex" xmlns:cx1="http://schemas.microsoft.com/office/drawing/2015/9/8/chartex" xmlns:cx2="http://schemas.microsoft.com/office/drawing/2015/10/21/chartex" xmlns:cx3="http://schemas.microsoft.com/office/drawing/2016/5/9/chartex" xmlns:cx4="http://schemas.microsoft.com/office/drawing/2016/5/10/chartex" xmlns:cx5="http://schemas.microsoft.com/office/drawing/2016/5/11/chartex" xmlns:cx6="http://schemas.microsoft.com/office/drawing/2016/5/12/chartex" xmlns:cx7="http://schemas.microsoft.com/office/drawing/2016/5/13/chartex" xmlns:cx8="http://schemas.microsoft.com/office/drawing/2016/5/14/chartex" xmlns:mc="http://schemas.openxmlformats.org/markup-compatibility/2006" xmlns:aink="http://schemas.microsoft.com/office/drawing/2016/ink" xmlns:am3d="http://schemas.microsoft.com/office/drawing/2017/model3d" xmlns:o="urn:schemas-microsoft-com:office:office" xmlns:oel="http://schemas.microsoft.com/office/2019/extlst" xmlns:r="http://schemas.openxmlformats.org/officeDocument/2006/relationships" xmlns:m="http://schemas.openxmlformats.org/officeDocument/2006/math" xmlns:v="urn:schemas-microsoft-com:vml" xmlns:wp14="http://schemas.microsoft.com/office/word/2010/wordprocessingDrawing" xmlns:wp="http://schemas.openxmlformats.org/drawingml/2006/wordprocessingDrawing" xmlns:w10="urn:schemas-microsoft-com:office:word" xmlns:w="http://schemas.openxmlformats.org/wordprocessingml/2006/main" xmlns:w14="http://schemas.microsoft.com/office/word/2010/wordml" xmlns:w15="http://schemas.microsoft.com/office/word/2012/wordml" xmlns:w16cex="http://schemas.microsoft.com/office/word/2018/wordml/cex" xmlns:w16cid="http://schemas.microsoft.com/office/word/2016/wordml/cid" xmlns:w16="http://schemas.microsoft.com/office/word/2018/wordml" xmlns:w16du="http://schemas.microsoft.com/office/word/2023/wordml/word16du" xmlns:w16sdtdh="http://schemas.microsoft.com/office/word/2020/wordml/sdtdatahash" xmlns:w16sdtfl="http://schemas.microsoft.com/office/word/2024/wordml/sdtformatlock" xmlns:w16se="http://schemas.microsoft.com/office/word/2015/wordml/symex" xmlns:wpg="http://schemas.microsoft.com/office/word/2010/wordprocessingGroup" xmlns:wpi="http://schemas.microsoft.com/office/word/2010/wordprocessingInk" xmlns:wne="http://schemas.microsoft.com/office/word/2006/wordml" xmlns:wps="http://schemas.microsoft.com/office/word/2010/wordprocessingShape" mc:Ignorable="w14 w15 w16se w16cid w16 w16cex w16sdtdh w16sdtfl w16du wp14">
+<w:hdr xmlns:wpc="http://schemas.microsoft.com/office/word/2010/wordprocessingCanvas" xmlns:cx="http://schemas.microsoft.com/office/drawing/2014/chartex" xmlns:cx1="http://schemas.microsoft.com/office/drawing/2015/9/8/chartex" xmlns:mc="http://schemas.openxmlformats.org/markup-compatibility/2006" xmlns:o="urn:schemas-microsoft-com:office:office" xmlns:r="http://schemas.openxmlformats.org/officeDocument/2006/relationships" xmlns:m="http://schemas.openxmlformats.org/officeDocument/2006/math" xmlns:v="urn:schemas-microsoft-com:vml" xmlns:wp14="http://schemas.microsoft.com/office/word/2010/wordprocessingDrawing" xmlns:wp="http://schemas.openxmlformats.org/drawingml/2006/wordprocessingDrawing" xmlns:w10="urn:schemas-microsoft-com:office:word" xmlns:w="http://schemas.openxmlformats.org/wordprocessingml/2006/main" xmlns:w14="http://schemas.microsoft.com/office/word/2010/wordml" xmlns:w15="http://schemas.microsoft.com/office/word/2012/wordml" xmlns:w16se="http://schemas.microsoft.com/office/word/2015/wordml/symex" xmlns:wpg="http://schemas.microsoft.com/office/word/2010/wordprocessingGroup" xmlns:wpi="http://schemas.microsoft.com/office/word/2010/wordprocessingInk" xmlns:wne="http://schemas.microsoft.com/office/word/2006/wordml" xmlns:wps="http://schemas.microsoft.com/office/word/2010/wordprocessingShape" mc:Ignorable="w14 w15 w16se wp14">
   <w:p>
     <w:pPr>
       <w:spacing w:after="0" w:line="259" w:lineRule="auto"/>
@@ -5307,7 +6332,7 @@
 </file>
 
 <file path=word/header6.xml><?xml version="1.0" encoding="utf-8"?>
-<w:hdr xmlns:wpc="http://schemas.microsoft.com/office/word/2010/wordprocessingCanvas" xmlns:cx="http://schemas.microsoft.com/office/drawing/2014/chartex" xmlns:cx1="http://schemas.microsoft.com/office/drawing/2015/9/8/chartex" xmlns:cx2="http://schemas.microsoft.com/office/drawing/2015/10/21/chartex" xmlns:cx3="http://schemas.microsoft.com/office/drawing/2016/5/9/chartex" xmlns:cx4="http://schemas.microsoft.com/office/drawing/2016/5/10/chartex" xmlns:cx5="http://schemas.microsoft.com/office/drawing/2016/5/11/chartex" xmlns:cx6="http://schemas.microsoft.com/office/drawing/2016/5/12/chartex" xmlns:cx7="http://schemas.microsoft.com/office/drawing/2016/5/13/chartex" xmlns:cx8="http://schemas.microsoft.com/office/drawing/2016/5/14/chartex" xmlns:mc="http://schemas.openxmlformats.org/markup-compatibility/2006" xmlns:aink="http://schemas.microsoft.com/office/drawing/2016/ink" xmlns:am3d="http://schemas.microsoft.com/office/drawing/2017/model3d" xmlns:o="urn:schemas-microsoft-com:office:office" xmlns:oel="http://schemas.microsoft.com/office/2019/extlst" xmlns:r="http://schemas.openxmlformats.org/officeDocument/2006/relationships" xmlns:m="http://schemas.openxmlformats.org/officeDocument/2006/math" xmlns:v="urn:schemas-microsoft-com:vml" xmlns:wp14="http://schemas.microsoft.com/office/word/2010/wordprocessingDrawing" xmlns:wp="http://schemas.openxmlformats.org/drawingml/2006/wordprocessingDrawing" xmlns:w10="urn:schemas-microsoft-com:office:word" xmlns:w="http://schemas.openxmlformats.org/wordprocessingml/2006/main" xmlns:w14="http://schemas.microsoft.com/office/word/2010/wordml" xmlns:w15="http://schemas.microsoft.com/office/word/2012/wordml" xmlns:w16cex="http://schemas.microsoft.com/office/word/2018/wordml/cex" xmlns:w16cid="http://schemas.microsoft.com/office/word/2016/wordml/cid" xmlns:w16="http://schemas.microsoft.com/office/word/2018/wordml" xmlns:w16du="http://schemas.microsoft.com/office/word/2023/wordml/word16du" xmlns:w16sdtdh="http://schemas.microsoft.com/office/word/2020/wordml/sdtdatahash" xmlns:w16sdtfl="http://schemas.microsoft.com/office/word/2024/wordml/sdtformatlock" xmlns:w16se="http://schemas.microsoft.com/office/word/2015/wordml/symex" xmlns:wpg="http://schemas.microsoft.com/office/word/2010/wordprocessingGroup" xmlns:wpi="http://schemas.microsoft.com/office/word/2010/wordprocessingInk" xmlns:wne="http://schemas.microsoft.com/office/word/2006/wordml" xmlns:wps="http://schemas.microsoft.com/office/word/2010/wordprocessingShape" mc:Ignorable="w14 w15 w16se w16cid w16 w16cex w16sdtdh w16sdtfl w16du wp14">
+<w:hdr xmlns:wpc="http://schemas.microsoft.com/office/word/2010/wordprocessingCanvas" xmlns:cx="http://schemas.microsoft.com/office/drawing/2014/chartex" xmlns:cx1="http://schemas.microsoft.com/office/drawing/2015/9/8/chartex" xmlns:mc="http://schemas.openxmlformats.org/markup-compatibility/2006" xmlns:o="urn:schemas-microsoft-com:office:office" xmlns:r="http://schemas.openxmlformats.org/officeDocument/2006/relationships" xmlns:m="http://schemas.openxmlformats.org/officeDocument/2006/math" xmlns:v="urn:schemas-microsoft-com:vml" xmlns:wp14="http://schemas.microsoft.com/office/word/2010/wordprocessingDrawing" xmlns:wp="http://schemas.openxmlformats.org/drawingml/2006/wordprocessingDrawing" xmlns:w10="urn:schemas-microsoft-com:office:word" xmlns:w="http://schemas.openxmlformats.org/wordprocessingml/2006/main" xmlns:w14="http://schemas.microsoft.com/office/word/2010/wordml" xmlns:w15="http://schemas.microsoft.com/office/word/2012/wordml" xmlns:w16se="http://schemas.microsoft.com/office/word/2015/wordml/symex" xmlns:wpg="http://schemas.microsoft.com/office/word/2010/wordprocessingGroup" xmlns:wpi="http://schemas.microsoft.com/office/word/2010/wordprocessingInk" xmlns:wne="http://schemas.microsoft.com/office/word/2006/wordml" xmlns:wps="http://schemas.microsoft.com/office/word/2010/wordprocessingShape" mc:Ignorable="w14 w15 w16se wp14">
   <w:p>
     <w:pPr>
       <w:spacing w:after="160" w:line="259" w:lineRule="auto"/>
@@ -5319,7 +6344,7 @@
 </file>
 
 <file path=word/header7.xml><?xml version="1.0" encoding="utf-8"?>
-<w:hdr xmlns:wpc="http://schemas.microsoft.com/office/word/2010/wordprocessingCanvas" xmlns:cx="http://schemas.microsoft.com/office/drawing/2014/chartex" xmlns:cx1="http://schemas.microsoft.com/office/drawing/2015/9/8/chartex" xmlns:cx2="http://schemas.microsoft.com/office/drawing/2015/10/21/chartex" xmlns:cx3="http://schemas.microsoft.com/office/drawing/2016/5/9/chartex" xmlns:cx4="http://schemas.microsoft.com/office/drawing/2016/5/10/chartex" xmlns:cx5="http://schemas.microsoft.com/office/drawing/2016/5/11/chartex" xmlns:cx6="http://schemas.microsoft.com/office/drawing/2016/5/12/chartex" xmlns:cx7="http://schemas.microsoft.com/office/drawing/2016/5/13/chartex" xmlns:cx8="http://schemas.microsoft.com/office/drawing/2016/5/14/chartex" xmlns:mc="http://schemas.openxmlformats.org/markup-compatibility/2006" xmlns:aink="http://schemas.microsoft.com/office/drawing/2016/ink" xmlns:am3d="http://schemas.microsoft.com/office/drawing/2017/model3d" xmlns:o="urn:schemas-microsoft-com:office:office" xmlns:oel="http://schemas.microsoft.com/office/2019/extlst" xmlns:r="http://schemas.openxmlformats.org/officeDocument/2006/relationships" xmlns:m="http://schemas.openxmlformats.org/officeDocument/2006/math" xmlns:v="urn:schemas-microsoft-com:vml" xmlns:wp14="http://schemas.microsoft.com/office/word/2010/wordprocessingDrawing" xmlns:wp="http://schemas.openxmlformats.org/drawingml/2006/wordprocessingDrawing" xmlns:w10="urn:schemas-microsoft-com:office:word" xmlns:w="http://schemas.openxmlformats.org/wordprocessingml/2006/main" xmlns:w14="http://schemas.microsoft.com/office/word/2010/wordml" xmlns:w15="http://schemas.microsoft.com/office/word/2012/wordml" xmlns:w16cex="http://schemas.microsoft.com/office/word/2018/wordml/cex" xmlns:w16cid="http://schemas.microsoft.com/office/word/2016/wordml/cid" xmlns:w16="http://schemas.microsoft.com/office/word/2018/wordml" xmlns:w16du="http://schemas.microsoft.com/office/word/2023/wordml/word16du" xmlns:w16sdtdh="http://schemas.microsoft.com/office/word/2020/wordml/sdtdatahash" xmlns:w16sdtfl="http://schemas.microsoft.com/office/word/2024/wordml/sdtformatlock" xmlns:w16se="http://schemas.microsoft.com/office/word/2015/wordml/symex" xmlns:wpg="http://schemas.microsoft.com/office/word/2010/wordprocessingGroup" xmlns:wpi="http://schemas.microsoft.com/office/word/2010/wordprocessingInk" xmlns:wne="http://schemas.microsoft.com/office/word/2006/wordml" xmlns:wps="http://schemas.microsoft.com/office/word/2010/wordprocessingShape" mc:Ignorable="w14 w15 w16se w16cid w16 w16cex w16sdtdh w16sdtfl w16du wp14">
+<w:hdr xmlns:wpc="http://schemas.microsoft.com/office/word/2010/wordprocessingCanvas" xmlns:cx="http://schemas.microsoft.com/office/drawing/2014/chartex" xmlns:cx1="http://schemas.microsoft.com/office/drawing/2015/9/8/chartex" xmlns:mc="http://schemas.openxmlformats.org/markup-compatibility/2006" xmlns:o="urn:schemas-microsoft-com:office:office" xmlns:r="http://schemas.openxmlformats.org/officeDocument/2006/relationships" xmlns:m="http://schemas.openxmlformats.org/officeDocument/2006/math" xmlns:v="urn:schemas-microsoft-com:vml" xmlns:wp14="http://schemas.microsoft.com/office/word/2010/wordprocessingDrawing" xmlns:wp="http://schemas.openxmlformats.org/drawingml/2006/wordprocessingDrawing" xmlns:w10="urn:schemas-microsoft-com:office:word" xmlns:w="http://schemas.openxmlformats.org/wordprocessingml/2006/main" xmlns:w14="http://schemas.microsoft.com/office/word/2010/wordml" xmlns:w15="http://schemas.microsoft.com/office/word/2012/wordml" xmlns:w16se="http://schemas.microsoft.com/office/word/2015/wordml/symex" xmlns:wpg="http://schemas.microsoft.com/office/word/2010/wordprocessingGroup" xmlns:wpi="http://schemas.microsoft.com/office/word/2010/wordprocessingInk" xmlns:wne="http://schemas.microsoft.com/office/word/2006/wordml" xmlns:wps="http://schemas.microsoft.com/office/word/2010/wordprocessingShape" mc:Ignorable="w14 w15 w16se wp14">
   <w:p>
     <w:pPr>
       <w:spacing w:after="160" w:line="259" w:lineRule="auto"/>
@@ -5331,7 +6356,7 @@
 </file>
 
 <file path=word/header8.xml><?xml version="1.0" encoding="utf-8"?>
-<w:hdr xmlns:wpc="http://schemas.microsoft.com/office/word/2010/wordprocessingCanvas" xmlns:cx="http://schemas.microsoft.com/office/drawing/2014/chartex" xmlns:cx1="http://schemas.microsoft.com/office/drawing/2015/9/8/chartex" xmlns:cx2="http://schemas.microsoft.com/office/drawing/2015/10/21/chartex" xmlns:cx3="http://schemas.microsoft.com/office/drawing/2016/5/9/chartex" xmlns:cx4="http://schemas.microsoft.com/office/drawing/2016/5/10/chartex" xmlns:cx5="http://schemas.microsoft.com/office/drawing/2016/5/11/chartex" xmlns:cx6="http://schemas.microsoft.com/office/drawing/2016/5/12/chartex" xmlns:cx7="http://schemas.microsoft.com/office/drawing/2016/5/13/chartex" xmlns:cx8="http://schemas.microsoft.com/office/drawing/2016/5/14/chartex" xmlns:mc="http://schemas.openxmlformats.org/markup-compatibility/2006" xmlns:aink="http://schemas.microsoft.com/office/drawing/2016/ink" xmlns:am3d="http://schemas.microsoft.com/office/drawing/2017/model3d" xmlns:o="urn:schemas-microsoft-com:office:office" xmlns:oel="http://schemas.microsoft.com/office/2019/extlst" xmlns:r="http://schemas.openxmlformats.org/officeDocument/2006/relationships" xmlns:m="http://schemas.openxmlformats.org/officeDocument/2006/math" xmlns:v="urn:schemas-microsoft-com:vml" xmlns:wp14="http://schemas.microsoft.com/office/word/2010/wordprocessingDrawing" xmlns:wp="http://schemas.openxmlformats.org/drawingml/2006/wordprocessingDrawing" xmlns:w10="urn:schemas-microsoft-com:office:word" xmlns:w="http://schemas.openxmlformats.org/wordprocessingml/2006/main" xmlns:w14="http://schemas.microsoft.com/office/word/2010/wordml" xmlns:w15="http://schemas.microsoft.com/office/word/2012/wordml" xmlns:w16cex="http://schemas.microsoft.com/office/word/2018/wordml/cex" xmlns:w16cid="http://schemas.microsoft.com/office/word/2016/wordml/cid" xmlns:w16="http://schemas.microsoft.com/office/word/2018/wordml" xmlns:w16du="http://schemas.microsoft.com/office/word/2023/wordml/word16du" xmlns:w16sdtdh="http://schemas.microsoft.com/office/word/2020/wordml/sdtdatahash" xmlns:w16sdtfl="http://schemas.microsoft.com/office/word/2024/wordml/sdtformatlock" xmlns:w16se="http://schemas.microsoft.com/office/word/2015/wordml/symex" xmlns:wpg="http://schemas.microsoft.com/office/word/2010/wordprocessingGroup" xmlns:wpi="http://schemas.microsoft.com/office/word/2010/wordprocessingInk" xmlns:wne="http://schemas.microsoft.com/office/word/2006/wordml" xmlns:wps="http://schemas.microsoft.com/office/word/2010/wordprocessingShape" mc:Ignorable="w14 w15 w16se w16cid w16 w16cex w16sdtdh w16sdtfl w16du wp14">
+<w:hdr xmlns:wpc="http://schemas.microsoft.com/office/word/2010/wordprocessingCanvas" xmlns:cx="http://schemas.microsoft.com/office/drawing/2014/chartex" xmlns:cx1="http://schemas.microsoft.com/office/drawing/2015/9/8/chartex" xmlns:mc="http://schemas.openxmlformats.org/markup-compatibility/2006" xmlns:o="urn:schemas-microsoft-com:office:office" xmlns:r="http://schemas.openxmlformats.org/officeDocument/2006/relationships" xmlns:m="http://schemas.openxmlformats.org/officeDocument/2006/math" xmlns:v="urn:schemas-microsoft-com:vml" xmlns:wp14="http://schemas.microsoft.com/office/word/2010/wordprocessingDrawing" xmlns:wp="http://schemas.openxmlformats.org/drawingml/2006/wordprocessingDrawing" xmlns:w10="urn:schemas-microsoft-com:office:word" xmlns:w="http://schemas.openxmlformats.org/wordprocessingml/2006/main" xmlns:w14="http://schemas.microsoft.com/office/word/2010/wordml" xmlns:w15="http://schemas.microsoft.com/office/word/2012/wordml" xmlns:w16se="http://schemas.microsoft.com/office/word/2015/wordml/symex" xmlns:wpg="http://schemas.microsoft.com/office/word/2010/wordprocessingGroup" xmlns:wpi="http://schemas.microsoft.com/office/word/2010/wordprocessingInk" xmlns:wne="http://schemas.microsoft.com/office/word/2006/wordml" xmlns:wps="http://schemas.microsoft.com/office/word/2010/wordprocessingShape" mc:Ignorable="w14 w15 w16se wp14">
   <w:p>
     <w:pPr>
       <w:spacing w:after="160" w:line="259" w:lineRule="auto"/>
@@ -5343,7 +6368,7 @@
 </file>
 
 <file path=word/header9.xml><?xml version="1.0" encoding="utf-8"?>
-<w:hdr xmlns:wpc="http://schemas.microsoft.com/office/word/2010/wordprocessingCanvas" xmlns:cx="http://schemas.microsoft.com/office/drawing/2014/chartex" xmlns:cx1="http://schemas.microsoft.com/office/drawing/2015/9/8/chartex" xmlns:cx2="http://schemas.microsoft.com/office/drawing/2015/10/21/chartex" xmlns:cx3="http://schemas.microsoft.com/office/drawing/2016/5/9/chartex" xmlns:cx4="http://schemas.microsoft.com/office/drawing/2016/5/10/chartex" xmlns:cx5="http://schemas.microsoft.com/office/drawing/2016/5/11/chartex" xmlns:cx6="http://schemas.microsoft.com/office/drawing/2016/5/12/chartex" xmlns:cx7="http://schemas.microsoft.com/office/drawing/2016/5/13/chartex" xmlns:cx8="http://schemas.microsoft.com/office/drawing/2016/5/14/chartex" xmlns:mc="http://schemas.openxmlformats.org/markup-compatibility/2006" xmlns:aink="http://schemas.microsoft.com/office/drawing/2016/ink" xmlns:am3d="http://schemas.microsoft.com/office/drawing/2017/model3d" xmlns:o="urn:schemas-microsoft-com:office:office" xmlns:oel="http://schemas.microsoft.com/office/2019/extlst" xmlns:r="http://schemas.openxmlformats.org/officeDocument/2006/relationships" xmlns:m="http://schemas.openxmlformats.org/officeDocument/2006/math" xmlns:v="urn:schemas-microsoft-com:vml" xmlns:wp14="http://schemas.microsoft.com/office/word/2010/wordprocessingDrawing" xmlns:wp="http://schemas.openxmlformats.org/drawingml/2006/wordprocessingDrawing" xmlns:w10="urn:schemas-microsoft-com:office:word" xmlns:w="http://schemas.openxmlformats.org/wordprocessingml/2006/main" xmlns:w14="http://schemas.microsoft.com/office/word/2010/wordml" xmlns:w15="http://schemas.microsoft.com/office/word/2012/wordml" xmlns:w16cex="http://schemas.microsoft.com/office/word/2018/wordml/cex" xmlns:w16cid="http://schemas.microsoft.com/office/word/2016/wordml/cid" xmlns:w16="http://schemas.microsoft.com/office/word/2018/wordml" xmlns:w16du="http://schemas.microsoft.com/office/word/2023/wordml/word16du" xmlns:w16sdtdh="http://schemas.microsoft.com/office/word/2020/wordml/sdtdatahash" xmlns:w16sdtfl="http://schemas.microsoft.com/office/word/2024/wordml/sdtformatlock" xmlns:w16se="http://schemas.microsoft.com/office/word/2015/wordml/symex" xmlns:wpg="http://schemas.microsoft.com/office/word/2010/wordprocessingGroup" xmlns:wpi="http://schemas.microsoft.com/office/word/2010/wordprocessingInk" xmlns:wne="http://schemas.microsoft.com/office/word/2006/wordml" xmlns:wps="http://schemas.microsoft.com/office/word/2010/wordprocessingShape" mc:Ignorable="w14 w15 w16se w16cid w16 w16cex w16sdtdh w16sdtfl w16du wp14">
+<w:hdr xmlns:wpc="http://schemas.microsoft.com/office/word/2010/wordprocessingCanvas" xmlns:cx="http://schemas.microsoft.com/office/drawing/2014/chartex" xmlns:cx1="http://schemas.microsoft.com/office/drawing/2015/9/8/chartex" xmlns:mc="http://schemas.openxmlformats.org/markup-compatibility/2006" xmlns:o="urn:schemas-microsoft-com:office:office" xmlns:r="http://schemas.openxmlformats.org/officeDocument/2006/relationships" xmlns:m="http://schemas.openxmlformats.org/officeDocument/2006/math" xmlns:v="urn:schemas-microsoft-com:vml" xmlns:wp14="http://schemas.microsoft.com/office/word/2010/wordprocessingDrawing" xmlns:wp="http://schemas.openxmlformats.org/drawingml/2006/wordprocessingDrawing" xmlns:w10="urn:schemas-microsoft-com:office:word" xmlns:w="http://schemas.openxmlformats.org/wordprocessingml/2006/main" xmlns:w14="http://schemas.microsoft.com/office/word/2010/wordml" xmlns:w15="http://schemas.microsoft.com/office/word/2012/wordml" xmlns:w16se="http://schemas.microsoft.com/office/word/2015/wordml/symex" xmlns:wpg="http://schemas.microsoft.com/office/word/2010/wordprocessingGroup" xmlns:wpi="http://schemas.microsoft.com/office/word/2010/wordprocessingInk" xmlns:wne="http://schemas.microsoft.com/office/word/2006/wordml" xmlns:wps="http://schemas.microsoft.com/office/word/2010/wordprocessingShape" mc:Ignorable="w14 w15 w16se wp14">
   <w:p>
     <w:pPr>
       <w:spacing w:after="160" w:line="259" w:lineRule="auto"/>
@@ -5355,7 +6380,7 @@
 </file>
 
 <file path=word/numbering.xml><?xml version="1.0" encoding="utf-8"?>
-<w:numbering xmlns:wpc="http://schemas.microsoft.com/office/word/2010/wordprocessingCanvas" xmlns:cx="http://schemas.microsoft.com/office/drawing/2014/chartex" xmlns:cx1="http://schemas.microsoft.com/office/drawing/2015/9/8/chartex" xmlns:cx2="http://schemas.microsoft.com/office/drawing/2015/10/21/chartex" xmlns:cx3="http://schemas.microsoft.com/office/drawing/2016/5/9/chartex" xmlns:cx4="http://schemas.microsoft.com/office/drawing/2016/5/10/chartex" xmlns:cx5="http://schemas.microsoft.com/office/drawing/2016/5/11/chartex" xmlns:cx6="http://schemas.microsoft.com/office/drawing/2016/5/12/chartex" xmlns:cx7="http://schemas.microsoft.com/office/drawing/2016/5/13/chartex" xmlns:cx8="http://schemas.microsoft.com/office/drawing/2016/5/14/chartex" xmlns:mc="http://schemas.openxmlformats.org/markup-compatibility/2006" xmlns:aink="http://schemas.microsoft.com/office/drawing/2016/ink" xmlns:am3d="http://schemas.microsoft.com/office/drawing/2017/model3d" xmlns:o="urn:schemas-microsoft-com:office:office" xmlns:oel="http://schemas.microsoft.com/office/2019/extlst" xmlns:r="http://schemas.openxmlformats.org/officeDocument/2006/relationships" xmlns:m="http://schemas.openxmlformats.org/officeDocument/2006/math" xmlns:v="urn:schemas-microsoft-com:vml" xmlns:wp14="http://schemas.microsoft.com/office/word/2010/wordprocessingDrawing" xmlns:wp="http://schemas.openxmlformats.org/drawingml/2006/wordprocessingDrawing" xmlns:w10="urn:schemas-microsoft-com:office:word" xmlns:w="http://schemas.openxmlformats.org/wordprocessingml/2006/main" xmlns:w14="http://schemas.microsoft.com/office/word/2010/wordml" xmlns:w15="http://schemas.microsoft.com/office/word/2012/wordml" xmlns:w16cex="http://schemas.microsoft.com/office/word/2018/wordml/cex" xmlns:w16cid="http://schemas.microsoft.com/office/word/2016/wordml/cid" xmlns:w16="http://schemas.microsoft.com/office/word/2018/wordml" xmlns:w16du="http://schemas.microsoft.com/office/word/2023/wordml/word16du" xmlns:w16sdtdh="http://schemas.microsoft.com/office/word/2020/wordml/sdtdatahash" xmlns:w16sdtfl="http://schemas.microsoft.com/office/word/2024/wordml/sdtformatlock" xmlns:w16se="http://schemas.microsoft.com/office/word/2015/wordml/symex" xmlns:wpg="http://schemas.microsoft.com/office/word/2010/wordprocessingGroup" xmlns:wpi="http://schemas.microsoft.com/office/word/2010/wordprocessingInk" xmlns:wne="http://schemas.microsoft.com/office/word/2006/wordml" xmlns:wps="http://schemas.microsoft.com/office/word/2010/wordprocessingShape" mc:Ignorable="w14 w15 w16se w16cid w16 w16cex w16sdtdh w16sdtfl w16du wp14">
+<w:numbering xmlns:wpc="http://schemas.microsoft.com/office/word/2010/wordprocessingCanvas" xmlns:cx="http://schemas.microsoft.com/office/drawing/2014/chartex" xmlns:cx1="http://schemas.microsoft.com/office/drawing/2015/9/8/chartex" xmlns:mc="http://schemas.openxmlformats.org/markup-compatibility/2006" xmlns:o="urn:schemas-microsoft-com:office:office" xmlns:r="http://schemas.openxmlformats.org/officeDocument/2006/relationships" xmlns:m="http://schemas.openxmlformats.org/officeDocument/2006/math" xmlns:v="urn:schemas-microsoft-com:vml" xmlns:wp14="http://schemas.microsoft.com/office/word/2010/wordprocessingDrawing" xmlns:wp="http://schemas.openxmlformats.org/drawingml/2006/wordprocessingDrawing" xmlns:w10="urn:schemas-microsoft-com:office:word" xmlns:w="http://schemas.openxmlformats.org/wordprocessingml/2006/main" xmlns:w14="http://schemas.microsoft.com/office/word/2010/wordml" xmlns:w15="http://schemas.microsoft.com/office/word/2012/wordml" xmlns:w16se="http://schemas.microsoft.com/office/word/2015/wordml/symex" xmlns:wpg="http://schemas.microsoft.com/office/word/2010/wordprocessingGroup" xmlns:wpi="http://schemas.microsoft.com/office/word/2010/wordprocessingInk" xmlns:wne="http://schemas.microsoft.com/office/word/2006/wordml" xmlns:wps="http://schemas.microsoft.com/office/word/2010/wordprocessingShape" mc:Ignorable="w14 w15 w16se wp14">
   <w:abstractNum w:abstractNumId="0" w15:restartNumberingAfterBreak="0">
     <w:nsid w:val="009A54CA"/>
     <w:multiLevelType w:val="hybridMultilevel"/>
@@ -5470,6 +6495,218 @@
     </w:lvl>
   </w:abstractNum>
   <w:abstractNum w:abstractNumId="1" w15:restartNumberingAfterBreak="0">
+    <w:nsid w:val="04D4570D"/>
+    <w:multiLevelType w:val="hybridMultilevel"/>
+    <w:tmpl w:val="CFEC4250"/>
+    <w:lvl w:ilvl="0" w:tplc="98A0DA52">
+      <w:start w:val="1"/>
+      <w:numFmt w:val="bullet"/>
+      <w:lvlText w:val=""/>
+      <w:lvlJc w:val="left"/>
+      <w:pPr>
+        <w:ind w:left="719"/>
+      </w:pPr>
+      <w:rPr>
+        <w:rFonts w:ascii="Symbol" w:hAnsi="Symbol" w:hint="default"/>
+        <w:b w:val="0"/>
+        <w:i w:val="0"/>
+        <w:strike w:val="0"/>
+        <w:dstrike w:val="0"/>
+        <w:color w:val="000000"/>
+        <w:sz w:val="24"/>
+        <w:szCs w:val="24"/>
+        <w:u w:val="none" w:color="000000"/>
+        <w:bdr w:val="none" w:sz="0" w:space="0" w:color="auto"/>
+        <w:shd w:val="clear" w:color="auto" w:fill="auto"/>
+        <w:vertAlign w:val="baseline"/>
+      </w:rPr>
+    </w:lvl>
+    <w:lvl w:ilvl="1" w:tplc="04090001">
+      <w:start w:val="1"/>
+      <w:numFmt w:val="bullet"/>
+      <w:lvlText w:val=""/>
+      <w:lvlJc w:val="left"/>
+      <w:pPr>
+        <w:ind w:left="1454"/>
+      </w:pPr>
+      <w:rPr>
+        <w:rFonts w:ascii="Symbol" w:hAnsi="Symbol" w:hint="default"/>
+        <w:b w:val="0"/>
+        <w:i w:val="0"/>
+        <w:strike w:val="0"/>
+        <w:dstrike w:val="0"/>
+        <w:color w:val="000000"/>
+        <w:sz w:val="24"/>
+        <w:szCs w:val="24"/>
+        <w:u w:val="none" w:color="000000"/>
+        <w:bdr w:val="none" w:sz="0" w:space="0" w:color="auto"/>
+        <w:shd w:val="clear" w:color="auto" w:fill="auto"/>
+        <w:vertAlign w:val="baseline"/>
+      </w:rPr>
+    </w:lvl>
+    <w:lvl w:ilvl="2" w:tplc="6CBA8FDE">
+      <w:start w:val="1"/>
+      <w:numFmt w:val="bullet"/>
+      <w:lvlText w:val="▪"/>
+      <w:lvlJc w:val="left"/>
+      <w:pPr>
+        <w:ind w:left="2174"/>
+      </w:pPr>
+      <w:rPr>
+        <w:rFonts w:ascii="Courier New" w:eastAsia="Courier New" w:hAnsi="Courier New" w:cs="Courier New"/>
+        <w:b w:val="0"/>
+        <w:i w:val="0"/>
+        <w:strike w:val="0"/>
+        <w:dstrike w:val="0"/>
+        <w:color w:val="000000"/>
+        <w:sz w:val="24"/>
+        <w:szCs w:val="24"/>
+        <w:u w:val="none" w:color="000000"/>
+        <w:bdr w:val="none" w:sz="0" w:space="0" w:color="auto"/>
+        <w:shd w:val="clear" w:color="auto" w:fill="auto"/>
+        <w:vertAlign w:val="baseline"/>
+      </w:rPr>
+    </w:lvl>
+    <w:lvl w:ilvl="3" w:tplc="AED4876E">
+      <w:start w:val="1"/>
+      <w:numFmt w:val="bullet"/>
+      <w:lvlText w:val="•"/>
+      <w:lvlJc w:val="left"/>
+      <w:pPr>
+        <w:ind w:left="2894"/>
+      </w:pPr>
+      <w:rPr>
+        <w:rFonts w:ascii="Courier New" w:eastAsia="Courier New" w:hAnsi="Courier New" w:cs="Courier New"/>
+        <w:b w:val="0"/>
+        <w:i w:val="0"/>
+        <w:strike w:val="0"/>
+        <w:dstrike w:val="0"/>
+        <w:color w:val="000000"/>
+        <w:sz w:val="24"/>
+        <w:szCs w:val="24"/>
+        <w:u w:val="none" w:color="000000"/>
+        <w:bdr w:val="none" w:sz="0" w:space="0" w:color="auto"/>
+        <w:shd w:val="clear" w:color="auto" w:fill="auto"/>
+        <w:vertAlign w:val="baseline"/>
+      </w:rPr>
+    </w:lvl>
+    <w:lvl w:ilvl="4" w:tplc="0096E430">
+      <w:start w:val="1"/>
+      <w:numFmt w:val="bullet"/>
+      <w:lvlText w:val="o"/>
+      <w:lvlJc w:val="left"/>
+      <w:pPr>
+        <w:ind w:left="3614"/>
+      </w:pPr>
+      <w:rPr>
+        <w:rFonts w:ascii="Courier New" w:eastAsia="Courier New" w:hAnsi="Courier New" w:cs="Courier New"/>
+        <w:b w:val="0"/>
+        <w:i w:val="0"/>
+        <w:strike w:val="0"/>
+        <w:dstrike w:val="0"/>
+        <w:color w:val="000000"/>
+        <w:sz w:val="24"/>
+        <w:szCs w:val="24"/>
+        <w:u w:val="none" w:color="000000"/>
+        <w:bdr w:val="none" w:sz="0" w:space="0" w:color="auto"/>
+        <w:shd w:val="clear" w:color="auto" w:fill="auto"/>
+        <w:vertAlign w:val="baseline"/>
+      </w:rPr>
+    </w:lvl>
+    <w:lvl w:ilvl="5" w:tplc="95A6965A">
+      <w:start w:val="1"/>
+      <w:numFmt w:val="bullet"/>
+      <w:lvlText w:val="▪"/>
+      <w:lvlJc w:val="left"/>
+      <w:pPr>
+        <w:ind w:left="4334"/>
+      </w:pPr>
+      <w:rPr>
+        <w:rFonts w:ascii="Courier New" w:eastAsia="Courier New" w:hAnsi="Courier New" w:cs="Courier New"/>
+        <w:b w:val="0"/>
+        <w:i w:val="0"/>
+        <w:strike w:val="0"/>
+        <w:dstrike w:val="0"/>
+        <w:color w:val="000000"/>
+        <w:sz w:val="24"/>
+        <w:szCs w:val="24"/>
+        <w:u w:val="none" w:color="000000"/>
+        <w:bdr w:val="none" w:sz="0" w:space="0" w:color="auto"/>
+        <w:shd w:val="clear" w:color="auto" w:fill="auto"/>
+        <w:vertAlign w:val="baseline"/>
+      </w:rPr>
+    </w:lvl>
+    <w:lvl w:ilvl="6" w:tplc="89482CEA">
+      <w:start w:val="1"/>
+      <w:numFmt w:val="bullet"/>
+      <w:lvlText w:val="•"/>
+      <w:lvlJc w:val="left"/>
+      <w:pPr>
+        <w:ind w:left="5054"/>
+      </w:pPr>
+      <w:rPr>
+        <w:rFonts w:ascii="Courier New" w:eastAsia="Courier New" w:hAnsi="Courier New" w:cs="Courier New"/>
+        <w:b w:val="0"/>
+        <w:i w:val="0"/>
+        <w:strike w:val="0"/>
+        <w:dstrike w:val="0"/>
+        <w:color w:val="000000"/>
+        <w:sz w:val="24"/>
+        <w:szCs w:val="24"/>
+        <w:u w:val="none" w:color="000000"/>
+        <w:bdr w:val="none" w:sz="0" w:space="0" w:color="auto"/>
+        <w:shd w:val="clear" w:color="auto" w:fill="auto"/>
+        <w:vertAlign w:val="baseline"/>
+      </w:rPr>
+    </w:lvl>
+    <w:lvl w:ilvl="7" w:tplc="925C48C0">
+      <w:start w:val="1"/>
+      <w:numFmt w:val="bullet"/>
+      <w:lvlText w:val="o"/>
+      <w:lvlJc w:val="left"/>
+      <w:pPr>
+        <w:ind w:left="5774"/>
+      </w:pPr>
+      <w:rPr>
+        <w:rFonts w:ascii="Courier New" w:eastAsia="Courier New" w:hAnsi="Courier New" w:cs="Courier New"/>
+        <w:b w:val="0"/>
+        <w:i w:val="0"/>
+        <w:strike w:val="0"/>
+        <w:dstrike w:val="0"/>
+        <w:color w:val="000000"/>
+        <w:sz w:val="24"/>
+        <w:szCs w:val="24"/>
+        <w:u w:val="none" w:color="000000"/>
+        <w:bdr w:val="none" w:sz="0" w:space="0" w:color="auto"/>
+        <w:shd w:val="clear" w:color="auto" w:fill="auto"/>
+        <w:vertAlign w:val="baseline"/>
+      </w:rPr>
+    </w:lvl>
+    <w:lvl w:ilvl="8" w:tplc="62AE2DAE">
+      <w:start w:val="1"/>
+      <w:numFmt w:val="bullet"/>
+      <w:lvlText w:val="▪"/>
+      <w:lvlJc w:val="left"/>
+      <w:pPr>
+        <w:ind w:left="6494"/>
+      </w:pPr>
+      <w:rPr>
+        <w:rFonts w:ascii="Courier New" w:eastAsia="Courier New" w:hAnsi="Courier New" w:cs="Courier New"/>
+        <w:b w:val="0"/>
+        <w:i w:val="0"/>
+        <w:strike w:val="0"/>
+        <w:dstrike w:val="0"/>
+        <w:color w:val="000000"/>
+        <w:sz w:val="24"/>
+        <w:szCs w:val="24"/>
+        <w:u w:val="none" w:color="000000"/>
+        <w:bdr w:val="none" w:sz="0" w:space="0" w:color="auto"/>
+        <w:shd w:val="clear" w:color="auto" w:fill="auto"/>
+        <w:vertAlign w:val="baseline"/>
+      </w:rPr>
+    </w:lvl>
+  </w:abstractNum>
+  <w:abstractNum w:abstractNumId="2" w15:restartNumberingAfterBreak="0">
     <w:nsid w:val="06C84C03"/>
     <w:multiLevelType w:val="hybridMultilevel"/>
     <w:tmpl w:val="95CE6310"/>
@@ -5682,7 +6919,120 @@
       </w:rPr>
     </w:lvl>
   </w:abstractNum>
-  <w:abstractNum w:abstractNumId="2" w15:restartNumberingAfterBreak="0">
+  <w:abstractNum w:abstractNumId="3" w15:restartNumberingAfterBreak="0">
+    <w:nsid w:val="08F43450"/>
+    <w:multiLevelType w:val="hybridMultilevel"/>
+    <w:tmpl w:val="686A0A8C"/>
+    <w:lvl w:ilvl="0" w:tplc="04090001">
+      <w:start w:val="1"/>
+      <w:numFmt w:val="bullet"/>
+      <w:lvlText w:val=""/>
+      <w:lvlJc w:val="left"/>
+      <w:pPr>
+        <w:ind w:left="734" w:hanging="360"/>
+      </w:pPr>
+      <w:rPr>
+        <w:rFonts w:ascii="Symbol" w:hAnsi="Symbol" w:hint="default"/>
+      </w:rPr>
+    </w:lvl>
+    <w:lvl w:ilvl="1" w:tplc="04090003" w:tentative="1">
+      <w:start w:val="1"/>
+      <w:numFmt w:val="bullet"/>
+      <w:lvlText w:val="o"/>
+      <w:lvlJc w:val="left"/>
+      <w:pPr>
+        <w:ind w:left="1454" w:hanging="360"/>
+      </w:pPr>
+      <w:rPr>
+        <w:rFonts w:ascii="Courier New" w:hAnsi="Courier New" w:cs="Courier New" w:hint="default"/>
+      </w:rPr>
+    </w:lvl>
+    <w:lvl w:ilvl="2" w:tplc="04090005" w:tentative="1">
+      <w:start w:val="1"/>
+      <w:numFmt w:val="bullet"/>
+      <w:lvlText w:val=""/>
+      <w:lvlJc w:val="left"/>
+      <w:pPr>
+        <w:ind w:left="2174" w:hanging="360"/>
+      </w:pPr>
+      <w:rPr>
+        <w:rFonts w:ascii="Wingdings" w:hAnsi="Wingdings" w:hint="default"/>
+      </w:rPr>
+    </w:lvl>
+    <w:lvl w:ilvl="3" w:tplc="04090001" w:tentative="1">
+      <w:start w:val="1"/>
+      <w:numFmt w:val="bullet"/>
+      <w:lvlText w:val=""/>
+      <w:lvlJc w:val="left"/>
+      <w:pPr>
+        <w:ind w:left="2894" w:hanging="360"/>
+      </w:pPr>
+      <w:rPr>
+        <w:rFonts w:ascii="Symbol" w:hAnsi="Symbol" w:hint="default"/>
+      </w:rPr>
+    </w:lvl>
+    <w:lvl w:ilvl="4" w:tplc="04090003" w:tentative="1">
+      <w:start w:val="1"/>
+      <w:numFmt w:val="bullet"/>
+      <w:lvlText w:val="o"/>
+      <w:lvlJc w:val="left"/>
+      <w:pPr>
+        <w:ind w:left="3614" w:hanging="360"/>
+      </w:pPr>
+      <w:rPr>
+        <w:rFonts w:ascii="Courier New" w:hAnsi="Courier New" w:cs="Courier New" w:hint="default"/>
+      </w:rPr>
+    </w:lvl>
+    <w:lvl w:ilvl="5" w:tplc="04090005" w:tentative="1">
+      <w:start w:val="1"/>
+      <w:numFmt w:val="bullet"/>
+      <w:lvlText w:val=""/>
+      <w:lvlJc w:val="left"/>
+      <w:pPr>
+        <w:ind w:left="4334" w:hanging="360"/>
+      </w:pPr>
+      <w:rPr>
+        <w:rFonts w:ascii="Wingdings" w:hAnsi="Wingdings" w:hint="default"/>
+      </w:rPr>
+    </w:lvl>
+    <w:lvl w:ilvl="6" w:tplc="04090001" w:tentative="1">
+      <w:start w:val="1"/>
+      <w:numFmt w:val="bullet"/>
+      <w:lvlText w:val=""/>
+      <w:lvlJc w:val="left"/>
+      <w:pPr>
+        <w:ind w:left="5054" w:hanging="360"/>
+      </w:pPr>
+      <w:rPr>
+        <w:rFonts w:ascii="Symbol" w:hAnsi="Symbol" w:hint="default"/>
+      </w:rPr>
+    </w:lvl>
+    <w:lvl w:ilvl="7" w:tplc="04090003" w:tentative="1">
+      <w:start w:val="1"/>
+      <w:numFmt w:val="bullet"/>
+      <w:lvlText w:val="o"/>
+      <w:lvlJc w:val="left"/>
+      <w:pPr>
+        <w:ind w:left="5774" w:hanging="360"/>
+      </w:pPr>
+      <w:rPr>
+        <w:rFonts w:ascii="Courier New" w:hAnsi="Courier New" w:cs="Courier New" w:hint="default"/>
+      </w:rPr>
+    </w:lvl>
+    <w:lvl w:ilvl="8" w:tplc="04090005" w:tentative="1">
+      <w:start w:val="1"/>
+      <w:numFmt w:val="bullet"/>
+      <w:lvlText w:val=""/>
+      <w:lvlJc w:val="left"/>
+      <w:pPr>
+        <w:ind w:left="6494" w:hanging="360"/>
+      </w:pPr>
+      <w:rPr>
+        <w:rFonts w:ascii="Wingdings" w:hAnsi="Wingdings" w:hint="default"/>
+      </w:rPr>
+    </w:lvl>
+  </w:abstractNum>
+  <w:abstractNum w:abstractNumId="4" w15:restartNumberingAfterBreak="0">
     <w:nsid w:val="09D8565D"/>
     <w:multiLevelType w:val="hybridMultilevel"/>
     <w:tmpl w:val="DF86AE86"/>
@@ -5894,7 +7244,7 @@
       </w:rPr>
     </w:lvl>
   </w:abstractNum>
-  <w:abstractNum w:abstractNumId="3" w15:restartNumberingAfterBreak="0">
+  <w:abstractNum w:abstractNumId="5" w15:restartNumberingAfterBreak="0">
     <w:nsid w:val="0DBC1F7A"/>
     <w:multiLevelType w:val="hybridMultilevel"/>
     <w:tmpl w:val="87A67DEC"/>
@@ -6106,7 +7456,7 @@
       </w:rPr>
     </w:lvl>
   </w:abstractNum>
-  <w:abstractNum w:abstractNumId="4" w15:restartNumberingAfterBreak="0">
+  <w:abstractNum w:abstractNumId="6" w15:restartNumberingAfterBreak="0">
     <w:nsid w:val="0FC9392D"/>
     <w:multiLevelType w:val="hybridMultilevel"/>
     <w:tmpl w:val="5D4A66BA"/>
@@ -6219,7 +7569,7 @@
       </w:rPr>
     </w:lvl>
   </w:abstractNum>
-  <w:abstractNum w:abstractNumId="5" w15:restartNumberingAfterBreak="0">
+  <w:abstractNum w:abstractNumId="7" w15:restartNumberingAfterBreak="0">
     <w:nsid w:val="169A5573"/>
     <w:multiLevelType w:val="hybridMultilevel"/>
     <w:tmpl w:val="DEAE7BEA"/>
@@ -6431,7 +7781,7 @@
       </w:rPr>
     </w:lvl>
   </w:abstractNum>
-  <w:abstractNum w:abstractNumId="6" w15:restartNumberingAfterBreak="0">
+  <w:abstractNum w:abstractNumId="8" w15:restartNumberingAfterBreak="0">
     <w:nsid w:val="16E57F4B"/>
     <w:multiLevelType w:val="hybridMultilevel"/>
     <w:tmpl w:val="459A86E8"/>
@@ -6643,7 +7993,7 @@
       </w:rPr>
     </w:lvl>
   </w:abstractNum>
-  <w:abstractNum w:abstractNumId="7" w15:restartNumberingAfterBreak="0">
+  <w:abstractNum w:abstractNumId="9" w15:restartNumberingAfterBreak="0">
     <w:nsid w:val="17C16E12"/>
     <w:multiLevelType w:val="hybridMultilevel"/>
     <w:tmpl w:val="D52EE72A"/>
@@ -6756,7 +8106,7 @@
       </w:rPr>
     </w:lvl>
   </w:abstractNum>
-  <w:abstractNum w:abstractNumId="8" w15:restartNumberingAfterBreak="0">
+  <w:abstractNum w:abstractNumId="10" w15:restartNumberingAfterBreak="0">
     <w:nsid w:val="251C6689"/>
     <w:multiLevelType w:val="hybridMultilevel"/>
     <w:tmpl w:val="BCEC2F72"/>
@@ -6880,7 +8230,7 @@
       </w:rPr>
     </w:lvl>
   </w:abstractNum>
-  <w:abstractNum w:abstractNumId="9" w15:restartNumberingAfterBreak="0">
+  <w:abstractNum w:abstractNumId="11" w15:restartNumberingAfterBreak="0">
     <w:nsid w:val="2E2B7002"/>
     <w:multiLevelType w:val="hybridMultilevel"/>
     <w:tmpl w:val="8A58BB60"/>
@@ -6993,7 +8343,7 @@
       </w:rPr>
     </w:lvl>
   </w:abstractNum>
-  <w:abstractNum w:abstractNumId="10" w15:restartNumberingAfterBreak="0">
+  <w:abstractNum w:abstractNumId="12" w15:restartNumberingAfterBreak="0">
     <w:nsid w:val="2E3A10EB"/>
     <w:multiLevelType w:val="hybridMultilevel"/>
     <w:tmpl w:val="7B387EB6"/>
@@ -7206,7 +8556,7 @@
       </w:rPr>
     </w:lvl>
   </w:abstractNum>
-  <w:abstractNum w:abstractNumId="11" w15:restartNumberingAfterBreak="0">
+  <w:abstractNum w:abstractNumId="13" w15:restartNumberingAfterBreak="0">
     <w:nsid w:val="2F4F1B48"/>
     <w:multiLevelType w:val="hybridMultilevel"/>
     <w:tmpl w:val="8C4A76D6"/>
@@ -7319,7 +8669,120 @@
       </w:rPr>
     </w:lvl>
   </w:abstractNum>
-  <w:abstractNum w:abstractNumId="12" w15:restartNumberingAfterBreak="0">
+  <w:abstractNum w:abstractNumId="14" w15:restartNumberingAfterBreak="0">
+    <w:nsid w:val="35C2112E"/>
+    <w:multiLevelType w:val="hybridMultilevel"/>
+    <w:tmpl w:val="6C44FA00"/>
+    <w:lvl w:ilvl="0" w:tplc="04090001">
+      <w:start w:val="1"/>
+      <w:numFmt w:val="bullet"/>
+      <w:lvlText w:val=""/>
+      <w:lvlJc w:val="left"/>
+      <w:pPr>
+        <w:ind w:left="720" w:hanging="360"/>
+      </w:pPr>
+      <w:rPr>
+        <w:rFonts w:ascii="Symbol" w:hAnsi="Symbol" w:hint="default"/>
+      </w:rPr>
+    </w:lvl>
+    <w:lvl w:ilvl="1" w:tplc="04090003" w:tentative="1">
+      <w:start w:val="1"/>
+      <w:numFmt w:val="bullet"/>
+      <w:lvlText w:val="o"/>
+      <w:lvlJc w:val="left"/>
+      <w:pPr>
+        <w:ind w:left="1440" w:hanging="360"/>
+      </w:pPr>
+      <w:rPr>
+        <w:rFonts w:ascii="Courier New" w:hAnsi="Courier New" w:cs="Courier New" w:hint="default"/>
+      </w:rPr>
+    </w:lvl>
+    <w:lvl w:ilvl="2" w:tplc="04090005" w:tentative="1">
+      <w:start w:val="1"/>
+      <w:numFmt w:val="bullet"/>
+      <w:lvlText w:val=""/>
+      <w:lvlJc w:val="left"/>
+      <w:pPr>
+        <w:ind w:left="2160" w:hanging="360"/>
+      </w:pPr>
+      <w:rPr>
+        <w:rFonts w:ascii="Wingdings" w:hAnsi="Wingdings" w:hint="default"/>
+      </w:rPr>
+    </w:lvl>
+    <w:lvl w:ilvl="3" w:tplc="04090001" w:tentative="1">
+      <w:start w:val="1"/>
+      <w:numFmt w:val="bullet"/>
+      <w:lvlText w:val=""/>
+      <w:lvlJc w:val="left"/>
+      <w:pPr>
+        <w:ind w:left="2880" w:hanging="360"/>
+      </w:pPr>
+      <w:rPr>
+        <w:rFonts w:ascii="Symbol" w:hAnsi="Symbol" w:hint="default"/>
+      </w:rPr>
+    </w:lvl>
+    <w:lvl w:ilvl="4" w:tplc="04090003" w:tentative="1">
+      <w:start w:val="1"/>
+      <w:numFmt w:val="bullet"/>
+      <w:lvlText w:val="o"/>
+      <w:lvlJc w:val="left"/>
+      <w:pPr>
+        <w:ind w:left="3600" w:hanging="360"/>
+      </w:pPr>
+      <w:rPr>
+        <w:rFonts w:ascii="Courier New" w:hAnsi="Courier New" w:cs="Courier New" w:hint="default"/>
+      </w:rPr>
+    </w:lvl>
+    <w:lvl w:ilvl="5" w:tplc="04090005" w:tentative="1">
+      <w:start w:val="1"/>
+      <w:numFmt w:val="bullet"/>
+      <w:lvlText w:val=""/>
+      <w:lvlJc w:val="left"/>
+      <w:pPr>
+        <w:ind w:left="4320" w:hanging="360"/>
+      </w:pPr>
+      <w:rPr>
+        <w:rFonts w:ascii="Wingdings" w:hAnsi="Wingdings" w:hint="default"/>
+      </w:rPr>
+    </w:lvl>
+    <w:lvl w:ilvl="6" w:tplc="04090001" w:tentative="1">
+      <w:start w:val="1"/>
+      <w:numFmt w:val="bullet"/>
+      <w:lvlText w:val=""/>
+      <w:lvlJc w:val="left"/>
+      <w:pPr>
+        <w:ind w:left="5040" w:hanging="360"/>
+      </w:pPr>
+      <w:rPr>
+        <w:rFonts w:ascii="Symbol" w:hAnsi="Symbol" w:hint="default"/>
+      </w:rPr>
+    </w:lvl>
+    <w:lvl w:ilvl="7" w:tplc="04090003" w:tentative="1">
+      <w:start w:val="1"/>
+      <w:numFmt w:val="bullet"/>
+      <w:lvlText w:val="o"/>
+      <w:lvlJc w:val="left"/>
+      <w:pPr>
+        <w:ind w:left="5760" w:hanging="360"/>
+      </w:pPr>
+      <w:rPr>
+        <w:rFonts w:ascii="Courier New" w:hAnsi="Courier New" w:cs="Courier New" w:hint="default"/>
+      </w:rPr>
+    </w:lvl>
+    <w:lvl w:ilvl="8" w:tplc="04090005" w:tentative="1">
+      <w:start w:val="1"/>
+      <w:numFmt w:val="bullet"/>
+      <w:lvlText w:val=""/>
+      <w:lvlJc w:val="left"/>
+      <w:pPr>
+        <w:ind w:left="6480" w:hanging="360"/>
+      </w:pPr>
+      <w:rPr>
+        <w:rFonts w:ascii="Wingdings" w:hAnsi="Wingdings" w:hint="default"/>
+      </w:rPr>
+    </w:lvl>
+  </w:abstractNum>
+  <w:abstractNum w:abstractNumId="15" w15:restartNumberingAfterBreak="0">
     <w:nsid w:val="44C455AC"/>
     <w:multiLevelType w:val="hybridMultilevel"/>
     <w:tmpl w:val="C60A1764"/>
@@ -7432,7 +8895,7 @@
       </w:rPr>
     </w:lvl>
   </w:abstractNum>
-  <w:abstractNum w:abstractNumId="13" w15:restartNumberingAfterBreak="0">
+  <w:abstractNum w:abstractNumId="16" w15:restartNumberingAfterBreak="0">
     <w:nsid w:val="48DE30AD"/>
     <w:multiLevelType w:val="hybridMultilevel"/>
     <w:tmpl w:val="7688C8EA"/>
@@ -7545,7 +9008,7 @@
       </w:rPr>
     </w:lvl>
   </w:abstractNum>
-  <w:abstractNum w:abstractNumId="14" w15:restartNumberingAfterBreak="0">
+  <w:abstractNum w:abstractNumId="17" w15:restartNumberingAfterBreak="0">
     <w:nsid w:val="4E1E2C4D"/>
     <w:multiLevelType w:val="hybridMultilevel"/>
     <w:tmpl w:val="68C85F62"/>
@@ -7757,7 +9220,7 @@
       </w:rPr>
     </w:lvl>
   </w:abstractNum>
-  <w:abstractNum w:abstractNumId="15" w15:restartNumberingAfterBreak="0">
+  <w:abstractNum w:abstractNumId="18" w15:restartNumberingAfterBreak="0">
     <w:nsid w:val="51B43C06"/>
     <w:multiLevelType w:val="hybridMultilevel"/>
     <w:tmpl w:val="C806179A"/>
@@ -7970,7 +9433,96 @@
       </w:rPr>
     </w:lvl>
   </w:abstractNum>
-  <w:abstractNum w:abstractNumId="16" w15:restartNumberingAfterBreak="0">
+  <w:abstractNum w:abstractNumId="19" w15:restartNumberingAfterBreak="0">
+    <w:nsid w:val="54766763"/>
+    <w:multiLevelType w:val="hybridMultilevel"/>
+    <w:tmpl w:val="12E650EA"/>
+    <w:lvl w:ilvl="0" w:tplc="04090001">
+      <w:start w:val="1"/>
+      <w:numFmt w:val="bullet"/>
+      <w:lvlText w:val=""/>
+      <w:lvlJc w:val="left"/>
+      <w:pPr>
+        <w:ind w:left="720" w:hanging="360"/>
+      </w:pPr>
+      <w:rPr>
+        <w:rFonts w:ascii="Symbol" w:hAnsi="Symbol" w:hint="default"/>
+      </w:rPr>
+    </w:lvl>
+    <w:lvl w:ilvl="1" w:tplc="04090019" w:tentative="1">
+      <w:start w:val="1"/>
+      <w:numFmt w:val="lowerLetter"/>
+      <w:lvlText w:val="%2."/>
+      <w:lvlJc w:val="left"/>
+      <w:pPr>
+        <w:ind w:left="1440" w:hanging="360"/>
+      </w:pPr>
+    </w:lvl>
+    <w:lvl w:ilvl="2" w:tplc="0409001B" w:tentative="1">
+      <w:start w:val="1"/>
+      <w:numFmt w:val="lowerRoman"/>
+      <w:lvlText w:val="%3."/>
+      <w:lvlJc w:val="right"/>
+      <w:pPr>
+        <w:ind w:left="2160" w:hanging="180"/>
+      </w:pPr>
+    </w:lvl>
+    <w:lvl w:ilvl="3" w:tplc="0409000F" w:tentative="1">
+      <w:start w:val="1"/>
+      <w:numFmt w:val="decimal"/>
+      <w:lvlText w:val="%4."/>
+      <w:lvlJc w:val="left"/>
+      <w:pPr>
+        <w:ind w:left="2880" w:hanging="360"/>
+      </w:pPr>
+    </w:lvl>
+    <w:lvl w:ilvl="4" w:tplc="04090019" w:tentative="1">
+      <w:start w:val="1"/>
+      <w:numFmt w:val="lowerLetter"/>
+      <w:lvlText w:val="%5."/>
+      <w:lvlJc w:val="left"/>
+      <w:pPr>
+        <w:ind w:left="3600" w:hanging="360"/>
+      </w:pPr>
+    </w:lvl>
+    <w:lvl w:ilvl="5" w:tplc="0409001B" w:tentative="1">
+      <w:start w:val="1"/>
+      <w:numFmt w:val="lowerRoman"/>
+      <w:lvlText w:val="%6."/>
+      <w:lvlJc w:val="right"/>
+      <w:pPr>
+        <w:ind w:left="4320" w:hanging="180"/>
+      </w:pPr>
+    </w:lvl>
+    <w:lvl w:ilvl="6" w:tplc="0409000F" w:tentative="1">
+      <w:start w:val="1"/>
+      <w:numFmt w:val="decimal"/>
+      <w:lvlText w:val="%7."/>
+      <w:lvlJc w:val="left"/>
+      <w:pPr>
+        <w:ind w:left="5040" w:hanging="360"/>
+      </w:pPr>
+    </w:lvl>
+    <w:lvl w:ilvl="7" w:tplc="04090019" w:tentative="1">
+      <w:start w:val="1"/>
+      <w:numFmt w:val="lowerLetter"/>
+      <w:lvlText w:val="%8."/>
+      <w:lvlJc w:val="left"/>
+      <w:pPr>
+        <w:ind w:left="5760" w:hanging="360"/>
+      </w:pPr>
+    </w:lvl>
+    <w:lvl w:ilvl="8" w:tplc="0409001B" w:tentative="1">
+      <w:start w:val="1"/>
+      <w:numFmt w:val="lowerRoman"/>
+      <w:lvlText w:val="%9."/>
+      <w:lvlJc w:val="right"/>
+      <w:pPr>
+        <w:ind w:left="6480" w:hanging="180"/>
+      </w:pPr>
+    </w:lvl>
+  </w:abstractNum>
+  <w:abstractNum w:abstractNumId="20" w15:restartNumberingAfterBreak="0">
     <w:nsid w:val="57AA4A70"/>
     <w:multiLevelType w:val="hybridMultilevel"/>
     <w:tmpl w:val="BAFC0CD6"/>
@@ -8083,7 +9635,7 @@
       </w:rPr>
     </w:lvl>
   </w:abstractNum>
-  <w:abstractNum w:abstractNumId="17" w15:restartNumberingAfterBreak="0">
+  <w:abstractNum w:abstractNumId="21" w15:restartNumberingAfterBreak="0">
     <w:nsid w:val="57D974C4"/>
     <w:multiLevelType w:val="hybridMultilevel"/>
     <w:tmpl w:val="9CF27DD6"/>
@@ -8296,7 +9848,7 @@
       </w:rPr>
     </w:lvl>
   </w:abstractNum>
-  <w:abstractNum w:abstractNumId="18" w15:restartNumberingAfterBreak="0">
+  <w:abstractNum w:abstractNumId="22" w15:restartNumberingAfterBreak="0">
     <w:nsid w:val="58935494"/>
     <w:multiLevelType w:val="hybridMultilevel"/>
     <w:tmpl w:val="E84C6A7C"/>
@@ -8409,7 +9961,219 @@
       </w:rPr>
     </w:lvl>
   </w:abstractNum>
-  <w:abstractNum w:abstractNumId="19" w15:restartNumberingAfterBreak="0">
+  <w:abstractNum w:abstractNumId="23" w15:restartNumberingAfterBreak="0">
+    <w:nsid w:val="58E17899"/>
+    <w:multiLevelType w:val="hybridMultilevel"/>
+    <w:tmpl w:val="8AA2F296"/>
+    <w:lvl w:ilvl="0" w:tplc="C47E8E2C">
+      <w:start w:val="1"/>
+      <w:numFmt w:val="bullet"/>
+      <w:lvlText w:val=""/>
+      <w:lvlJc w:val="right"/>
+      <w:pPr>
+        <w:ind w:left="1450"/>
+      </w:pPr>
+      <w:rPr>
+        <w:rFonts w:ascii="Symbol" w:hAnsi="Symbol" w:hint="default"/>
+        <w:b w:val="0"/>
+        <w:i w:val="0"/>
+        <w:strike w:val="0"/>
+        <w:dstrike w:val="0"/>
+        <w:color w:val="000000"/>
+        <w:sz w:val="24"/>
+        <w:szCs w:val="24"/>
+        <w:u w:val="none" w:color="000000"/>
+        <w:bdr w:val="none" w:sz="0" w:space="0" w:color="auto"/>
+        <w:shd w:val="clear" w:color="auto" w:fill="auto"/>
+        <w:vertAlign w:val="baseline"/>
+      </w:rPr>
+    </w:lvl>
+    <w:lvl w:ilvl="1" w:tplc="04090001">
+      <w:start w:val="1"/>
+      <w:numFmt w:val="bullet"/>
+      <w:lvlText w:val=""/>
+      <w:lvlJc w:val="left"/>
+      <w:pPr>
+        <w:ind w:left="2185"/>
+      </w:pPr>
+      <w:rPr>
+        <w:rFonts w:ascii="Symbol" w:hAnsi="Symbol" w:hint="default"/>
+        <w:b w:val="0"/>
+        <w:i w:val="0"/>
+        <w:strike w:val="0"/>
+        <w:dstrike w:val="0"/>
+        <w:color w:val="000000"/>
+        <w:sz w:val="24"/>
+        <w:szCs w:val="24"/>
+        <w:u w:val="none" w:color="000000"/>
+        <w:bdr w:val="none" w:sz="0" w:space="0" w:color="auto"/>
+        <w:shd w:val="clear" w:color="auto" w:fill="auto"/>
+        <w:vertAlign w:val="baseline"/>
+      </w:rPr>
+    </w:lvl>
+    <w:lvl w:ilvl="2" w:tplc="6CBA8FDE">
+      <w:start w:val="1"/>
+      <w:numFmt w:val="bullet"/>
+      <w:lvlText w:val="▪"/>
+      <w:lvlJc w:val="left"/>
+      <w:pPr>
+        <w:ind w:left="2905"/>
+      </w:pPr>
+      <w:rPr>
+        <w:rFonts w:ascii="Courier New" w:eastAsia="Courier New" w:hAnsi="Courier New" w:cs="Courier New"/>
+        <w:b w:val="0"/>
+        <w:i w:val="0"/>
+        <w:strike w:val="0"/>
+        <w:dstrike w:val="0"/>
+        <w:color w:val="000000"/>
+        <w:sz w:val="24"/>
+        <w:szCs w:val="24"/>
+        <w:u w:val="none" w:color="000000"/>
+        <w:bdr w:val="none" w:sz="0" w:space="0" w:color="auto"/>
+        <w:shd w:val="clear" w:color="auto" w:fill="auto"/>
+        <w:vertAlign w:val="baseline"/>
+      </w:rPr>
+    </w:lvl>
+    <w:lvl w:ilvl="3" w:tplc="AED4876E">
+      <w:start w:val="1"/>
+      <w:numFmt w:val="bullet"/>
+      <w:lvlText w:val="•"/>
+      <w:lvlJc w:val="left"/>
+      <w:pPr>
+        <w:ind w:left="3625"/>
+      </w:pPr>
+      <w:rPr>
+        <w:rFonts w:ascii="Courier New" w:eastAsia="Courier New" w:hAnsi="Courier New" w:cs="Courier New"/>
+        <w:b w:val="0"/>
+        <w:i w:val="0"/>
+        <w:strike w:val="0"/>
+        <w:dstrike w:val="0"/>
+        <w:color w:val="000000"/>
+        <w:sz w:val="24"/>
+        <w:szCs w:val="24"/>
+        <w:u w:val="none" w:color="000000"/>
+        <w:bdr w:val="none" w:sz="0" w:space="0" w:color="auto"/>
+        <w:shd w:val="clear" w:color="auto" w:fill="auto"/>
+        <w:vertAlign w:val="baseline"/>
+      </w:rPr>
+    </w:lvl>
+    <w:lvl w:ilvl="4" w:tplc="0096E430">
+      <w:start w:val="1"/>
+      <w:numFmt w:val="bullet"/>
+      <w:lvlText w:val="o"/>
+      <w:lvlJc w:val="left"/>
+      <w:pPr>
+        <w:ind w:left="4345"/>
+      </w:pPr>
+      <w:rPr>
+        <w:rFonts w:ascii="Courier New" w:eastAsia="Courier New" w:hAnsi="Courier New" w:cs="Courier New"/>
+        <w:b w:val="0"/>
+        <w:i w:val="0"/>
+        <w:strike w:val="0"/>
+        <w:dstrike w:val="0"/>
+        <w:color w:val="000000"/>
+        <w:sz w:val="24"/>
+        <w:szCs w:val="24"/>
+        <w:u w:val="none" w:color="000000"/>
+        <w:bdr w:val="none" w:sz="0" w:space="0" w:color="auto"/>
+        <w:shd w:val="clear" w:color="auto" w:fill="auto"/>
+        <w:vertAlign w:val="baseline"/>
+      </w:rPr>
+    </w:lvl>
+    <w:lvl w:ilvl="5" w:tplc="95A6965A">
+      <w:start w:val="1"/>
+      <w:numFmt w:val="bullet"/>
+      <w:lvlText w:val="▪"/>
+      <w:lvlJc w:val="left"/>
+      <w:pPr>
+        <w:ind w:left="5065"/>
+      </w:pPr>
+      <w:rPr>
+        <w:rFonts w:ascii="Courier New" w:eastAsia="Courier New" w:hAnsi="Courier New" w:cs="Courier New"/>
+        <w:b w:val="0"/>
+        <w:i w:val="0"/>
+        <w:strike w:val="0"/>
+        <w:dstrike w:val="0"/>
+        <w:color w:val="000000"/>
+        <w:sz w:val="24"/>
+        <w:szCs w:val="24"/>
+        <w:u w:val="none" w:color="000000"/>
+        <w:bdr w:val="none" w:sz="0" w:space="0" w:color="auto"/>
+        <w:shd w:val="clear" w:color="auto" w:fill="auto"/>
+        <w:vertAlign w:val="baseline"/>
+      </w:rPr>
+    </w:lvl>
+    <w:lvl w:ilvl="6" w:tplc="89482CEA">
+      <w:start w:val="1"/>
+      <w:numFmt w:val="bullet"/>
+      <w:lvlText w:val="•"/>
+      <w:lvlJc w:val="left"/>
+      <w:pPr>
+        <w:ind w:left="5785"/>
+      </w:pPr>
+      <w:rPr>
+        <w:rFonts w:ascii="Courier New" w:eastAsia="Courier New" w:hAnsi="Courier New" w:cs="Courier New"/>
+        <w:b w:val="0"/>
+        <w:i w:val="0"/>
+        <w:strike w:val="0"/>
+        <w:dstrike w:val="0"/>
+        <w:color w:val="000000"/>
+        <w:sz w:val="24"/>
+        <w:szCs w:val="24"/>
+        <w:u w:val="none" w:color="000000"/>
+        <w:bdr w:val="none" w:sz="0" w:space="0" w:color="auto"/>
+        <w:shd w:val="clear" w:color="auto" w:fill="auto"/>
+        <w:vertAlign w:val="baseline"/>
+      </w:rPr>
+    </w:lvl>
+    <w:lvl w:ilvl="7" w:tplc="925C48C0">
+      <w:start w:val="1"/>
+      <w:numFmt w:val="bullet"/>
+      <w:lvlText w:val="o"/>
+      <w:lvlJc w:val="left"/>
+      <w:pPr>
+        <w:ind w:left="6505"/>
+      </w:pPr>
+      <w:rPr>
+        <w:rFonts w:ascii="Courier New" w:eastAsia="Courier New" w:hAnsi="Courier New" w:cs="Courier New"/>
+        <w:b w:val="0"/>
+        <w:i w:val="0"/>
+        <w:strike w:val="0"/>
+        <w:dstrike w:val="0"/>
+        <w:color w:val="000000"/>
+        <w:sz w:val="24"/>
+        <w:szCs w:val="24"/>
+        <w:u w:val="none" w:color="000000"/>
+        <w:bdr w:val="none" w:sz="0" w:space="0" w:color="auto"/>
+        <w:shd w:val="clear" w:color="auto" w:fill="auto"/>
+        <w:vertAlign w:val="baseline"/>
+      </w:rPr>
+    </w:lvl>
+    <w:lvl w:ilvl="8" w:tplc="62AE2DAE">
+      <w:start w:val="1"/>
+      <w:numFmt w:val="bullet"/>
+      <w:lvlText w:val="▪"/>
+      <w:lvlJc w:val="left"/>
+      <w:pPr>
+        <w:ind w:left="7225"/>
+      </w:pPr>
+      <w:rPr>
+        <w:rFonts w:ascii="Courier New" w:eastAsia="Courier New" w:hAnsi="Courier New" w:cs="Courier New"/>
+        <w:b w:val="0"/>
+        <w:i w:val="0"/>
+        <w:strike w:val="0"/>
+        <w:dstrike w:val="0"/>
+        <w:color w:val="000000"/>
+        <w:sz w:val="24"/>
+        <w:szCs w:val="24"/>
+        <w:u w:val="none" w:color="000000"/>
+        <w:bdr w:val="none" w:sz="0" w:space="0" w:color="auto"/>
+        <w:shd w:val="clear" w:color="auto" w:fill="auto"/>
+        <w:vertAlign w:val="baseline"/>
+      </w:rPr>
+    </w:lvl>
+  </w:abstractNum>
+  <w:abstractNum w:abstractNumId="24" w15:restartNumberingAfterBreak="0">
     <w:nsid w:val="5A391866"/>
     <w:multiLevelType w:val="hybridMultilevel"/>
     <w:tmpl w:val="83FA880A"/>
@@ -8621,7 +10385,93 @@
       </w:rPr>
     </w:lvl>
   </w:abstractNum>
-  <w:abstractNum w:abstractNumId="20" w15:restartNumberingAfterBreak="0">
+  <w:abstractNum w:abstractNumId="25" w15:restartNumberingAfterBreak="0">
+    <w:nsid w:val="5AF93D7C"/>
+    <w:multiLevelType w:val="hybridMultilevel"/>
+    <w:tmpl w:val="DE6EC12A"/>
+    <w:lvl w:ilvl="0" w:tplc="0409000F">
+      <w:start w:val="1"/>
+      <w:numFmt w:val="decimal"/>
+      <w:lvlText w:val="%1."/>
+      <w:lvlJc w:val="left"/>
+      <w:pPr>
+        <w:ind w:left="720" w:hanging="360"/>
+      </w:pPr>
+    </w:lvl>
+    <w:lvl w:ilvl="1" w:tplc="04090019" w:tentative="1">
+      <w:start w:val="1"/>
+      <w:numFmt w:val="lowerLetter"/>
+      <w:lvlText w:val="%2."/>
+      <w:lvlJc w:val="left"/>
+      <w:pPr>
+        <w:ind w:left="1440" w:hanging="360"/>
+      </w:pPr>
+    </w:lvl>
+    <w:lvl w:ilvl="2" w:tplc="0409001B" w:tentative="1">
+      <w:start w:val="1"/>
+      <w:numFmt w:val="lowerRoman"/>
+      <w:lvlText w:val="%3."/>
+      <w:lvlJc w:val="right"/>
+      <w:pPr>
+        <w:ind w:left="2160" w:hanging="180"/>
+      </w:pPr>
+    </w:lvl>
+    <w:lvl w:ilvl="3" w:tplc="0409000F" w:tentative="1">
+      <w:start w:val="1"/>
+      <w:numFmt w:val="decimal"/>
+      <w:lvlText w:val="%4."/>
+      <w:lvlJc w:val="left"/>
+      <w:pPr>
+        <w:ind w:left="2880" w:hanging="360"/>
+      </w:pPr>
+    </w:lvl>
+    <w:lvl w:ilvl="4" w:tplc="04090019" w:tentative="1">
+      <w:start w:val="1"/>
+      <w:numFmt w:val="lowerLetter"/>
+      <w:lvlText w:val="%5."/>
+      <w:lvlJc w:val="left"/>
+      <w:pPr>
+        <w:ind w:left="3600" w:hanging="360"/>
+      </w:pPr>
+    </w:lvl>
+    <w:lvl w:ilvl="5" w:tplc="0409001B" w:tentative="1">
+      <w:start w:val="1"/>
+      <w:numFmt w:val="lowerRoman"/>
+      <w:lvlText w:val="%6."/>
+      <w:lvlJc w:val="right"/>
+      <w:pPr>
+        <w:ind w:left="4320" w:hanging="180"/>
+      </w:pPr>
+    </w:lvl>
+    <w:lvl w:ilvl="6" w:tplc="0409000F" w:tentative="1">
+      <w:start w:val="1"/>
+      <w:numFmt w:val="decimal"/>
+      <w:lvlText w:val="%7."/>
+      <w:lvlJc w:val="left"/>
+      <w:pPr>
+        <w:ind w:left="5040" w:hanging="360"/>
+      </w:pPr>
+    </w:lvl>
+    <w:lvl w:ilvl="7" w:tplc="04090019" w:tentative="1">
+      <w:start w:val="1"/>
+      <w:numFmt w:val="lowerLetter"/>
+      <w:lvlText w:val="%8."/>
+      <w:lvlJc w:val="left"/>
+      <w:pPr>
+        <w:ind w:left="5760" w:hanging="360"/>
+      </w:pPr>
+    </w:lvl>
+    <w:lvl w:ilvl="8" w:tplc="0409001B" w:tentative="1">
+      <w:start w:val="1"/>
+      <w:numFmt w:val="lowerRoman"/>
+      <w:lvlText w:val="%9."/>
+      <w:lvlJc w:val="right"/>
+      <w:pPr>
+        <w:ind w:left="6480" w:hanging="180"/>
+      </w:pPr>
+    </w:lvl>
+  </w:abstractNum>
+  <w:abstractNum w:abstractNumId="26" w15:restartNumberingAfterBreak="0">
     <w:nsid w:val="5B1049C8"/>
     <w:multiLevelType w:val="hybridMultilevel"/>
     <w:tmpl w:val="699AB36C"/>
@@ -8843,7 +10693,7 @@
       </w:rPr>
     </w:lvl>
   </w:abstractNum>
-  <w:abstractNum w:abstractNumId="21" w15:restartNumberingAfterBreak="0">
+  <w:abstractNum w:abstractNumId="27" w15:restartNumberingAfterBreak="0">
     <w:nsid w:val="5EFC3435"/>
     <w:multiLevelType w:val="hybridMultilevel"/>
     <w:tmpl w:val="32E0446E"/>
@@ -9055,7 +10905,7 @@
       </w:rPr>
     </w:lvl>
   </w:abstractNum>
-  <w:abstractNum w:abstractNumId="22" w15:restartNumberingAfterBreak="0">
+  <w:abstractNum w:abstractNumId="28" w15:restartNumberingAfterBreak="0">
     <w:nsid w:val="68C3581B"/>
     <w:multiLevelType w:val="hybridMultilevel"/>
     <w:tmpl w:val="B97A123E"/>
@@ -9268,7 +11118,7 @@
       </w:rPr>
     </w:lvl>
   </w:abstractNum>
-  <w:abstractNum w:abstractNumId="23" w15:restartNumberingAfterBreak="0">
+  <w:abstractNum w:abstractNumId="29" w15:restartNumberingAfterBreak="0">
     <w:nsid w:val="6B92119C"/>
     <w:multiLevelType w:val="hybridMultilevel"/>
     <w:tmpl w:val="72661B6C"/>
@@ -9480,7 +11330,7 @@
       </w:rPr>
     </w:lvl>
   </w:abstractNum>
-  <w:abstractNum w:abstractNumId="24" w15:restartNumberingAfterBreak="0">
+  <w:abstractNum w:abstractNumId="30" w15:restartNumberingAfterBreak="0">
     <w:nsid w:val="6E6851F0"/>
     <w:multiLevelType w:val="hybridMultilevel"/>
     <w:tmpl w:val="51A0D774"/>
@@ -9593,7 +11443,129 @@
       </w:rPr>
     </w:lvl>
   </w:abstractNum>
-  <w:abstractNum w:abstractNumId="25" w15:restartNumberingAfterBreak="0">
+  <w:abstractNum w:abstractNumId="31" w15:restartNumberingAfterBreak="0">
+    <w:nsid w:val="74860FC0"/>
+    <w:multiLevelType w:val="hybridMultilevel"/>
+    <w:tmpl w:val="E4423768"/>
+    <w:lvl w:ilvl="0" w:tplc="C47E8E2C">
+      <w:start w:val="1"/>
+      <w:numFmt w:val="bullet"/>
+      <w:lvlText w:val=""/>
+      <w:lvlJc w:val="right"/>
+      <w:pPr>
+        <w:ind w:left="719" w:firstLine="0"/>
+      </w:pPr>
+      <w:rPr>
+        <w:rFonts w:ascii="Symbol" w:hAnsi="Symbol" w:hint="default"/>
+        <w:b w:val="0"/>
+        <w:i w:val="0"/>
+        <w:strike w:val="0"/>
+        <w:dstrike w:val="0"/>
+        <w:color w:val="000000"/>
+        <w:sz w:val="24"/>
+        <w:szCs w:val="24"/>
+        <w:u w:val="none" w:color="000000"/>
+        <w:vertAlign w:val="baseline"/>
+      </w:rPr>
+    </w:lvl>
+    <w:lvl w:ilvl="1" w:tplc="04090003" w:tentative="1">
+      <w:start w:val="1"/>
+      <w:numFmt w:val="bullet"/>
+      <w:lvlText w:val="o"/>
+      <w:lvlJc w:val="left"/>
+      <w:pPr>
+        <w:ind w:left="1440" w:hanging="360"/>
+      </w:pPr>
+      <w:rPr>
+        <w:rFonts w:ascii="Courier New" w:hAnsi="Courier New" w:cs="Courier New" w:hint="default"/>
+      </w:rPr>
+    </w:lvl>
+    <w:lvl w:ilvl="2" w:tplc="04090005" w:tentative="1">
+      <w:start w:val="1"/>
+      <w:numFmt w:val="bullet"/>
+      <w:lvlText w:val=""/>
+      <w:lvlJc w:val="left"/>
+      <w:pPr>
+        <w:ind w:left="2160" w:hanging="360"/>
+      </w:pPr>
+      <w:rPr>
+        <w:rFonts w:ascii="Wingdings" w:hAnsi="Wingdings" w:hint="default"/>
+      </w:rPr>
+    </w:lvl>
+    <w:lvl w:ilvl="3" w:tplc="04090001" w:tentative="1">
+      <w:start w:val="1"/>
+      <w:numFmt w:val="bullet"/>
+      <w:lvlText w:val=""/>
+      <w:lvlJc w:val="left"/>
+      <w:pPr>
+        <w:ind w:left="2880" w:hanging="360"/>
+      </w:pPr>
+      <w:rPr>
+        <w:rFonts w:ascii="Symbol" w:hAnsi="Symbol" w:hint="default"/>
+      </w:rPr>
+    </w:lvl>
+    <w:lvl w:ilvl="4" w:tplc="04090003" w:tentative="1">
+      <w:start w:val="1"/>
+      <w:numFmt w:val="bullet"/>
+      <w:lvlText w:val="o"/>
+      <w:lvlJc w:val="left"/>
+      <w:pPr>
+        <w:ind w:left="3600" w:hanging="360"/>
+      </w:pPr>
+      <w:rPr>
+        <w:rFonts w:ascii="Courier New" w:hAnsi="Courier New" w:cs="Courier New" w:hint="default"/>
+      </w:rPr>
+    </w:lvl>
+    <w:lvl w:ilvl="5" w:tplc="04090005" w:tentative="1">
+      <w:start w:val="1"/>
+      <w:numFmt w:val="bullet"/>
+      <w:lvlText w:val=""/>
+      <w:lvlJc w:val="left"/>
+      <w:pPr>
+        <w:ind w:left="4320" w:hanging="360"/>
+      </w:pPr>
+      <w:rPr>
+        <w:rFonts w:ascii="Wingdings" w:hAnsi="Wingdings" w:hint="default"/>
+      </w:rPr>
+    </w:lvl>
+    <w:lvl w:ilvl="6" w:tplc="04090001" w:tentative="1">
+      <w:start w:val="1"/>
+      <w:numFmt w:val="bullet"/>
+      <w:lvlText w:val=""/>
+      <w:lvlJc w:val="left"/>
+      <w:pPr>
+        <w:ind w:left="5040" w:hanging="360"/>
+      </w:pPr>
+      <w:rPr>
+        <w:rFonts w:ascii="Symbol" w:hAnsi="Symbol" w:hint="default"/>
+      </w:rPr>
+    </w:lvl>
+    <w:lvl w:ilvl="7" w:tplc="04090003" w:tentative="1">
+      <w:start w:val="1"/>
+      <w:numFmt w:val="bullet"/>
+      <w:lvlText w:val="o"/>
+      <w:lvlJc w:val="left"/>
+      <w:pPr>
+        <w:ind w:left="5760" w:hanging="360"/>
+      </w:pPr>
+      <w:rPr>
+        <w:rFonts w:ascii="Courier New" w:hAnsi="Courier New" w:cs="Courier New" w:hint="default"/>
+      </w:rPr>
+    </w:lvl>
+    <w:lvl w:ilvl="8" w:tplc="04090005" w:tentative="1">
+      <w:start w:val="1"/>
+      <w:numFmt w:val="bullet"/>
+      <w:lvlText w:val=""/>
+      <w:lvlJc w:val="left"/>
+      <w:pPr>
+        <w:ind w:left="6480" w:hanging="360"/>
+      </w:pPr>
+      <w:rPr>
+        <w:rFonts w:ascii="Wingdings" w:hAnsi="Wingdings" w:hint="default"/>
+      </w:rPr>
+    </w:lvl>
+  </w:abstractNum>
+  <w:abstractNum w:abstractNumId="32" w15:restartNumberingAfterBreak="0">
     <w:nsid w:val="7D0E457B"/>
     <w:multiLevelType w:val="hybridMultilevel"/>
     <w:tmpl w:val="627450A4"/>
@@ -9706,20 +11678,20 @@
       </w:rPr>
     </w:lvl>
   </w:abstractNum>
-  <w:abstractNum w:abstractNumId="26" w15:restartNumberingAfterBreak="0">
+  <w:abstractNum w:abstractNumId="33" w15:restartNumberingAfterBreak="0">
     <w:nsid w:val="7EA607EA"/>
     <w:multiLevelType w:val="hybridMultilevel"/>
-    <w:tmpl w:val="7B3E85FE"/>
-    <w:lvl w:ilvl="0" w:tplc="9CCE2020">
-      <w:start w:val="1"/>
-      <w:numFmt w:val="bullet"/>
-      <w:lvlText w:val="•"/>
-      <w:lvlJc w:val="left"/>
+    <w:tmpl w:val="F0188D28"/>
+    <w:lvl w:ilvl="0" w:tplc="856019B2">
+      <w:start w:val="1"/>
+      <w:numFmt w:val="bullet"/>
+      <w:lvlText w:val=""/>
+      <w:lvlJc w:val="center"/>
       <w:pPr>
         <w:ind w:left="719"/>
       </w:pPr>
       <w:rPr>
-        <w:rFonts w:ascii="Arial" w:eastAsia="Arial" w:hAnsi="Arial" w:cs="Arial"/>
+        <w:rFonts w:ascii="Symbol" w:hAnsi="Symbol" w:hint="default"/>
         <w:b w:val="0"/>
         <w:i w:val="0"/>
         <w:strike w:val="0"/>
@@ -9918,92 +11890,113 @@
       </w:rPr>
     </w:lvl>
   </w:abstractNum>
-  <w:num w:numId="1" w16cid:durableId="135879366">
+  <w:num w:numId="1">
+    <w:abstractNumId w:val="26"/>
+  </w:num>
+  <w:num w:numId="2">
+    <w:abstractNumId w:val="2"/>
+  </w:num>
+  <w:num w:numId="3">
+    <w:abstractNumId w:val="21"/>
+  </w:num>
+  <w:num w:numId="4">
+    <w:abstractNumId w:val="18"/>
+  </w:num>
+  <w:num w:numId="5">
+    <w:abstractNumId w:val="28"/>
+  </w:num>
+  <w:num w:numId="6">
+    <w:abstractNumId w:val="12"/>
+  </w:num>
+  <w:num w:numId="7">
+    <w:abstractNumId w:val="33"/>
+  </w:num>
+  <w:num w:numId="8">
+    <w:abstractNumId w:val="27"/>
+  </w:num>
+  <w:num w:numId="9">
+    <w:abstractNumId w:val="29"/>
+  </w:num>
+  <w:num w:numId="10">
+    <w:abstractNumId w:val="7"/>
+  </w:num>
+  <w:num w:numId="11">
+    <w:abstractNumId w:val="17"/>
+  </w:num>
+  <w:num w:numId="12">
+    <w:abstractNumId w:val="4"/>
+  </w:num>
+  <w:num w:numId="13">
+    <w:abstractNumId w:val="24"/>
+  </w:num>
+  <w:num w:numId="14">
+    <w:abstractNumId w:val="8"/>
+  </w:num>
+  <w:num w:numId="15">
+    <w:abstractNumId w:val="5"/>
+  </w:num>
+  <w:num w:numId="16">
+    <w:abstractNumId w:val="10"/>
+  </w:num>
+  <w:num w:numId="17">
+    <w:abstractNumId w:val="16"/>
+  </w:num>
+  <w:num w:numId="18">
     <w:abstractNumId w:val="20"/>
   </w:num>
-  <w:num w:numId="2" w16cid:durableId="1542984848">
+  <w:num w:numId="19">
+    <w:abstractNumId w:val="0"/>
+  </w:num>
+  <w:num w:numId="20">
+    <w:abstractNumId w:val="11"/>
+  </w:num>
+  <w:num w:numId="21">
+    <w:abstractNumId w:val="9"/>
+  </w:num>
+  <w:num w:numId="22">
+    <w:abstractNumId w:val="13"/>
+  </w:num>
+  <w:num w:numId="23">
+    <w:abstractNumId w:val="15"/>
+  </w:num>
+  <w:num w:numId="24">
+    <w:abstractNumId w:val="30"/>
+  </w:num>
+  <w:num w:numId="25">
+    <w:abstractNumId w:val="22"/>
+  </w:num>
+  <w:num w:numId="26">
+    <w:abstractNumId w:val="32"/>
+  </w:num>
+  <w:num w:numId="27">
+    <w:abstractNumId w:val="6"/>
+  </w:num>
+  <w:num w:numId="28">
     <w:abstractNumId w:val="1"/>
   </w:num>
-  <w:num w:numId="3" w16cid:durableId="573320347">
-    <w:abstractNumId w:val="17"/>
-  </w:num>
-  <w:num w:numId="4" w16cid:durableId="2144423393">
-    <w:abstractNumId w:val="15"/>
-  </w:num>
-  <w:num w:numId="5" w16cid:durableId="974796658">
-    <w:abstractNumId w:val="22"/>
-  </w:num>
-  <w:num w:numId="6" w16cid:durableId="1276252009">
-    <w:abstractNumId w:val="10"/>
-  </w:num>
-  <w:num w:numId="7" w16cid:durableId="1311638642">
-    <w:abstractNumId w:val="26"/>
-  </w:num>
-  <w:num w:numId="8" w16cid:durableId="2131581869">
-    <w:abstractNumId w:val="21"/>
-  </w:num>
-  <w:num w:numId="9" w16cid:durableId="1405908612">
+  <w:num w:numId="29">
     <w:abstractNumId w:val="23"/>
   </w:num>
-  <w:num w:numId="10" w16cid:durableId="2075740759">
-    <w:abstractNumId w:val="5"/>
+  <w:num w:numId="30">
+    <w:abstractNumId w:val="31"/>
   </w:num>
-  <w:num w:numId="11" w16cid:durableId="909533598">
+  <w:num w:numId="31">
+    <w:abstractNumId w:val="25"/>
+  </w:num>
+  <w:num w:numId="32">
+    <w:abstractNumId w:val="19"/>
+  </w:num>
+  <w:num w:numId="33">
     <w:abstractNumId w:val="14"/>
   </w:num>
-  <w:num w:numId="12" w16cid:durableId="1688628793">
-    <w:abstractNumId w:val="2"/>
-  </w:num>
-  <w:num w:numId="13" w16cid:durableId="1439254813">
-    <w:abstractNumId w:val="19"/>
-  </w:num>
-  <w:num w:numId="14" w16cid:durableId="983385990">
-    <w:abstractNumId w:val="6"/>
-  </w:num>
-  <w:num w:numId="15" w16cid:durableId="1070929061">
+  <w:num w:numId="34">
     <w:abstractNumId w:val="3"/>
-  </w:num>
-  <w:num w:numId="16" w16cid:durableId="370151237">
-    <w:abstractNumId w:val="8"/>
-  </w:num>
-  <w:num w:numId="17" w16cid:durableId="1712997713">
-    <w:abstractNumId w:val="13"/>
-  </w:num>
-  <w:num w:numId="18" w16cid:durableId="1940722073">
-    <w:abstractNumId w:val="16"/>
-  </w:num>
-  <w:num w:numId="19" w16cid:durableId="853231086">
-    <w:abstractNumId w:val="0"/>
-  </w:num>
-  <w:num w:numId="20" w16cid:durableId="1112894102">
-    <w:abstractNumId w:val="9"/>
-  </w:num>
-  <w:num w:numId="21" w16cid:durableId="757337324">
-    <w:abstractNumId w:val="7"/>
-  </w:num>
-  <w:num w:numId="22" w16cid:durableId="573466447">
-    <w:abstractNumId w:val="11"/>
-  </w:num>
-  <w:num w:numId="23" w16cid:durableId="1561869075">
-    <w:abstractNumId w:val="12"/>
-  </w:num>
-  <w:num w:numId="24" w16cid:durableId="986544375">
-    <w:abstractNumId w:val="24"/>
-  </w:num>
-  <w:num w:numId="25" w16cid:durableId="619647314">
-    <w:abstractNumId w:val="18"/>
-  </w:num>
-  <w:num w:numId="26" w16cid:durableId="622884665">
-    <w:abstractNumId w:val="25"/>
-  </w:num>
-  <w:num w:numId="27" w16cid:durableId="1568613864">
-    <w:abstractNumId w:val="4"/>
   </w:num>
 </w:numbering>
 </file>
 
 <file path=word/styles.xml><?xml version="1.0" encoding="utf-8"?>
-<w:styles xmlns:mc="http://schemas.openxmlformats.org/markup-compatibility/2006" xmlns:r="http://schemas.openxmlformats.org/officeDocument/2006/relationships" xmlns:w="http://schemas.openxmlformats.org/wordprocessingml/2006/main" xmlns:w14="http://schemas.microsoft.com/office/word/2010/wordml" xmlns:w15="http://schemas.microsoft.com/office/word/2012/wordml" xmlns:w16cex="http://schemas.microsoft.com/office/word/2018/wordml/cex" xmlns:w16cid="http://schemas.microsoft.com/office/word/2016/wordml/cid" xmlns:w16="http://schemas.microsoft.com/office/word/2018/wordml" xmlns:w16du="http://schemas.microsoft.com/office/word/2023/wordml/word16du" xmlns:w16sdtdh="http://schemas.microsoft.com/office/word/2020/wordml/sdtdatahash" xmlns:w16sdtfl="http://schemas.microsoft.com/office/word/2024/wordml/sdtformatlock" xmlns:w16se="http://schemas.microsoft.com/office/word/2015/wordml/symex" mc:Ignorable="w14 w15 w16se w16cid w16 w16cex w16sdtdh w16sdtfl w16du">
+<w:styles xmlns:mc="http://schemas.openxmlformats.org/markup-compatibility/2006" xmlns:r="http://schemas.openxmlformats.org/officeDocument/2006/relationships" xmlns:w="http://schemas.openxmlformats.org/wordprocessingml/2006/main" xmlns:w14="http://schemas.microsoft.com/office/word/2010/wordml" xmlns:w15="http://schemas.microsoft.com/office/word/2012/wordml" xmlns:w16se="http://schemas.microsoft.com/office/word/2015/wordml/symex" mc:Ignorable="w14 w15 w16se">
   <w:docDefaults>
     <w:rPrDefault>
       <w:rPr>
@@ -10019,7 +12012,7 @@
       </w:pPr>
     </w:pPrDefault>
   </w:docDefaults>
-  <w:latentStyles w:defLockedState="0" w:defUIPriority="99" w:defSemiHidden="0" w:defUnhideWhenUsed="0" w:defQFormat="0" w:count="376">
+  <w:latentStyles w:defLockedState="0" w:defUIPriority="99" w:defSemiHidden="0" w:defUnhideWhenUsed="0" w:defQFormat="0" w:count="371">
     <w:lsdException w:name="Normal" w:uiPriority="0" w:qFormat="1"/>
     <w:lsdException w:name="heading 1" w:uiPriority="9" w:qFormat="1"/>
     <w:lsdException w:name="heading 2" w:semiHidden="1" w:uiPriority="9" w:unhideWhenUsed="1" w:qFormat="1"/>
@@ -10391,15 +12384,11 @@
     <w:lsdException w:name="List Table 5 Dark Accent 6" w:uiPriority="50"/>
     <w:lsdException w:name="List Table 6 Colorful Accent 6" w:uiPriority="51"/>
     <w:lsdException w:name="List Table 7 Colorful Accent 6" w:uiPriority="52"/>
-    <w:lsdException w:name="Mention" w:semiHidden="1" w:unhideWhenUsed="1"/>
-    <w:lsdException w:name="Smart Hyperlink" w:semiHidden="1" w:unhideWhenUsed="1"/>
-    <w:lsdException w:name="Hashtag" w:semiHidden="1" w:unhideWhenUsed="1"/>
-    <w:lsdException w:name="Unresolved Mention" w:semiHidden="1" w:unhideWhenUsed="1"/>
-    <w:lsdException w:name="Smart Link" w:semiHidden="1" w:unhideWhenUsed="1"/>
   </w:latentStyles>
   <w:style w:type="paragraph" w:default="1" w:styleId="Normal">
     <w:name w:val="Normal"/>
     <w:qFormat/>
+    <w:rsid w:val="008E14D6"/>
     <w:pPr>
       <w:spacing w:after="5" w:line="269" w:lineRule="auto"/>
       <w:ind w:left="24" w:right="17" w:hanging="10"/>
@@ -10601,7 +12590,7 @@
 <file path=word/charts/chart1.xml><?xml version="1.0" encoding="utf-8"?>
 <c:chartSpace xmlns:c="http://schemas.openxmlformats.org/drawingml/2006/chart" xmlns:a="http://schemas.openxmlformats.org/drawingml/2006/main" xmlns:r="http://schemas.openxmlformats.org/officeDocument/2006/relationships" xmlns:c16r2="http://schemas.microsoft.com/office/drawing/2015/06/chart">
   <c:date1904 val="0"/>
-  <c:lang val="es-MX"/>
+  <c:lang val="es-ES"/>
   <c:roundedCorners val="0"/>
   <mc:AlternateContent xmlns:mc="http://schemas.openxmlformats.org/markup-compatibility/2006">
     <mc:Choice xmlns:c14="http://schemas.microsoft.com/office/drawing/2007/8/2/chart" Requires="c14">
@@ -10711,10 +12700,10 @@
                   <c:v>46162</c:v>
                 </c:pt>
                 <c:pt idx="6">
-                  <c:v>46174</c:v>
+                  <c:v>46201</c:v>
                 </c:pt>
                 <c:pt idx="7">
-                  <c:v>46201</c:v>
+                  <c:v>46225</c:v>
                 </c:pt>
               </c:numCache>
             </c:numRef>
@@ -10741,10 +12730,10 @@
                   <c:v>16</c:v>
                 </c:pt>
                 <c:pt idx="5">
-                  <c:v>10</c:v>
+                  <c:v>11</c:v>
                 </c:pt>
                 <c:pt idx="6">
-                  <c:v>7</c:v>
+                  <c:v>5</c:v>
                 </c:pt>
                 <c:pt idx="7">
                   <c:v>0</c:v>
@@ -10822,10 +12811,10 @@
                   <c:v>46162</c:v>
                 </c:pt>
                 <c:pt idx="6">
-                  <c:v>46174</c:v>
+                  <c:v>46201</c:v>
                 </c:pt>
                 <c:pt idx="7">
-                  <c:v>46201</c:v>
+                  <c:v>46225</c:v>
                 </c:pt>
               </c:numCache>
             </c:numRef>
@@ -10853,6 +12842,9 @@
                 </c:pt>
                 <c:pt idx="5">
                   <c:v>13</c:v>
+                </c:pt>
+                <c:pt idx="6">
+                  <c:v>3</c:v>
                 </c:pt>
               </c:numCache>
             </c:numRef>
@@ -11866,7 +13858,7 @@
 </file>
 
 <file path=customXml/itemProps1.xml><?xml version="1.0" encoding="utf-8"?>
-<ds:datastoreItem xmlns:ds="http://schemas.openxmlformats.org/officeDocument/2006/customXml" ds:itemID="{2D4FC262-373C-4DE8-A88E-08C45AC11975}">
+<ds:datastoreItem xmlns:ds="http://schemas.openxmlformats.org/officeDocument/2006/customXml" ds:itemID="{2AA48E0A-9A5B-40B2-B20C-FA64BAF6B3D9}">
   <ds:schemaRefs>
     <ds:schemaRef ds:uri="http://schemas.openxmlformats.org/officeDocument/2006/bibliography"/>
   </ds:schemaRefs>

</xml_diff>